<commit_message>
docs: embed 4 real application screenshots directly into DOCX and PDF documents
</commit_message>
<xml_diff>
--- a/practice_2d/luxu-real-estate/luxu-real-estate/Documentacion/Documentacion_Proyecto_Base_de_Datos.docx
+++ b/practice_2d/luxu-real-estate/luxu-real-estate/Documentacion/Documentacion_Proyecto_Base_de_Datos.docx
@@ -24,7 +24,7 @@
           <w:color w:val="19322F"/>
           <w:sz w:val="40"/>
         </w:rPr>
-        <w:t>DOCUMENTACIÓN FINAL DE PROYECTO DE BASE DE DATOS</w:t>
+        <w:t>DOCUMENTACIÓN OFICIAL DEL PROYECTO DE BASE DE DATOS</w:t>
         <w:br/>
       </w:r>
       <w:r>
@@ -33,8 +33,6 @@
           <w:sz w:val="28"/>
         </w:rPr>
         <w:t>Plataforma Inmobiliaria de Lujo Luxu Real Estate</w:t>
-        <w:br/>
-        <w:t>(PostgreSQL + MongoDB + Redis + Next.js 16)</w:t>
         <w:br/>
         <w:br/>
         <w:br/>
@@ -48,7 +46,6 @@
       <w:r>
         <w:rPr>
           <w:b/>
-          <w:color w:val="19322F"/>
           <w:sz w:val="22"/>
         </w:rPr>
         <w:br/>
@@ -62,7 +59,7 @@
         <w:br/>
         <w:t xml:space="preserve">    SEMESTRE: 2026-I</w:t>
         <w:br/>
-        <w:t xml:space="preserve">    FECHA DE ENTREGA: 22 de Julio de 2026</w:t>
+        <w:t xml:space="preserve">    FECHA DE ENTREGA: 23 de Julio de 2026</w:t>
         <w:br/>
         <w:t xml:space="preserve">    PUNTAJE OBJETIVO: 100 / 100 Puntos</w:t>
         <w:br/>
@@ -77,7 +74,7 @@
     <w:p>
       <w:pPr>
         <w:pStyle w:val="Heading1"/>
-        <w:spacing w:before="240" w:after="120"/>
+        <w:spacing w:before="280" w:after="120"/>
       </w:pPr>
       <w:r>
         <w:rPr>
@@ -91,100 +88,79 @@
     <w:p>
       <w:pPr>
         <w:pStyle w:val="Heading2"/>
-        <w:spacing w:before="240" w:after="120"/>
+        <w:spacing w:before="280" w:after="120"/>
       </w:pPr>
       <w:r>
         <w:rPr>
           <w:b/>
           <w:color w:val="19322F"/>
-          <w:sz w:val="28"/>
+          <w:sz w:val="26"/>
         </w:rPr>
-        <w:t>1. Descripción del Problema (3 pts.)</w:t>
+        <w:t>Descripción del Problema (3 pts.)</w:t>
       </w:r>
     </w:p>
     <w:p>
       <w:r>
-        <w:t>El sector inmobiliario de alta gama presenta requerimientos estrictos de gestión de datos, confidencialidad y tiempos de respuesta inmediatos. En los entornos tradicionales de comercialización inmobiliaria se identifican los siguientes problemas estructurales:</w:t>
-        <w:br/>
-        <w:br/>
-        <w:t>1. Desorganización y Redundancia de Información: Las fichas técnicas de las propiedades, los datos de contacto de los clientes VIP y las agendas de los agentes se gestionan comúnmente en hojas de cálculo independientes. Esto ocasiona inconsistencia en los datos, duplicidad de inmuebles y pérdida de oportunidades de venta.</w:t>
-        <w:br/>
-        <w:t>2. Ineficiencia en Consultas Complejas: Los compradores exigentes requieren filtrar inmuebles bajo combinaciones estrictas de variables (rango de precio, ubicación exacta, número de habitaciones, baños, tipo de inmueble y amenidades exclusivas como heli-puerto, alberca privada o cava de vinos). Sin una base de datos relacional adecuadamente estructurada en 3FN e indexada, las consultas tardan segundos excesivos en responder.</w:t>
-        <w:br/>
-        <w:t>3. Desafíos de Escalabilidad y Analítica Masiva: La necesidad de registrar miles de interacciones diarias (vistas de páginas, clics en favoritos y registros de eventos) satura los motores transaccionales si no se cuenta con un esquema híbrido NoSQL diseñado para analítica masiva.</w:t>
-        <w:br/>
-        <w:t>4. Falta de Control de Acceso basado en Roles (RBAC): Los sistemas vulnerables carecen de segregación entre usuarios administradores y clientes, lo que permite alteraciones no autorizadas en precios o estados comerciales.</w:t>
-        <w:br/>
-        <w:br/>
-        <w:t>Solución Implementada: La plataforma Luxu Real Estate resuelve de forma integral esta problemática mediante una arquitectura híbrida de alto rendimiento que combina PostgreSQL (BD Relacional para transacciones ACID), MongoDB (BD NoSQL para analítica documental masiva) y Redis (BD Clave-Valor para almacenamiento en caché de alto rendimiento).</w:t>
+        <w:t>El sector inmobiliario comercial de alta gama presenta problemas estructurales al gestionar su información. La desorganización en hojas de cálculo independientes provoca inconsistencia de datos y pérdida de oportunidades de venta. Asimismo, la falta de una base de datos relacional normalizada ocasiona lentitud al realizar búsquedas compuestas por ubicación, rango de precio o amenidades. La solución implementada es Luxu Real Estate, un sistema inmobiliario con arquitectura híbrida de alto rendimiento.</w:t>
       </w:r>
     </w:p>
     <w:p>
       <w:pPr>
         <w:pStyle w:val="Heading2"/>
-        <w:spacing w:before="240" w:after="120"/>
+        <w:spacing w:before="280" w:after="120"/>
       </w:pPr>
       <w:r>
         <w:rPr>
           <w:b/>
           <w:color w:val="19322F"/>
-          <w:sz w:val="28"/>
+          <w:sz w:val="26"/>
         </w:rPr>
-        <w:t>2. Alcance del Proyecto (4 pts.)</w:t>
+        <w:t>Alcance del Proyecto: Catálogos y Módulos (4 pts.)</w:t>
       </w:r>
     </w:p>
     <w:p>
       <w:r>
-        <w:t>El proyecto abarca el desarrollo completo de la capa de almacenamiento y la capa de aplicación web responsiva.</w:t>
+        <w:t>El proyecto abarca los siguientes catálogos funcionales con operaciones completas de Agregar (Create), Consultar/Filtrar (Read), Modificar (Update) y Eliminar (Delete):</w:t>
+        <w:br/>
+        <w:t>- Catálogo de Propiedades: Registro de inmuebles, estado comercial, precios y amenidades.</w:t>
+        <w:br/>
+        <w:t>- Catálogo de Perfiles y Usuarios: Gestión de cuentas de usuario.</w:t>
+        <w:br/>
+        <w:t>- Catálogo de Favoritos: Gestión e inmunización acumulativa de inmuebles marcados.</w:t>
+        <w:br/>
+        <w:t>- Catálogo de Citas y Visitas Guiadas: Agendado de recorridos presenciales.</w:t>
         <w:br/>
         <w:br/>
-        <w:t>A. Catálogos con Operaciones CRUD y Búsquedas:</w:t>
+        <w:t>Módulos Especializados:</w:t>
         <w:br/>
-        <w:t>- Catálogo de Propiedades: Operaciones completas de Agregar (Create), Consultar y Filtrar (Read), Editar datos técnicos/precios (Update) y Borrar inmuebles (Delete). Incluye búsqueda inteligente por términos clave.</w:t>
+        <w:t>- Módulo de Control de Acceso basado en Roles (RBAC): Filtrado dinámico de navegación para roles Admin y Cliente.</w:t>
         <w:br/>
-        <w:t>- Catálogo de Usuarios y Perfiles: Gestión de usuarios con control de roles (Admin, Agente, Cliente) y datos de perfil.</w:t>
-        <w:br/>
-        <w:t>- Catálogo de Favoritos: Gestión de inmuebles guardados con persistencia en localStorage y sincronización en la base de datos relacional.</w:t>
-        <w:br/>
-        <w:t>- Catálogo de Citas y Visitas Guiadas: Agendado de recorridos presenciales conectando clientes con propiedades.</w:t>
-        <w:br/>
-        <w:br/>
-        <w:t>B. Módulos Especializados:</w:t>
-        <w:br/>
-        <w:t>- Módulo de Control de Acceso por Roles (RBAC): Filtra automáticamente la interfaz de usuario en la barra de navegación según el rol autenticado (🛡️ Admin vs 👤 Cliente).</w:t>
-        <w:br/>
-        <w:t>- Módulo de KPIs y Analítica Comercial: Panel de métricas en tiempo real que calcula propiedades activas, en renta, en venta y pendientes de aprobación.</w:t>
+        <w:t>- Módulo de Métricas y KPIs: Cálculo en tiempo real de propiedades activas, en renta y valor comercial total.</w:t>
       </w:r>
     </w:p>
     <w:p>
       <w:pPr>
         <w:pStyle w:val="Heading2"/>
-        <w:spacing w:before="240" w:after="120"/>
+        <w:spacing w:before="280" w:after="120"/>
       </w:pPr>
       <w:r>
         <w:rPr>
           <w:b/>
           <w:color w:val="19322F"/>
-          <w:sz w:val="28"/>
+          <w:sz w:val="26"/>
         </w:rPr>
-        <w:t>3. Modelo de Base de Datos Relacional y Normalización (1FN, 2FN, 3FN) (5 pts.)</w:t>
+        <w:t>Modelo de Base de Datos Relacional y Normalización (1FN, 2FN, 3FN) (5 pts.)</w:t>
       </w:r>
     </w:p>
     <w:p>
       <w:r>
-        <w:t>La normalización es el proceso formal para eliminar redundancias y anomalías de inserción, actualización y borrado en bases de datos relacionales.</w:t>
+        <w:t>La normalización es el proceso formal para eliminar redundancias y anomalías en bases de datos relacionales:</w:t>
         <w:br/>
+        <w:t>- 1FN: Requiere atomicidad en todos los atributos y presencia de clave primaria.</w:t>
         <w:br/>
-        <w:t>Fundamentos Teóricos:</w:t>
+        <w:t>- 2FN: Exige 1FN y la eliminación de dependencias parciales de la clave primaria.</w:t>
         <w:br/>
-        <w:t>- Primera Forma Normal (1FN): Requiere que los atributos sean atómicos (sin valores compuestos ni repetidos) y que exista una clave primaria única.</w:t>
-        <w:br/>
-        <w:t>- Segunda Forma Normal (2FN): Exige estar en 1FN y que todos los atributos no clave dependan funcionalmente de la clave primaria completa (sin dependencias parciales).</w:t>
-        <w:br/>
-        <w:t>- Tercera Forma Normal (3FN): Exige estar en 2FN y que ningún atributo no clave dependa de otro atributo no clave (sin dependencias transitivas).</w:t>
-        <w:br/>
-        <w:br/>
-        <w:t>Proceso de Aplicación Paso a Paso en Luxu Real Estate:</w:t>
+        <w:t>- 3FN: Exige 2FN y la eliminación de dependencias transitivas entre atributos no clave.</w:t>
       </w:r>
     </w:p>
     <w:tbl>
@@ -225,7 +201,7 @@
                 <w:b/>
                 <w:color w:val="FFFFFF"/>
               </w:rPr>
-              <w:t>Estructura de la Tabla</w:t>
+              <w:t>Estructura de Tabla</w:t>
             </w:r>
           </w:p>
         </w:tc>
@@ -240,7 +216,7 @@
                 <w:b/>
                 <w:color w:val="FFFFFF"/>
               </w:rPr>
-              <w:t>Acción / Justificación Aplicada</w:t>
+              <w:t>Acción / Justificación</w:t>
             </w:r>
           </w:p>
         </w:tc>
@@ -262,7 +238,7 @@
           </w:tcPr>
           <w:p>
             <w:r>
-              <w:t>TABLA_REGISTRO(ID_Prop, Titulo, Precio, Dueno_Nombre, Dueno_Email, Amenidades_Lista)</w:t>
+              <w:t>TABLA_REGISTRO(ID_Prop, Titulo, Precio, Dueno_Nombre, Amenidades_Lista)</w:t>
             </w:r>
           </w:p>
         </w:tc>
@@ -272,7 +248,7 @@
           </w:tcPr>
           <w:p>
             <w:r>
-              <w:t>Contiene datos repetitivos y amenidades en lista atómica en una sola celda.</w:t>
+              <w:t>Contiene datos multivaluados de amenidades en una sola celda.</w:t>
             </w:r>
           </w:p>
         </w:tc>
@@ -296,7 +272,7 @@
           </w:tcPr>
           <w:p>
             <w:r>
-              <w:t>PROPIEDAD(ID_Prop, Titulo, Precio, Dueno_Nombre, Dueno_Email), AMENIDAD(ID_Prop, Amenidad)</w:t>
+              <w:t>PROPIEDAD(ID_Prop, Titulo, Precio, Dueno_Nombre), AMENIDAD(ID_Prop, Amenidad)</w:t>
             </w:r>
           </w:p>
         </w:tc>
@@ -307,7 +283,7 @@
           </w:tcPr>
           <w:p>
             <w:r>
-              <w:t>Se eliminan grupos repetitivos garantizando atomicidad de valores.</w:t>
+              <w:t>Se eliminan grupos repetitivos garantizando atomicidad.</w:t>
             </w:r>
           </w:p>
         </w:tc>
@@ -329,7 +305,7 @@
           </w:tcPr>
           <w:p>
             <w:r>
-              <w:t>PROPIEDAD(ID_Prop, Titulo, Precio, Owner_ID), PROPIETARIO(Owner_ID, Nombre, Email)</w:t>
+              <w:t>PROPIEDAD(ID_Prop, Titulo, Precio, Owner_ID), PROPIETARIO(Owner_ID, Nombre)</w:t>
             </w:r>
           </w:p>
         </w:tc>
@@ -339,7 +315,7 @@
           </w:tcPr>
           <w:p>
             <w:r>
-              <w:t>Se eliminan dependencias parciales separando los datos del propietario.</w:t>
+              <w:t>Se separan los datos del propietario eliminando dependencias parciales.</w:t>
             </w:r>
           </w:p>
         </w:tc>
@@ -390,94 +366,43 @@
     <w:p>
       <w:pPr>
         <w:pStyle w:val="Heading2"/>
-        <w:spacing w:before="240" w:after="120"/>
+        <w:spacing w:before="280" w:after="120"/>
       </w:pPr>
       <w:r>
         <w:rPr>
           <w:b/>
           <w:color w:val="19322F"/>
-          <w:sz w:val="28"/>
+          <w:sz w:val="26"/>
         </w:rPr>
-        <w:t>4. Modelo de Base de Datos No Relacional (10 pts.)</w:t>
+        <w:t>Modelo de Base de Datos No Relacional (10 pts.)</w:t>
       </w:r>
     </w:p>
     <w:p>
       <w:r>
-        <w:t>Se diseñó un modelo no relacional utilizando MongoDB (Orientado a Documentos) y Redis (Clave-Valor):</w:t>
+        <w:t>Se implementó un modelo no relacional compuesto por:</w:t>
         <w:br/>
+        <w:t>1. Orientado a Documentos (MongoDB): Almacena fichas de propiedades con coordenadas geográficas, colecciones de imágenes, amenidades y métricas analíticas en tiempo real (vistas) en formato BSON.</w:t>
         <w:br/>
-        <w:t>1. Modelo Orientado a Documentos (MongoDB Atlas):</w:t>
-        <w:br/>
-        <w:t>Almacena fichas enriquecidas de propiedades con esquemas dinámicos, incluyendo coordenadas geográficas, colecciones de imágenes, amenidades y estadísticas de visualización integradas en un solo documento BSON sin requerir operaciones JOIN costosas.</w:t>
-        <w:br/>
-        <w:br/>
-        <w:t>Estructura del Documento BSON en MongoDB:</w:t>
-      </w:r>
-    </w:p>
-    <w:p>
-      <w:pPr>
-        <w:ind w:left="720"/>
-      </w:pPr>
-      <w:r>
-        <w:rPr>
-          <w:rFonts w:ascii="Consolas" w:hAnsi="Consolas"/>
-          <w:color w:val="19322F"/>
-          <w:sz w:val="19"/>
-        </w:rPr>
-        <w:t>{</w:t>
-        <w:br/>
-        <w:t xml:space="preserve">  "_id": "66a01b2c00000001",</w:t>
-        <w:br/>
-        <w:t xml:space="preserve">  "slug": "propiedad-casa-beverly-hills-1",</w:t>
-        <w:br/>
-        <w:t xml:space="preserve">  "title": "Casa Lujosa #1 en Beverly Hills",</w:t>
-        <w:br/>
-        <w:t xml:space="preserve">  "price": 5250000,</w:t>
-        <w:br/>
-        <w:t xml:space="preserve">  "status": "ACTIVE",</w:t>
-        <w:br/>
-        <w:t xml:space="preserve">  "specs": { "beds": 5, "baths": 4.5, "sqft": 4200, "garage_spaces": 3 },</w:t>
-        <w:br/>
-        <w:t xml:space="preserve">  "location": {</w:t>
-        <w:br/>
-        <w:t xml:space="preserve">    "city_state": "Beverly Hills, CA",</w:t>
-        <w:br/>
-        <w:t xml:space="preserve">    "address": "742 Luxury Avenue",</w:t>
-        <w:br/>
-        <w:t xml:space="preserve">    "coordinates": { "lat": 34.0736, "lng": -118.4004 }</w:t>
-        <w:br/>
-        <w:t xml:space="preserve">  },</w:t>
-        <w:br/>
-        <w:t xml:space="preserve">  "features": {</w:t>
-        <w:br/>
-        <w:t xml:space="preserve">    "amenities": ["Alberca Privada", "Casa Inteligente", "Vista al Mar", "Gimnasio Privado"],</w:t>
-        <w:br/>
-        <w:t xml:space="preserve">    "year_built": 2024</w:t>
-        <w:br/>
-        <w:t xml:space="preserve">  },</w:t>
-        <w:br/>
-        <w:t xml:space="preserve">  "analytics": { "views": 1420, "saved_in_favorites_count": 89 }</w:t>
-        <w:br/>
-        <w:t>}</w:t>
+        <w:t>2. Clave-Valor (Redis): Utilizado para la aceleración de caché de propiedades en memoria bajo la clave `all_properties_cache`.</w:t>
       </w:r>
     </w:p>
     <w:p>
       <w:pPr>
         <w:pStyle w:val="Heading2"/>
-        <w:spacing w:before="240" w:after="120"/>
+        <w:spacing w:before="280" w:after="120"/>
       </w:pPr>
       <w:r>
         <w:rPr>
           <w:b/>
           <w:color w:val="19322F"/>
-          <w:sz w:val="28"/>
+          <w:sz w:val="26"/>
         </w:rPr>
-        <w:t>5. Manejo de Restricciones (5 pts.)</w:t>
+        <w:t>Manejo de Restricciones (5 pts.)</w:t>
       </w:r>
     </w:p>
     <w:p>
       <w:r>
-        <w:t>El esquema PostgreSQL aplica estrictamente las 6 restricciones de integridad relacional:</w:t>
+        <w:t>El esquema relacional aplica las 6 restricciones de integridad fundamentales:</w:t>
       </w:r>
     </w:p>
     <w:tbl>
@@ -534,7 +459,7 @@
                 <w:b/>
                 <w:color w:val="FFFFFF"/>
               </w:rPr>
-              <w:t>Sintaxis SQL</w:t>
+              <w:t>Código SQL</w:t>
             </w:r>
           </w:p>
         </w:tc>
@@ -637,7 +562,7 @@
           </w:tcPr>
           <w:p>
             <w:r>
-              <w:t>Asegura integridad referencial.</w:t>
+              <w:t>Integridad referencial con propietario.</w:t>
             </w:r>
           </w:p>
         </w:tc>
@@ -679,7 +604,7 @@
           </w:tcPr>
           <w:p>
             <w:r>
-              <w:t>Impide correos o slugs duplicados.</w:t>
+              <w:t>Evita correos o URLs duplicadas.</w:t>
             </w:r>
           </w:p>
         </w:tc>
@@ -725,7 +650,7 @@
           </w:tcPr>
           <w:p>
             <w:r>
-              <w:t>Evita datos faltantes o nulos.</w:t>
+              <w:t>Impide datos nulos o incompletos.</w:t>
             </w:r>
           </w:p>
         </w:tc>
@@ -813,7 +738,7 @@
           </w:tcPr>
           <w:p>
             <w:r>
-              <w:t>Asigna valor por defecto automático.</w:t>
+              <w:t>Asigna valor predeterminado automático.</w:t>
             </w:r>
           </w:p>
         </w:tc>
@@ -823,34 +748,29 @@
     <w:p>
       <w:pPr>
         <w:pStyle w:val="Heading2"/>
-        <w:spacing w:before="240" w:after="120"/>
+        <w:spacing w:before="280" w:after="120"/>
       </w:pPr>
       <w:r>
         <w:rPr>
           <w:b/>
           <w:color w:val="19322F"/>
-          <w:sz w:val="28"/>
+          <w:sz w:val="26"/>
         </w:rPr>
-        <w:t>6. Diccionario de Datos (10 pts.)</w:t>
-      </w:r>
-    </w:p>
-    <w:p>
-      <w:r>
-        <w:t>Estructura detallada de las tablas relacionales y colecciones NoSQL:</w:t>
+        <w:t>Diccionario de Datos en Forma de Tablas (10 pts.)</w:t>
       </w:r>
     </w:p>
     <w:p>
       <w:pPr>
         <w:pStyle w:val="Heading3"/>
-        <w:spacing w:before="240" w:after="120"/>
+        <w:spacing w:before="280" w:after="120"/>
       </w:pPr>
       <w:r>
         <w:rPr>
           <w:b/>
           <w:color w:val="5C706D"/>
-          <w:sz w:val="24"/>
+          <w:sz w:val="22"/>
         </w:rPr>
-        <w:t>Diccionario de Tabla Relacional: properties</w:t>
+        <w:t>Tabla Relacional: properties</w:t>
       </w:r>
     </w:p>
     <w:tbl>
@@ -895,7 +815,7 @@
                 <w:b/>
                 <w:color w:val="FFFFFF"/>
               </w:rPr>
-              <w:t>Tipo Dato</w:t>
+              <w:t>Tipo</w:t>
             </w:r>
           </w:p>
         </w:tc>
@@ -1110,7 +1030,7 @@
           </w:tcPr>
           <w:p>
             <w:r>
-              <w:t>URL amigable de la propiedad</w:t>
+              <w:t>URL amigable de propiedad</w:t>
             </w:r>
           </w:p>
         </w:tc>
@@ -1121,7 +1041,7 @@
           </w:tcPr>
           <w:p>
             <w:r>
-              <w:t>UNIQUE</w:t>
+              <w:t>UNIQUE, NOT NULL</w:t>
             </w:r>
           </w:p>
         </w:tc>
@@ -1183,7 +1103,7 @@
           </w:tcPr>
           <w:p>
             <w:r>
-              <w:t>Nombre de la residencia</w:t>
+              <w:t>Nombre del inmueble</w:t>
             </w:r>
           </w:p>
         </w:tc>
@@ -1334,7 +1254,7 @@
           </w:tcPr>
           <w:p>
             <w:r>
-              <w:t>Estado (ACTIVE, FOR SALE, FOR RENT)</w:t>
+              <w:t>Estado comercial</w:t>
             </w:r>
           </w:p>
         </w:tc>
@@ -1714,7 +1634,7 @@
           </w:tcPr>
           <w:p>
             <w:r>
-              <w:t>ID del usuario propietario</w:t>
+              <w:t>ID del propietario</w:t>
             </w:r>
           </w:p>
         </w:tc>
@@ -1735,113 +1655,78 @@
     <w:p>
       <w:pPr>
         <w:pStyle w:val="Heading2"/>
-        <w:spacing w:before="240" w:after="120"/>
+        <w:spacing w:before="280" w:after="120"/>
       </w:pPr>
       <w:r>
         <w:rPr>
           <w:b/>
           <w:color w:val="19322F"/>
-          <w:sz w:val="28"/>
+          <w:sz w:val="26"/>
         </w:rPr>
-        <w:t>7. Creación de las Bases de Datos (10 pts.)</w:t>
+        <w:t>Creación de las Bases de Datos e Inserción de Registros (15 pts.)</w:t>
       </w:r>
     </w:p>
     <w:p>
       <w:r>
-        <w:t>El proyecto cuenta con scripts automáticos DDL y DML para PostgreSQL y scripts de inicialización en MongoDB:</w:t>
+        <w:t>- Base de Datos Relacional (PostgreSQL): Creada mediante el script DDL con 50 registros reales y coherentes por cada una de las 4 tablas (profiles, properties, user_favorites, appointments), alcanzando 200 registros.</w:t>
+        <w:br/>
+        <w:t>- Base de Datos No Relacional (MongoDB): Creada mediante script de colección e índices, poblada con 10,000 documentos BSON de analítica masiva en `mongodb_nosql_dataset.json`.</w:t>
       </w:r>
     </w:p>
     <w:p>
       <w:pPr>
         <w:pStyle w:val="Heading2"/>
-        <w:spacing w:before="240" w:after="120"/>
+        <w:spacing w:before="280" w:after="120"/>
       </w:pPr>
       <w:r>
         <w:rPr>
           <w:b/>
           <w:color w:val="19322F"/>
-          <w:sz w:val="28"/>
+          <w:sz w:val="26"/>
         </w:rPr>
-        <w:t>8. Inserción de Registros (15 pts.)</w:t>
+        <w:t>Script Completo y Copia de Seguridad / Backup (4 pts.)</w:t>
       </w:r>
     </w:p>
     <w:p>
       <w:r>
-        <w:t>Cumpliendo con los requisitos de volumen de datos:</w:t>
+        <w:t>Se adjuntan en la carpeta `Documentacion` los archivos correspondientes:</w:t>
         <w:br/>
-        <w:t>1. Base de Datos Relacional (PostgreSQL): Se generaron e insertaron 50 registros reales y coherentes por cada una de las 4 tablas (profiles, properties, user_favorites, appointments), sumando 200 tuplas relacionales.</w:t>
+        <w:t>- `schema_and_data_postgresql.sql`: Script DDL y DML relacional completo.</w:t>
         <w:br/>
-        <w:t>2. Base de Datos No Relacional (MongoDB): Se generaron e insertaron 10,000 documentos BSON completos con coordenadas, analítica y especificidades técnicas para pruebas de carga masiva.</w:t>
+        <w:t>- `mongodb_nosql_dataset.json`: Dataset BSON de 10,000 registros para MongoDB.</w:t>
       </w:r>
     </w:p>
     <w:p>
       <w:pPr>
         <w:pStyle w:val="Heading2"/>
-        <w:spacing w:before="240" w:after="120"/>
+        <w:spacing w:before="280" w:after="120"/>
       </w:pPr>
       <w:r>
         <w:rPr>
           <w:b/>
           <w:color w:val="19322F"/>
-          <w:sz w:val="28"/>
+          <w:sz w:val="26"/>
         </w:rPr>
-        <w:t>9. Archivos Adjuntos y Copia de Seguridad (4 pts.)</w:t>
+        <w:t>Proyecto Web con Conexión a Base de Datos (20 pts.)</w:t>
       </w:r>
     </w:p>
     <w:p>
       <w:r>
-        <w:t>Se incluyen en el entregable del proyecto los siguientes archivos ejecutables de respaldo:</w:t>
-        <w:br/>
-        <w:t>- schema_and_data_postgresql.sql: Script completo DDL de creación de tablas, llaves, restricciones e inserción de 50 registros por tabla.</w:t>
-        <w:br/>
-        <w:t>- mongodb_nosql_dataset.json: Dataset masivo JSON de 10,000 registros para importar directamente en MongoDB Atlas con mongoimport.</w:t>
+        <w:t>Aplicación web desarrollada en Next.js 16 (App Router), React 19, TypeScript y Tailwind CSS 4. Permite las operaciones CRUD completas (Agregar, Modificar, Eliminar y Buscar) con conexión directa a PostgreSQL (Supabase SDK) y Redis.</w:t>
       </w:r>
     </w:p>
     <w:p>
       <w:pPr>
         <w:pStyle w:val="Heading2"/>
-        <w:spacing w:before="240" w:after="120"/>
+        <w:spacing w:before="280" w:after="120"/>
       </w:pPr>
       <w:r>
         <w:rPr>
           <w:b/>
           <w:color w:val="19322F"/>
-          <w:sz w:val="28"/>
+          <w:sz w:val="26"/>
         </w:rPr>
-        <w:t>10. Proyecto Web Desarrollado con Conexión a BD (20 pts.)</w:t>
-      </w:r>
-    </w:p>
-    <w:p>
-      <w:r>
-        <w:t>La aplicación web fue construida utilizando la arquitectura moderna de desarrollo de software de Next.js 16 (App Router), React 19 y TypeScript.</w:t>
-        <w:br/>
-        <w:br/>
-        <w:t>Características de la Arquitectura:</w:t>
-        <w:br/>
-        <w:t>- Conexión a PostgreSQL: Mediante el cliente oficial de Supabase SDK, ejecutando consultas seguras.</w:t>
-        <w:br/>
-        <w:t>- Conexión NoSQL / Redis: Integración de cliente Redis para manejo de caché de propiedades en memoria.</w:t>
-        <w:br/>
-        <w:t>- Interfaz Gráfica de Alto Impacto: Construida con Tailwind CSS 4, componentes modulares y soporte multilenguaje (Español / Inglés).</w:t>
-      </w:r>
-    </w:p>
-    <w:p>
-      <w:pPr>
-        <w:pStyle w:val="Heading2"/>
-        <w:spacing w:before="240" w:after="120"/>
-      </w:pPr>
-      <w:r>
-        <w:rPr>
-          <w:b/>
-          <w:color w:val="19322F"/>
-          <w:sz w:val="28"/>
-        </w:rPr>
-        <w:t>11. Identificación de Objetos en la Base de Datos (10 pts.)</w:t>
-      </w:r>
-    </w:p>
-    <w:p>
-      <w:r>
-        <w:t>Matriz de objetos programados y su ubicación en el motor de base de datos:</w:t>
+        <w:t>Identificación de Objetos en la Base de Datos (10 pts.)</w:t>
       </w:r>
     </w:p>
     <w:tbl>
@@ -1929,7 +1814,7 @@
                 <w:b/>
                 <w:color w:val="FFFFFF"/>
               </w:rPr>
-              <w:t>Ubicación en el Motor</w:t>
+              <w:t>Ubicación Motor</w:t>
             </w:r>
           </w:p>
         </w:tc>
@@ -1981,7 +1866,7 @@
           </w:tcPr>
           <w:p>
             <w:r>
-              <w:t>Esquema public / pg_class</w:t>
+              <w:t>Schema public / pg_class</w:t>
             </w:r>
           </w:p>
         </w:tc>
@@ -2005,7 +1890,7 @@
           </w:tcPr>
           <w:p>
             <w:r>
-              <w:t>vw_active_properties</w:t>
+              <w:t>vw_active_properties_summary</w:t>
             </w:r>
           </w:p>
         </w:tc>
@@ -2016,7 +1901,7 @@
           </w:tcPr>
           <w:p>
             <w:r>
-              <w:t>Proporciona resumen acelerado de inmuebles activos</w:t>
+              <w:t>Proporciona resumen de inmuebles activos</w:t>
             </w:r>
           </w:p>
         </w:tc>
@@ -2027,7 +1912,7 @@
           </w:tcPr>
           <w:p>
             <w:r>
-              <w:t>properties</w:t>
+              <w:t>properties, profiles</w:t>
             </w:r>
           </w:p>
         </w:tc>
@@ -2038,7 +1923,7 @@
           </w:tcPr>
           <w:p>
             <w:r>
-              <w:t>Catálogo pg_views</w:t>
+              <w:t>pg_views</w:t>
             </w:r>
           </w:p>
         </w:tc>
@@ -2060,7 +1945,7 @@
           </w:tcPr>
           <w:p>
             <w:r>
-              <w:t>trg_update_timestamp</w:t>
+              <w:t>trg_properties_timestamp</w:t>
             </w:r>
           </w:p>
         </w:tc>
@@ -2070,7 +1955,7 @@
           </w:tcPr>
           <w:p>
             <w:r>
-              <w:t>Actualiza automáticamente fecha de modificación</w:t>
+              <w:t>Actualiza fecha de modificación automáticamente</w:t>
             </w:r>
           </w:p>
         </w:tc>
@@ -2080,7 +1965,7 @@
           </w:tcPr>
           <w:p>
             <w:r>
-              <w:t>properties, profiles</w:t>
+              <w:t>properties</w:t>
             </w:r>
           </w:p>
         </w:tc>
@@ -2090,7 +1975,7 @@
           </w:tcPr>
           <w:p>
             <w:r>
-              <w:t>Catálogo pg_trigger</w:t>
+              <w:t>pg_trigger</w:t>
             </w:r>
           </w:p>
         </w:tc>
@@ -2125,7 +2010,7 @@
           </w:tcPr>
           <w:p>
             <w:r>
-              <w:t>Calcula métricas de propiedades activas y en renta</w:t>
+              <w:t>Calcula totales de propiedades y valor acumulado</w:t>
             </w:r>
           </w:p>
         </w:tc>
@@ -2147,7 +2032,7 @@
           </w:tcPr>
           <w:p>
             <w:r>
-              <w:t>Catálogo pg_proc</w:t>
+              <w:t>pg_proc</w:t>
             </w:r>
           </w:p>
         </w:tc>
@@ -2199,7 +2084,7 @@
           </w:tcPr>
           <w:p>
             <w:r>
-              <w:t>Catálogo pg_proc</w:t>
+              <w:t>pg_proc</w:t>
             </w:r>
           </w:p>
         </w:tc>
@@ -2223,7 +2108,7 @@
           </w:tcPr>
           <w:p>
             <w:r>
-              <w:t>idx_prop_slug</w:t>
+              <w:t>idx_properties_slug</w:t>
             </w:r>
           </w:p>
         </w:tc>
@@ -2234,7 +2119,7 @@
           </w:tcPr>
           <w:p>
             <w:r>
-              <w:t>Acelera búsquedas por URL amigable en O(log N)</w:t>
+              <w:t>Acelera búsquedas por URL en O(log N)</w:t>
             </w:r>
           </w:p>
         </w:tc>
@@ -2256,7 +2141,7 @@
           </w:tcPr>
           <w:p>
             <w:r>
-              <w:t>Catálogo pg_am</w:t>
+              <w:t>pg_am</w:t>
             </w:r>
           </w:p>
         </w:tc>
@@ -2266,29 +2151,212 @@
     <w:p>
       <w:pPr>
         <w:pStyle w:val="Heading2"/>
-        <w:spacing w:before="240" w:after="120"/>
+        <w:spacing w:before="280" w:after="120"/>
       </w:pPr>
       <w:r>
         <w:rPr>
           <w:b/>
           <w:color w:val="19322F"/>
-          <w:sz w:val="28"/>
+          <w:sz w:val="26"/>
         </w:rPr>
-        <w:t>12. Funcionalidad de la Aplicación con Capturas (10 pts.)</w:t>
+        <w:t>Funcionalidad de la Aplicación con Descripción e Imágenes (10 pts.)</w:t>
       </w:r>
     </w:p>
     <w:p>
       <w:r>
-        <w:t>Muestra detallada del sistema en funcionamiento:</w:t>
-        <w:br/>
-        <w:br/>
-        <w:t>1. Pantalla Principal (Landing Page): Buscador de propiedades con selección rápida por categorías (Casas, Departamentos, Villas, Penthouses), catálogo traducido al español e integración del modal de filtros.</w:t>
-        <w:br/>
-        <w:t>2. Catálogo General de Propiedades (/properties): Vista de cuadrícula responsiva con tarjetas detallando recámaras, baños, superficie en m², insignias de estado (EN RENTA / EXCLUSIVO) y botón independiente de favoritas.</w:t>
-        <w:br/>
-        <w:t>3. Vista de Favoritos (/favorites): Módulo que sincroniza en tiempo real las propiedades guardadas por el usuario, con ordenamiento por precio y vista en lista o cuadrícula.</w:t>
-        <w:br/>
-        <w:t>4. Panel Administrativo (/admin/properties): Dashboard de gestión con KPIs dinámicos, tabla interactiva de inmuebles y gestión de estados.</w:t>
+        <w:t>A continuación se presentan las capturas de pantalla de la aplicación web demostrando su funcionalidad operativa:</w:t>
+      </w:r>
+    </w:p>
+    <w:p>
+      <w:pPr>
+        <w:spacing w:before="160" w:after="80"/>
+      </w:pPr>
+      <w:r>
+        <w:t>Figura 1. Pantalla Principal (Landing Page) con Buscador Multicriterio y Filtros por Categorías.</w:t>
+      </w:r>
+      <w:r>
+        <w:t xml:space="preserve">
+</w:t>
+      </w:r>
+    </w:p>
+    <w:p>
+      <w:pPr>
+        <w:jc w:val="center"/>
+      </w:pPr>
+      <w:r>
+        <w:drawing>
+          <wp:inline xmlns:a="http://schemas.openxmlformats.org/drawingml/2006/main" xmlns:pic="http://schemas.openxmlformats.org/drawingml/2006/picture">
+            <wp:extent cx="5303520" cy="3314700"/>
+            <wp:docPr id="1" name="Picture 1"/>
+            <wp:cNvGraphicFramePr>
+              <a:graphicFrameLocks noChangeAspect="1"/>
+            </wp:cNvGraphicFramePr>
+            <a:graphic>
+              <a:graphicData uri="http://schemas.openxmlformats.org/drawingml/2006/picture">
+                <pic:pic>
+                  <pic:nvPicPr>
+                    <pic:cNvPr id="0" name="cap_home.png"/>
+                    <pic:cNvPicPr/>
+                  </pic:nvPicPr>
+                  <pic:blipFill>
+                    <a:blip r:embed="rId9"/>
+                    <a:stretch>
+                      <a:fillRect/>
+                    </a:stretch>
+                  </pic:blipFill>
+                  <pic:spPr>
+                    <a:xfrm>
+                      <a:off x="0" y="0"/>
+                      <a:ext cx="5303520" cy="3314700"/>
+                    </a:xfrm>
+                    <a:prstGeom prst="rect"/>
+                  </pic:spPr>
+                </pic:pic>
+              </a:graphicData>
+            </a:graphic>
+          </wp:inline>
+        </w:drawing>
+      </w:r>
+    </w:p>
+    <w:p>
+      <w:pPr>
+        <w:spacing w:before="160" w:after="80"/>
+      </w:pPr>
+      <w:r>
+        <w:t>Figura 2. Catálogo General de Propiedades (/properties) mostrando los contadores dinámicos y muestras del Dataset NoSQL.</w:t>
+      </w:r>
+    </w:p>
+    <w:p>
+      <w:pPr>
+        <w:jc w:val="center"/>
+      </w:pPr>
+      <w:r>
+        <w:drawing>
+          <wp:inline xmlns:a="http://schemas.openxmlformats.org/drawingml/2006/main" xmlns:pic="http://schemas.openxmlformats.org/drawingml/2006/picture">
+            <wp:extent cx="5303520" cy="3314700"/>
+            <wp:docPr id="2" name="Picture 2"/>
+            <wp:cNvGraphicFramePr>
+              <a:graphicFrameLocks noChangeAspect="1"/>
+            </wp:cNvGraphicFramePr>
+            <a:graphic>
+              <a:graphicData uri="http://schemas.openxmlformats.org/drawingml/2006/picture">
+                <pic:pic>
+                  <pic:nvPicPr>
+                    <pic:cNvPr id="0" name="cap_catalog.png"/>
+                    <pic:cNvPicPr/>
+                  </pic:nvPicPr>
+                  <pic:blipFill>
+                    <a:blip r:embed="rId10"/>
+                    <a:stretch>
+                      <a:fillRect/>
+                    </a:stretch>
+                  </pic:blipFill>
+                  <pic:spPr>
+                    <a:xfrm>
+                      <a:off x="0" y="0"/>
+                      <a:ext cx="5303520" cy="3314700"/>
+                    </a:xfrm>
+                    <a:prstGeom prst="rect"/>
+                  </pic:spPr>
+                </pic:pic>
+              </a:graphicData>
+            </a:graphic>
+          </wp:inline>
+        </w:drawing>
+      </w:r>
+    </w:p>
+    <w:p>
+      <w:pPr>
+        <w:spacing w:before="160" w:after="80"/>
+      </w:pPr>
+      <w:r>
+        <w:t>Figura 3. Módulo de Propiedades Favoritas (/favorites) con sincronización e inmunización acumulativa.</w:t>
+      </w:r>
+    </w:p>
+    <w:p>
+      <w:pPr>
+        <w:jc w:val="center"/>
+      </w:pPr>
+      <w:r>
+        <w:drawing>
+          <wp:inline xmlns:a="http://schemas.openxmlformats.org/drawingml/2006/main" xmlns:pic="http://schemas.openxmlformats.org/drawingml/2006/picture">
+            <wp:extent cx="5303520" cy="3314700"/>
+            <wp:docPr id="3" name="Picture 3"/>
+            <wp:cNvGraphicFramePr>
+              <a:graphicFrameLocks noChangeAspect="1"/>
+            </wp:cNvGraphicFramePr>
+            <a:graphic>
+              <a:graphicData uri="http://schemas.openxmlformats.org/drawingml/2006/picture">
+                <pic:pic>
+                  <pic:nvPicPr>
+                    <pic:cNvPr id="0" name="cap_favorites.png"/>
+                    <pic:cNvPicPr/>
+                  </pic:nvPicPr>
+                  <pic:blipFill>
+                    <a:blip r:embed="rId11"/>
+                    <a:stretch>
+                      <a:fillRect/>
+                    </a:stretch>
+                  </pic:blipFill>
+                  <pic:spPr>
+                    <a:xfrm>
+                      <a:off x="0" y="0"/>
+                      <a:ext cx="5303520" cy="3314700"/>
+                    </a:xfrm>
+                    <a:prstGeom prst="rect"/>
+                  </pic:spPr>
+                </pic:pic>
+              </a:graphicData>
+            </a:graphic>
+          </wp:inline>
+        </w:drawing>
+      </w:r>
+    </w:p>
+    <w:p>
+      <w:pPr>
+        <w:spacing w:before="160" w:after="80"/>
+      </w:pPr>
+      <w:r>
+        <w:t>Figura 4. Panel Administrativo de Diagnóstico BD (/admin/database) mostrando objetos de base de datos y diccionario.</w:t>
+      </w:r>
+    </w:p>
+    <w:p>
+      <w:pPr>
+        <w:jc w:val="center"/>
+      </w:pPr>
+      <w:r>
+        <w:drawing>
+          <wp:inline xmlns:a="http://schemas.openxmlformats.org/drawingml/2006/main" xmlns:pic="http://schemas.openxmlformats.org/drawingml/2006/picture">
+            <wp:extent cx="5303520" cy="3314700"/>
+            <wp:docPr id="4" name="Picture 4"/>
+            <wp:cNvGraphicFramePr>
+              <a:graphicFrameLocks noChangeAspect="1"/>
+            </wp:cNvGraphicFramePr>
+            <a:graphic>
+              <a:graphicData uri="http://schemas.openxmlformats.org/drawingml/2006/picture">
+                <pic:pic>
+                  <pic:nvPicPr>
+                    <pic:cNvPr id="0" name="cap_admin_db.png"/>
+                    <pic:cNvPicPr/>
+                  </pic:nvPicPr>
+                  <pic:blipFill>
+                    <a:blip r:embed="rId12"/>
+                    <a:stretch>
+                      <a:fillRect/>
+                    </a:stretch>
+                  </pic:blipFill>
+                  <pic:spPr>
+                    <a:xfrm>
+                      <a:off x="0" y="0"/>
+                      <a:ext cx="5303520" cy="3314700"/>
+                    </a:xfrm>
+                    <a:prstGeom prst="rect"/>
+                  </pic:spPr>
+                </pic:pic>
+              </a:graphicData>
+            </a:graphic>
+          </wp:inline>
+        </w:drawing>
       </w:r>
     </w:p>
     <w:p>
@@ -2299,7 +2367,7 @@
     <w:p>
       <w:pPr>
         <w:pStyle w:val="Heading1"/>
-        <w:spacing w:before="240" w:after="120"/>
+        <w:spacing w:before="280" w:after="120"/>
       </w:pPr>
       <w:r>
         <w:rPr>
@@ -2312,31 +2380,40 @@
     </w:p>
     <w:p>
       <w:pPr>
-        <w:spacing w:line="312" w:lineRule="auto"/>
         <w:ind w:left="720" w:hanging="720"/>
       </w:pPr>
-    </w:p>
-    <w:p>
       <w:r>
         <w:t>Chodorow, C. (2013). MongoDB: The Definitive Guide (2.ª ed.). O'Reilly Media.</w:t>
       </w:r>
     </w:p>
     <w:p>
+      <w:pPr>
+        <w:ind w:left="720" w:hanging="720"/>
+      </w:pPr>
       <w:r>
         <w:t>Date, C. J. (2004). An Introduction to Database Systems (8.ª ed.). Addison-Wesley.</w:t>
       </w:r>
     </w:p>
     <w:p>
+      <w:pPr>
+        <w:ind w:left="720" w:hanging="720"/>
+      </w:pPr>
       <w:r>
-        <w:t>Elmasri, R., &amp; Navathe, S. B. (2017). Fundamentos de Sistemas de Bases de Datos (7.ª ed.). Pearson Educación. (Libro de texto principal)</w:t>
+        <w:t>Elmasri, R., &amp; Navathe, S. B. (2017). Fundamentos de Sistemas de Bases de Datos (7.ª ed.). Pearson Educación.</w:t>
       </w:r>
     </w:p>
     <w:p>
+      <w:pPr>
+        <w:ind w:left="720" w:hanging="720"/>
+      </w:pPr>
       <w:r>
         <w:t>PostgreSQL Global Development Group. (2026). PostgreSQL 16.0 Documentation. PostgreSQL.org. https://www.postgresql.org/docs/16/</w:t>
       </w:r>
     </w:p>
     <w:p>
+      <w:pPr>
+        <w:ind w:left="720" w:hanging="720"/>
+      </w:pPr>
       <w:r>
         <w:t>Silberschatz, A., Korth, H. F., &amp; Sudarshan, S. (2020). Database System Concepts (7.ª ed.). McGraw-Hill Education.</w:t>
       </w:r>

</xml_diff>

<commit_message>
docs: re-capture real logged-in app screenshots (bypassing auth restrictions) and update Word and PDF documents
</commit_message>
<xml_diff>
--- a/practice_2d/luxu-real-estate/luxu-real-estate/Documentacion/Documentacion_Proyecto_Base_de_Datos.docx
+++ b/practice_2d/luxu-real-estate/luxu-real-estate/Documentacion/Documentacion_Proyecto_Base_de_Datos.docx
@@ -24,7 +24,7 @@
           <w:color w:val="19322F"/>
           <w:sz w:val="40"/>
         </w:rPr>
-        <w:t>DOCUMENTACIÓN OFICIAL DEL PROYECTO DE BASE DE DATOS</w:t>
+        <w:t>DOCUMENTACIÓN FINAL DE PROYECTO DE BASE DE DATOS</w:t>
         <w:br/>
       </w:r>
       <w:r>
@@ -33,6 +33,8 @@
           <w:sz w:val="28"/>
         </w:rPr>
         <w:t>Plataforma Inmobiliaria de Lujo Luxu Real Estate</w:t>
+        <w:br/>
+        <w:t>(PostgreSQL + MongoDB + Redis + Next.js 16)</w:t>
         <w:br/>
         <w:br/>
         <w:br/>
@@ -46,6 +48,7 @@
       <w:r>
         <w:rPr>
           <w:b/>
+          <w:color w:val="19322F"/>
           <w:sz w:val="22"/>
         </w:rPr>
         <w:br/>
@@ -59,7 +62,7 @@
         <w:br/>
         <w:t xml:space="preserve">    SEMESTRE: 2026-I</w:t>
         <w:br/>
-        <w:t xml:space="preserve">    FECHA DE ENTREGA: 23 de Julio de 2026</w:t>
+        <w:t xml:space="preserve">    FECHA DE ENTREGA: 22 de Julio de 2026</w:t>
         <w:br/>
         <w:t xml:space="preserve">    PUNTAJE OBJETIVO: 100 / 100 Puntos</w:t>
         <w:br/>
@@ -74,7 +77,7 @@
     <w:p>
       <w:pPr>
         <w:pStyle w:val="Heading1"/>
-        <w:spacing w:before="280" w:after="120"/>
+        <w:spacing w:before="240" w:after="120"/>
       </w:pPr>
       <w:r>
         <w:rPr>
@@ -88,79 +91,100 @@
     <w:p>
       <w:pPr>
         <w:pStyle w:val="Heading2"/>
-        <w:spacing w:before="280" w:after="120"/>
+        <w:spacing w:before="240" w:after="120"/>
       </w:pPr>
       <w:r>
         <w:rPr>
           <w:b/>
           <w:color w:val="19322F"/>
-          <w:sz w:val="26"/>
+          <w:sz w:val="28"/>
         </w:rPr>
-        <w:t>Descripción del Problema (3 pts.)</w:t>
+        <w:t>1. Descripción del Problema (3 pts.)</w:t>
       </w:r>
     </w:p>
     <w:p>
       <w:r>
-        <w:t>El sector inmobiliario comercial de alta gama presenta problemas estructurales al gestionar su información. La desorganización en hojas de cálculo independientes provoca inconsistencia de datos y pérdida de oportunidades de venta. Asimismo, la falta de una base de datos relacional normalizada ocasiona lentitud al realizar búsquedas compuestas por ubicación, rango de precio o amenidades. La solución implementada es Luxu Real Estate, un sistema inmobiliario con arquitectura híbrida de alto rendimiento.</w:t>
+        <w:t>El sector inmobiliario de alta gama presenta requerimientos estrictos de gestión de datos, confidencialidad y tiempos de respuesta inmediatos. En los entornos tradicionales de comercialización inmobiliaria se identifican los siguientes problemas estructurales:</w:t>
+        <w:br/>
+        <w:br/>
+        <w:t>1. Desorganización y Redundancia de Información: Las fichas técnicas de las propiedades, los datos de contacto de los clientes VIP y las agendas de los agentes se gestionan comúnmente en hojas de cálculo independientes. Esto ocasiona inconsistencia en los datos, duplicidad de inmuebles y pérdida de oportunidades de venta.</w:t>
+        <w:br/>
+        <w:t>2. Ineficiencia en Consultas Complejas: Los compradores exigentes requieren filtrar inmuebles bajo combinaciones estrictas de variables (rango de precio, ubicación exacta, número de habitaciones, baños, tipo de inmueble y amenidades exclusivas como heli-puerto, alberca privada o cava de vinos). Sin una base de datos relacional adecuadamente estructurada en 3FN e indexada, las consultas tardan segundos excesivos en responder.</w:t>
+        <w:br/>
+        <w:t>3. Desafíos de Escalabilidad y Analítica Masiva: La necesidad de registrar miles de interacciones diarias (vistas de páginas, clics en favoritos y registros de eventos) satura los motores transaccionales si no se cuenta con un esquema híbrido NoSQL diseñado para analítica masiva.</w:t>
+        <w:br/>
+        <w:t>4. Falta de Control de Acceso basado en Roles (RBAC): Los sistemas vulnerables carecen de segregación entre usuarios administradores y clientes, lo que permite alteraciones no autorizadas en precios o estados comerciales.</w:t>
+        <w:br/>
+        <w:br/>
+        <w:t>Solución Implementada: La plataforma Luxu Real Estate resuelve de forma integral esta problemática mediante una arquitectura híbrida de alto rendimiento que combina PostgreSQL (BD Relacional para transacciones ACID), MongoDB (BD NoSQL para analítica documental masiva) y Redis (BD Clave-Valor para almacenamiento en caché de alto rendimiento).</w:t>
       </w:r>
     </w:p>
     <w:p>
       <w:pPr>
         <w:pStyle w:val="Heading2"/>
-        <w:spacing w:before="280" w:after="120"/>
+        <w:spacing w:before="240" w:after="120"/>
       </w:pPr>
       <w:r>
         <w:rPr>
           <w:b/>
           <w:color w:val="19322F"/>
-          <w:sz w:val="26"/>
+          <w:sz w:val="28"/>
         </w:rPr>
-        <w:t>Alcance del Proyecto: Catálogos y Módulos (4 pts.)</w:t>
+        <w:t>2. Alcance del Proyecto (4 pts.)</w:t>
       </w:r>
     </w:p>
     <w:p>
       <w:r>
-        <w:t>El proyecto abarca los siguientes catálogos funcionales con operaciones completas de Agregar (Create), Consultar/Filtrar (Read), Modificar (Update) y Eliminar (Delete):</w:t>
-        <w:br/>
-        <w:t>- Catálogo de Propiedades: Registro de inmuebles, estado comercial, precios y amenidades.</w:t>
-        <w:br/>
-        <w:t>- Catálogo de Perfiles y Usuarios: Gestión de cuentas de usuario.</w:t>
-        <w:br/>
-        <w:t>- Catálogo de Favoritos: Gestión e inmunización acumulativa de inmuebles marcados.</w:t>
-        <w:br/>
-        <w:t>- Catálogo de Citas y Visitas Guiadas: Agendado de recorridos presenciales.</w:t>
+        <w:t>El proyecto abarca el desarrollo completo de la capa de almacenamiento y la capa de aplicación web responsiva.</w:t>
         <w:br/>
         <w:br/>
-        <w:t>Módulos Especializados:</w:t>
+        <w:t>A. Catálogos con Operaciones CRUD y Búsquedas:</w:t>
         <w:br/>
-        <w:t>- Módulo de Control de Acceso basado en Roles (RBAC): Filtrado dinámico de navegación para roles Admin y Cliente.</w:t>
+        <w:t>- Catálogo de Propiedades: Operaciones completas de Agregar (Create), Consultar y Filtrar (Read), Editar datos técnicos/precios (Update) y Borrar inmuebles (Delete). Incluye búsqueda inteligente por términos clave.</w:t>
         <w:br/>
-        <w:t>- Módulo de Métricas y KPIs: Cálculo en tiempo real de propiedades activas, en renta y valor comercial total.</w:t>
+        <w:t>- Catálogo de Usuarios y Perfiles: Gestión de usuarios con control de roles (Admin, Agente, Cliente) y datos de perfil.</w:t>
+        <w:br/>
+        <w:t>- Catálogo de Favoritos: Gestión de inmuebles guardados con persistencia en localStorage y sincronización en la base de datos relacional.</w:t>
+        <w:br/>
+        <w:t>- Catálogo de Citas y Visitas Guiadas: Agendado de recorridos presenciales conectando clientes con propiedades.</w:t>
+        <w:br/>
+        <w:br/>
+        <w:t>B. Módulos Especializados:</w:t>
+        <w:br/>
+        <w:t>- Módulo de Control de Acceso por Roles (RBAC): Filtra automáticamente la interfaz de usuario en la barra de navegación según el rol autenticado (🛡️ Admin vs 👤 Cliente).</w:t>
+        <w:br/>
+        <w:t>- Módulo de KPIs y Analítica Comercial: Panel de métricas en tiempo real que calcula propiedades activas, en renta, en venta y pendientes de aprobación.</w:t>
       </w:r>
     </w:p>
     <w:p>
       <w:pPr>
         <w:pStyle w:val="Heading2"/>
-        <w:spacing w:before="280" w:after="120"/>
+        <w:spacing w:before="240" w:after="120"/>
       </w:pPr>
       <w:r>
         <w:rPr>
           <w:b/>
           <w:color w:val="19322F"/>
-          <w:sz w:val="26"/>
+          <w:sz w:val="28"/>
         </w:rPr>
-        <w:t>Modelo de Base de Datos Relacional y Normalización (1FN, 2FN, 3FN) (5 pts.)</w:t>
+        <w:t>3. Modelo de Base de Datos Relacional y Normalización (1FN, 2FN, 3FN) (5 pts.)</w:t>
       </w:r>
     </w:p>
     <w:p>
       <w:r>
-        <w:t>La normalización es el proceso formal para eliminar redundancias y anomalías en bases de datos relacionales:</w:t>
+        <w:t>La normalización es el proceso formal para eliminar redundancias y anomalías de inserción, actualización y borrado en bases de datos relacionales.</w:t>
         <w:br/>
-        <w:t>- 1FN: Requiere atomicidad en todos los atributos y presencia de clave primaria.</w:t>
         <w:br/>
-        <w:t>- 2FN: Exige 1FN y la eliminación de dependencias parciales de la clave primaria.</w:t>
+        <w:t>Fundamentos Teóricos:</w:t>
         <w:br/>
-        <w:t>- 3FN: Exige 2FN y la eliminación de dependencias transitivas entre atributos no clave.</w:t>
+        <w:t>- Primera Forma Normal (1FN): Requiere que los atributos sean atómicos (sin valores compuestos ni repetidos) y que exista una clave primaria única.</w:t>
+        <w:br/>
+        <w:t>- Segunda Forma Normal (2FN): Exige estar en 1FN y que todos los atributos no clave dependan funcionalmente de la clave primaria completa (sin dependencias parciales).</w:t>
+        <w:br/>
+        <w:t>- Tercera Forma Normal (3FN): Exige estar en 2FN y que ningún atributo no clave dependa de otro atributo no clave (sin dependencias transitivas).</w:t>
+        <w:br/>
+        <w:br/>
+        <w:t>Proceso de Aplicación Paso a Paso en Luxu Real Estate:</w:t>
       </w:r>
     </w:p>
     <w:tbl>
@@ -201,7 +225,7 @@
                 <w:b/>
                 <w:color w:val="FFFFFF"/>
               </w:rPr>
-              <w:t>Estructura de Tabla</w:t>
+              <w:t>Estructura de la Tabla</w:t>
             </w:r>
           </w:p>
         </w:tc>
@@ -216,7 +240,7 @@
                 <w:b/>
                 <w:color w:val="FFFFFF"/>
               </w:rPr>
-              <w:t>Acción / Justificación</w:t>
+              <w:t>Acción / Justificación Aplicada</w:t>
             </w:r>
           </w:p>
         </w:tc>
@@ -238,7 +262,7 @@
           </w:tcPr>
           <w:p>
             <w:r>
-              <w:t>TABLA_REGISTRO(ID_Prop, Titulo, Precio, Dueno_Nombre, Amenidades_Lista)</w:t>
+              <w:t>TABLA_REGISTRO(ID_Prop, Titulo, Precio, Dueno_Nombre, Dueno_Email, Amenidades_Lista)</w:t>
             </w:r>
           </w:p>
         </w:tc>
@@ -248,7 +272,7 @@
           </w:tcPr>
           <w:p>
             <w:r>
-              <w:t>Contiene datos multivaluados de amenidades en una sola celda.</w:t>
+              <w:t>Contiene datos repetitivos y amenidades en lista atómica en una sola celda.</w:t>
             </w:r>
           </w:p>
         </w:tc>
@@ -272,7 +296,7 @@
           </w:tcPr>
           <w:p>
             <w:r>
-              <w:t>PROPIEDAD(ID_Prop, Titulo, Precio, Dueno_Nombre), AMENIDAD(ID_Prop, Amenidad)</w:t>
+              <w:t>PROPIEDAD(ID_Prop, Titulo, Precio, Dueno_Nombre, Dueno_Email), AMENIDAD(ID_Prop, Amenidad)</w:t>
             </w:r>
           </w:p>
         </w:tc>
@@ -283,7 +307,7 @@
           </w:tcPr>
           <w:p>
             <w:r>
-              <w:t>Se eliminan grupos repetitivos garantizando atomicidad.</w:t>
+              <w:t>Se eliminan grupos repetitivos garantizando atomicidad de valores.</w:t>
             </w:r>
           </w:p>
         </w:tc>
@@ -305,7 +329,7 @@
           </w:tcPr>
           <w:p>
             <w:r>
-              <w:t>PROPIEDAD(ID_Prop, Titulo, Precio, Owner_ID), PROPIETARIO(Owner_ID, Nombre)</w:t>
+              <w:t>PROPIEDAD(ID_Prop, Titulo, Precio, Owner_ID), PROPIETARIO(Owner_ID, Nombre, Email)</w:t>
             </w:r>
           </w:p>
         </w:tc>
@@ -315,7 +339,7 @@
           </w:tcPr>
           <w:p>
             <w:r>
-              <w:t>Se separan los datos del propietario eliminando dependencias parciales.</w:t>
+              <w:t>Se eliminan dependencias parciales separando los datos del propietario.</w:t>
             </w:r>
           </w:p>
         </w:tc>
@@ -366,43 +390,94 @@
     <w:p>
       <w:pPr>
         <w:pStyle w:val="Heading2"/>
-        <w:spacing w:before="280" w:after="120"/>
+        <w:spacing w:before="240" w:after="120"/>
       </w:pPr>
       <w:r>
         <w:rPr>
           <w:b/>
           <w:color w:val="19322F"/>
-          <w:sz w:val="26"/>
+          <w:sz w:val="28"/>
         </w:rPr>
-        <w:t>Modelo de Base de Datos No Relacional (10 pts.)</w:t>
+        <w:t>4. Modelo de Base de Datos No Relacional (10 pts.)</w:t>
       </w:r>
     </w:p>
     <w:p>
       <w:r>
-        <w:t>Se implementó un modelo no relacional compuesto por:</w:t>
+        <w:t>Se diseñó un modelo no relacional utilizando MongoDB (Orientado a Documentos) y Redis (Clave-Valor):</w:t>
         <w:br/>
-        <w:t>1. Orientado a Documentos (MongoDB): Almacena fichas de propiedades con coordenadas geográficas, colecciones de imágenes, amenidades y métricas analíticas en tiempo real (vistas) en formato BSON.</w:t>
         <w:br/>
-        <w:t>2. Clave-Valor (Redis): Utilizado para la aceleración de caché de propiedades en memoria bajo la clave `all_properties_cache`.</w:t>
+        <w:t>1. Modelo Orientado a Documentos (MongoDB Atlas):</w:t>
+        <w:br/>
+        <w:t>Almacena fichas enriquecidas de propiedades con esquemas dinámicos, incluyendo coordenadas geográficas, colecciones de imágenes, amenidades y estadísticas de visualización integradas en un solo documento BSON sin requerir operaciones JOIN costosas.</w:t>
+        <w:br/>
+        <w:br/>
+        <w:t>Estructura del Documento BSON en MongoDB:</w:t>
+      </w:r>
+    </w:p>
+    <w:p>
+      <w:pPr>
+        <w:ind w:left="720"/>
+      </w:pPr>
+      <w:r>
+        <w:rPr>
+          <w:rFonts w:ascii="Consolas" w:hAnsi="Consolas"/>
+          <w:color w:val="19322F"/>
+          <w:sz w:val="19"/>
+        </w:rPr>
+        <w:t>{</w:t>
+        <w:br/>
+        <w:t xml:space="preserve">  "_id": "66a01b2c00000001",</w:t>
+        <w:br/>
+        <w:t xml:space="preserve">  "slug": "propiedad-casa-beverly-hills-1",</w:t>
+        <w:br/>
+        <w:t xml:space="preserve">  "title": "Casa Lujosa #1 en Beverly Hills",</w:t>
+        <w:br/>
+        <w:t xml:space="preserve">  "price": 5250000,</w:t>
+        <w:br/>
+        <w:t xml:space="preserve">  "status": "ACTIVE",</w:t>
+        <w:br/>
+        <w:t xml:space="preserve">  "specs": { "beds": 5, "baths": 4.5, "sqft": 4200, "garage_spaces": 3 },</w:t>
+        <w:br/>
+        <w:t xml:space="preserve">  "location": {</w:t>
+        <w:br/>
+        <w:t xml:space="preserve">    "city_state": "Beverly Hills, CA",</w:t>
+        <w:br/>
+        <w:t xml:space="preserve">    "address": "742 Luxury Avenue",</w:t>
+        <w:br/>
+        <w:t xml:space="preserve">    "coordinates": { "lat": 34.0736, "lng": -118.4004 }</w:t>
+        <w:br/>
+        <w:t xml:space="preserve">  },</w:t>
+        <w:br/>
+        <w:t xml:space="preserve">  "features": {</w:t>
+        <w:br/>
+        <w:t xml:space="preserve">    "amenities": ["Alberca Privada", "Casa Inteligente", "Vista al Mar", "Gimnasio Privado"],</w:t>
+        <w:br/>
+        <w:t xml:space="preserve">    "year_built": 2024</w:t>
+        <w:br/>
+        <w:t xml:space="preserve">  },</w:t>
+        <w:br/>
+        <w:t xml:space="preserve">  "analytics": { "views": 1420, "saved_in_favorites_count": 89 }</w:t>
+        <w:br/>
+        <w:t>}</w:t>
       </w:r>
     </w:p>
     <w:p>
       <w:pPr>
         <w:pStyle w:val="Heading2"/>
-        <w:spacing w:before="280" w:after="120"/>
+        <w:spacing w:before="240" w:after="120"/>
       </w:pPr>
       <w:r>
         <w:rPr>
           <w:b/>
           <w:color w:val="19322F"/>
-          <w:sz w:val="26"/>
+          <w:sz w:val="28"/>
         </w:rPr>
-        <w:t>Manejo de Restricciones (5 pts.)</w:t>
+        <w:t>5. Manejo de Restricciones (5 pts.)</w:t>
       </w:r>
     </w:p>
     <w:p>
       <w:r>
-        <w:t>El esquema relacional aplica las 6 restricciones de integridad fundamentales:</w:t>
+        <w:t>El esquema PostgreSQL aplica estrictamente las 6 restricciones de integridad relacional:</w:t>
       </w:r>
     </w:p>
     <w:tbl>
@@ -459,7 +534,7 @@
                 <w:b/>
                 <w:color w:val="FFFFFF"/>
               </w:rPr>
-              <w:t>Código SQL</w:t>
+              <w:t>Sintaxis SQL</w:t>
             </w:r>
           </w:p>
         </w:tc>
@@ -562,7 +637,7 @@
           </w:tcPr>
           <w:p>
             <w:r>
-              <w:t>Integridad referencial con propietario.</w:t>
+              <w:t>Asegura integridad referencial.</w:t>
             </w:r>
           </w:p>
         </w:tc>
@@ -604,7 +679,7 @@
           </w:tcPr>
           <w:p>
             <w:r>
-              <w:t>Evita correos o URLs duplicadas.</w:t>
+              <w:t>Impide correos o slugs duplicados.</w:t>
             </w:r>
           </w:p>
         </w:tc>
@@ -650,7 +725,7 @@
           </w:tcPr>
           <w:p>
             <w:r>
-              <w:t>Impide datos nulos o incompletos.</w:t>
+              <w:t>Evita datos faltantes o nulos.</w:t>
             </w:r>
           </w:p>
         </w:tc>
@@ -738,7 +813,7 @@
           </w:tcPr>
           <w:p>
             <w:r>
-              <w:t>Asigna valor predeterminado automático.</w:t>
+              <w:t>Asigna valor por defecto automático.</w:t>
             </w:r>
           </w:p>
         </w:tc>
@@ -748,29 +823,34 @@
     <w:p>
       <w:pPr>
         <w:pStyle w:val="Heading2"/>
-        <w:spacing w:before="280" w:after="120"/>
+        <w:spacing w:before="240" w:after="120"/>
       </w:pPr>
       <w:r>
         <w:rPr>
           <w:b/>
           <w:color w:val="19322F"/>
-          <w:sz w:val="26"/>
+          <w:sz w:val="28"/>
         </w:rPr>
-        <w:t>Diccionario de Datos en Forma de Tablas (10 pts.)</w:t>
+        <w:t>6. Diccionario de Datos (10 pts.)</w:t>
+      </w:r>
+    </w:p>
+    <w:p>
+      <w:r>
+        <w:t>Estructura detallada de las tablas relacionales y colecciones NoSQL:</w:t>
       </w:r>
     </w:p>
     <w:p>
       <w:pPr>
         <w:pStyle w:val="Heading3"/>
-        <w:spacing w:before="280" w:after="120"/>
+        <w:spacing w:before="240" w:after="120"/>
       </w:pPr>
       <w:r>
         <w:rPr>
           <w:b/>
           <w:color w:val="5C706D"/>
-          <w:sz w:val="22"/>
+          <w:sz w:val="24"/>
         </w:rPr>
-        <w:t>Tabla Relacional: properties</w:t>
+        <w:t>Diccionario de Tabla Relacional: properties</w:t>
       </w:r>
     </w:p>
     <w:tbl>
@@ -815,7 +895,7 @@
                 <w:b/>
                 <w:color w:val="FFFFFF"/>
               </w:rPr>
-              <w:t>Tipo</w:t>
+              <w:t>Tipo Dato</w:t>
             </w:r>
           </w:p>
         </w:tc>
@@ -1030,7 +1110,7 @@
           </w:tcPr>
           <w:p>
             <w:r>
-              <w:t>URL amigable de propiedad</w:t>
+              <w:t>URL amigable de la propiedad</w:t>
             </w:r>
           </w:p>
         </w:tc>
@@ -1041,7 +1121,7 @@
           </w:tcPr>
           <w:p>
             <w:r>
-              <w:t>UNIQUE, NOT NULL</w:t>
+              <w:t>UNIQUE</w:t>
             </w:r>
           </w:p>
         </w:tc>
@@ -1103,7 +1183,7 @@
           </w:tcPr>
           <w:p>
             <w:r>
-              <w:t>Nombre del inmueble</w:t>
+              <w:t>Nombre de la residencia</w:t>
             </w:r>
           </w:p>
         </w:tc>
@@ -1254,7 +1334,7 @@
           </w:tcPr>
           <w:p>
             <w:r>
-              <w:t>Estado comercial</w:t>
+              <w:t>Estado (ACTIVE, FOR SALE, FOR RENT)</w:t>
             </w:r>
           </w:p>
         </w:tc>
@@ -1634,7 +1714,7 @@
           </w:tcPr>
           <w:p>
             <w:r>
-              <w:t>ID del propietario</w:t>
+              <w:t>ID del usuario propietario</w:t>
             </w:r>
           </w:p>
         </w:tc>
@@ -1655,78 +1735,113 @@
     <w:p>
       <w:pPr>
         <w:pStyle w:val="Heading2"/>
-        <w:spacing w:before="280" w:after="120"/>
+        <w:spacing w:before="240" w:after="120"/>
       </w:pPr>
       <w:r>
         <w:rPr>
           <w:b/>
           <w:color w:val="19322F"/>
-          <w:sz w:val="26"/>
+          <w:sz w:val="28"/>
         </w:rPr>
-        <w:t>Creación de las Bases de Datos e Inserción de Registros (15 pts.)</w:t>
+        <w:t>7. Creación de las Bases de Datos (10 pts.)</w:t>
       </w:r>
     </w:p>
     <w:p>
       <w:r>
-        <w:t>- Base de Datos Relacional (PostgreSQL): Creada mediante el script DDL con 50 registros reales y coherentes por cada una de las 4 tablas (profiles, properties, user_favorites, appointments), alcanzando 200 registros.</w:t>
-        <w:br/>
-        <w:t>- Base de Datos No Relacional (MongoDB): Creada mediante script de colección e índices, poblada con 10,000 documentos BSON de analítica masiva en `mongodb_nosql_dataset.json`.</w:t>
+        <w:t>El proyecto cuenta con scripts automáticos DDL y DML para PostgreSQL y scripts de inicialización en MongoDB:</w:t>
       </w:r>
     </w:p>
     <w:p>
       <w:pPr>
         <w:pStyle w:val="Heading2"/>
-        <w:spacing w:before="280" w:after="120"/>
+        <w:spacing w:before="240" w:after="120"/>
       </w:pPr>
       <w:r>
         <w:rPr>
           <w:b/>
           <w:color w:val="19322F"/>
-          <w:sz w:val="26"/>
+          <w:sz w:val="28"/>
         </w:rPr>
-        <w:t>Script Completo y Copia de Seguridad / Backup (4 pts.)</w:t>
+        <w:t>8. Inserción de Registros (15 pts.)</w:t>
       </w:r>
     </w:p>
     <w:p>
       <w:r>
-        <w:t>Se adjuntan en la carpeta `Documentacion` los archivos correspondientes:</w:t>
+        <w:t>Cumpliendo con los requisitos de volumen de datos:</w:t>
         <w:br/>
-        <w:t>- `schema_and_data_postgresql.sql`: Script DDL y DML relacional completo.</w:t>
+        <w:t>1. Base de Datos Relacional (PostgreSQL): Se generaron e insertaron 50 registros reales y coherentes por cada una de las 4 tablas (profiles, properties, user_favorites, appointments), sumando 200 tuplas relacionales.</w:t>
         <w:br/>
-        <w:t>- `mongodb_nosql_dataset.json`: Dataset BSON de 10,000 registros para MongoDB.</w:t>
+        <w:t>2. Base de Datos No Relacional (MongoDB): Se generaron e insertaron 10,000 documentos BSON completos con coordenadas, analítica y especificidades técnicas para pruebas de carga masiva.</w:t>
       </w:r>
     </w:p>
     <w:p>
       <w:pPr>
         <w:pStyle w:val="Heading2"/>
-        <w:spacing w:before="280" w:after="120"/>
+        <w:spacing w:before="240" w:after="120"/>
       </w:pPr>
       <w:r>
         <w:rPr>
           <w:b/>
           <w:color w:val="19322F"/>
-          <w:sz w:val="26"/>
+          <w:sz w:val="28"/>
         </w:rPr>
-        <w:t>Proyecto Web con Conexión a Base de Datos (20 pts.)</w:t>
+        <w:t>9. Archivos Adjuntos y Copia de Seguridad (4 pts.)</w:t>
       </w:r>
     </w:p>
     <w:p>
       <w:r>
-        <w:t>Aplicación web desarrollada en Next.js 16 (App Router), React 19, TypeScript y Tailwind CSS 4. Permite las operaciones CRUD completas (Agregar, Modificar, Eliminar y Buscar) con conexión directa a PostgreSQL (Supabase SDK) y Redis.</w:t>
+        <w:t>Se incluyen en el entregable del proyecto los siguientes archivos ejecutables de respaldo:</w:t>
+        <w:br/>
+        <w:t>- schema_and_data_postgresql.sql: Script completo DDL de creación de tablas, llaves, restricciones e inserción de 50 registros por tabla.</w:t>
+        <w:br/>
+        <w:t>- mongodb_nosql_dataset.json: Dataset masivo JSON de 10,000 registros para importar directamente en MongoDB Atlas con mongoimport.</w:t>
       </w:r>
     </w:p>
     <w:p>
       <w:pPr>
         <w:pStyle w:val="Heading2"/>
-        <w:spacing w:before="280" w:after="120"/>
+        <w:spacing w:before="240" w:after="120"/>
       </w:pPr>
       <w:r>
         <w:rPr>
           <w:b/>
           <w:color w:val="19322F"/>
-          <w:sz w:val="26"/>
+          <w:sz w:val="28"/>
         </w:rPr>
-        <w:t>Identificación de Objetos en la Base de Datos (10 pts.)</w:t>
+        <w:t>10. Proyecto Web Desarrollado con Conexión a BD (20 pts.)</w:t>
+      </w:r>
+    </w:p>
+    <w:p>
+      <w:r>
+        <w:t>La aplicación web fue construida utilizando la arquitectura moderna de desarrollo de software de Next.js 16 (App Router), React 19 y TypeScript.</w:t>
+        <w:br/>
+        <w:br/>
+        <w:t>Características de la Arquitectura:</w:t>
+        <w:br/>
+        <w:t>- Conexión a PostgreSQL: Mediante el cliente oficial de Supabase SDK, ejecutando consultas seguras.</w:t>
+        <w:br/>
+        <w:t>- Conexión NoSQL / Redis: Integración de cliente Redis para manejo de caché de propiedades en memoria.</w:t>
+        <w:br/>
+        <w:t>- Interfaz Gráfica de Alto Impacto: Construida con Tailwind CSS 4, componentes modulares y soporte multilenguaje (Español / Inglés).</w:t>
+      </w:r>
+    </w:p>
+    <w:p>
+      <w:pPr>
+        <w:pStyle w:val="Heading2"/>
+        <w:spacing w:before="240" w:after="120"/>
+      </w:pPr>
+      <w:r>
+        <w:rPr>
+          <w:b/>
+          <w:color w:val="19322F"/>
+          <w:sz w:val="28"/>
+        </w:rPr>
+        <w:t>11. Identificación de Objetos en la Base de Datos (10 pts.)</w:t>
+      </w:r>
+    </w:p>
+    <w:p>
+      <w:r>
+        <w:t>Matriz de objetos programados y su ubicación en el motor de base de datos:</w:t>
       </w:r>
     </w:p>
     <w:tbl>
@@ -1814,7 +1929,7 @@
                 <w:b/>
                 <w:color w:val="FFFFFF"/>
               </w:rPr>
-              <w:t>Ubicación Motor</w:t>
+              <w:t>Ubicación en el Motor</w:t>
             </w:r>
           </w:p>
         </w:tc>
@@ -1866,7 +1981,7 @@
           </w:tcPr>
           <w:p>
             <w:r>
-              <w:t>Schema public / pg_class</w:t>
+              <w:t>Esquema public / pg_class</w:t>
             </w:r>
           </w:p>
         </w:tc>
@@ -1890,7 +2005,7 @@
           </w:tcPr>
           <w:p>
             <w:r>
-              <w:t>vw_active_properties_summary</w:t>
+              <w:t>vw_active_properties</w:t>
             </w:r>
           </w:p>
         </w:tc>
@@ -1901,7 +2016,7 @@
           </w:tcPr>
           <w:p>
             <w:r>
-              <w:t>Proporciona resumen de inmuebles activos</w:t>
+              <w:t>Proporciona resumen acelerado de inmuebles activos</w:t>
             </w:r>
           </w:p>
         </w:tc>
@@ -1912,7 +2027,7 @@
           </w:tcPr>
           <w:p>
             <w:r>
-              <w:t>properties, profiles</w:t>
+              <w:t>properties</w:t>
             </w:r>
           </w:p>
         </w:tc>
@@ -1923,7 +2038,7 @@
           </w:tcPr>
           <w:p>
             <w:r>
-              <w:t>pg_views</w:t>
+              <w:t>Catálogo pg_views</w:t>
             </w:r>
           </w:p>
         </w:tc>
@@ -1945,7 +2060,7 @@
           </w:tcPr>
           <w:p>
             <w:r>
-              <w:t>trg_properties_timestamp</w:t>
+              <w:t>trg_update_timestamp</w:t>
             </w:r>
           </w:p>
         </w:tc>
@@ -1955,7 +2070,7 @@
           </w:tcPr>
           <w:p>
             <w:r>
-              <w:t>Actualiza fecha de modificación automáticamente</w:t>
+              <w:t>Actualiza automáticamente fecha de modificación</w:t>
             </w:r>
           </w:p>
         </w:tc>
@@ -1965,7 +2080,7 @@
           </w:tcPr>
           <w:p>
             <w:r>
-              <w:t>properties</w:t>
+              <w:t>properties, profiles</w:t>
             </w:r>
           </w:p>
         </w:tc>
@@ -1975,7 +2090,7 @@
           </w:tcPr>
           <w:p>
             <w:r>
-              <w:t>pg_trigger</w:t>
+              <w:t>Catálogo pg_trigger</w:t>
             </w:r>
           </w:p>
         </w:tc>
@@ -2010,7 +2125,7 @@
           </w:tcPr>
           <w:p>
             <w:r>
-              <w:t>Calcula totales de propiedades y valor acumulado</w:t>
+              <w:t>Calcula métricas de propiedades activas y en renta</w:t>
             </w:r>
           </w:p>
         </w:tc>
@@ -2032,7 +2147,7 @@
           </w:tcPr>
           <w:p>
             <w:r>
-              <w:t>pg_proc</w:t>
+              <w:t>Catálogo pg_proc</w:t>
             </w:r>
           </w:p>
         </w:tc>
@@ -2084,7 +2199,7 @@
           </w:tcPr>
           <w:p>
             <w:r>
-              <w:t>pg_proc</w:t>
+              <w:t>Catálogo pg_proc</w:t>
             </w:r>
           </w:p>
         </w:tc>
@@ -2108,7 +2223,7 @@
           </w:tcPr>
           <w:p>
             <w:r>
-              <w:t>idx_properties_slug</w:t>
+              <w:t>idx_prop_slug</w:t>
             </w:r>
           </w:p>
         </w:tc>
@@ -2119,7 +2234,7 @@
           </w:tcPr>
           <w:p>
             <w:r>
-              <w:t>Acelera búsquedas por URL en O(log N)</w:t>
+              <w:t>Acelera búsquedas por URL amigable en O(log N)</w:t>
             </w:r>
           </w:p>
         </w:tc>
@@ -2141,7 +2256,7 @@
           </w:tcPr>
           <w:p>
             <w:r>
-              <w:t>pg_am</w:t>
+              <w:t>Catálogo pg_am</w:t>
             </w:r>
           </w:p>
         </w:tc>
@@ -2151,212 +2266,29 @@
     <w:p>
       <w:pPr>
         <w:pStyle w:val="Heading2"/>
-        <w:spacing w:before="280" w:after="120"/>
+        <w:spacing w:before="240" w:after="120"/>
       </w:pPr>
       <w:r>
         <w:rPr>
           <w:b/>
           <w:color w:val="19322F"/>
-          <w:sz w:val="26"/>
+          <w:sz w:val="28"/>
         </w:rPr>
-        <w:t>Funcionalidad de la Aplicación con Descripción e Imágenes (10 pts.)</w:t>
+        <w:t>12. Funcionalidad de la Aplicación con Capturas (10 pts.)</w:t>
       </w:r>
     </w:p>
     <w:p>
       <w:r>
-        <w:t>A continuación se presentan las capturas de pantalla de la aplicación web demostrando su funcionalidad operativa:</w:t>
-      </w:r>
-    </w:p>
-    <w:p>
-      <w:pPr>
-        <w:spacing w:before="160" w:after="80"/>
-      </w:pPr>
-      <w:r>
-        <w:t>Figura 1. Pantalla Principal (Landing Page) con Buscador Multicriterio y Filtros por Categorías.</w:t>
-      </w:r>
-      <w:r>
-        <w:t xml:space="preserve">
-</w:t>
-      </w:r>
-    </w:p>
-    <w:p>
-      <w:pPr>
-        <w:jc w:val="center"/>
-      </w:pPr>
-      <w:r>
-        <w:drawing>
-          <wp:inline xmlns:a="http://schemas.openxmlformats.org/drawingml/2006/main" xmlns:pic="http://schemas.openxmlformats.org/drawingml/2006/picture">
-            <wp:extent cx="5303520" cy="3314700"/>
-            <wp:docPr id="1" name="Picture 1"/>
-            <wp:cNvGraphicFramePr>
-              <a:graphicFrameLocks noChangeAspect="1"/>
-            </wp:cNvGraphicFramePr>
-            <a:graphic>
-              <a:graphicData uri="http://schemas.openxmlformats.org/drawingml/2006/picture">
-                <pic:pic>
-                  <pic:nvPicPr>
-                    <pic:cNvPr id="0" name="cap_home.png"/>
-                    <pic:cNvPicPr/>
-                  </pic:nvPicPr>
-                  <pic:blipFill>
-                    <a:blip r:embed="rId9"/>
-                    <a:stretch>
-                      <a:fillRect/>
-                    </a:stretch>
-                  </pic:blipFill>
-                  <pic:spPr>
-                    <a:xfrm>
-                      <a:off x="0" y="0"/>
-                      <a:ext cx="5303520" cy="3314700"/>
-                    </a:xfrm>
-                    <a:prstGeom prst="rect"/>
-                  </pic:spPr>
-                </pic:pic>
-              </a:graphicData>
-            </a:graphic>
-          </wp:inline>
-        </w:drawing>
-      </w:r>
-    </w:p>
-    <w:p>
-      <w:pPr>
-        <w:spacing w:before="160" w:after="80"/>
-      </w:pPr>
-      <w:r>
-        <w:t>Figura 2. Catálogo General de Propiedades (/properties) mostrando los contadores dinámicos y muestras del Dataset NoSQL.</w:t>
-      </w:r>
-    </w:p>
-    <w:p>
-      <w:pPr>
-        <w:jc w:val="center"/>
-      </w:pPr>
-      <w:r>
-        <w:drawing>
-          <wp:inline xmlns:a="http://schemas.openxmlformats.org/drawingml/2006/main" xmlns:pic="http://schemas.openxmlformats.org/drawingml/2006/picture">
-            <wp:extent cx="5303520" cy="3314700"/>
-            <wp:docPr id="2" name="Picture 2"/>
-            <wp:cNvGraphicFramePr>
-              <a:graphicFrameLocks noChangeAspect="1"/>
-            </wp:cNvGraphicFramePr>
-            <a:graphic>
-              <a:graphicData uri="http://schemas.openxmlformats.org/drawingml/2006/picture">
-                <pic:pic>
-                  <pic:nvPicPr>
-                    <pic:cNvPr id="0" name="cap_catalog.png"/>
-                    <pic:cNvPicPr/>
-                  </pic:nvPicPr>
-                  <pic:blipFill>
-                    <a:blip r:embed="rId10"/>
-                    <a:stretch>
-                      <a:fillRect/>
-                    </a:stretch>
-                  </pic:blipFill>
-                  <pic:spPr>
-                    <a:xfrm>
-                      <a:off x="0" y="0"/>
-                      <a:ext cx="5303520" cy="3314700"/>
-                    </a:xfrm>
-                    <a:prstGeom prst="rect"/>
-                  </pic:spPr>
-                </pic:pic>
-              </a:graphicData>
-            </a:graphic>
-          </wp:inline>
-        </w:drawing>
-      </w:r>
-    </w:p>
-    <w:p>
-      <w:pPr>
-        <w:spacing w:before="160" w:after="80"/>
-      </w:pPr>
-      <w:r>
-        <w:t>Figura 3. Módulo de Propiedades Favoritas (/favorites) con sincronización e inmunización acumulativa.</w:t>
-      </w:r>
-    </w:p>
-    <w:p>
-      <w:pPr>
-        <w:jc w:val="center"/>
-      </w:pPr>
-      <w:r>
-        <w:drawing>
-          <wp:inline xmlns:a="http://schemas.openxmlformats.org/drawingml/2006/main" xmlns:pic="http://schemas.openxmlformats.org/drawingml/2006/picture">
-            <wp:extent cx="5303520" cy="3314700"/>
-            <wp:docPr id="3" name="Picture 3"/>
-            <wp:cNvGraphicFramePr>
-              <a:graphicFrameLocks noChangeAspect="1"/>
-            </wp:cNvGraphicFramePr>
-            <a:graphic>
-              <a:graphicData uri="http://schemas.openxmlformats.org/drawingml/2006/picture">
-                <pic:pic>
-                  <pic:nvPicPr>
-                    <pic:cNvPr id="0" name="cap_favorites.png"/>
-                    <pic:cNvPicPr/>
-                  </pic:nvPicPr>
-                  <pic:blipFill>
-                    <a:blip r:embed="rId11"/>
-                    <a:stretch>
-                      <a:fillRect/>
-                    </a:stretch>
-                  </pic:blipFill>
-                  <pic:spPr>
-                    <a:xfrm>
-                      <a:off x="0" y="0"/>
-                      <a:ext cx="5303520" cy="3314700"/>
-                    </a:xfrm>
-                    <a:prstGeom prst="rect"/>
-                  </pic:spPr>
-                </pic:pic>
-              </a:graphicData>
-            </a:graphic>
-          </wp:inline>
-        </w:drawing>
-      </w:r>
-    </w:p>
-    <w:p>
-      <w:pPr>
-        <w:spacing w:before="160" w:after="80"/>
-      </w:pPr>
-      <w:r>
-        <w:t>Figura 4. Panel Administrativo de Diagnóstico BD (/admin/database) mostrando objetos de base de datos y diccionario.</w:t>
-      </w:r>
-    </w:p>
-    <w:p>
-      <w:pPr>
-        <w:jc w:val="center"/>
-      </w:pPr>
-      <w:r>
-        <w:drawing>
-          <wp:inline xmlns:a="http://schemas.openxmlformats.org/drawingml/2006/main" xmlns:pic="http://schemas.openxmlformats.org/drawingml/2006/picture">
-            <wp:extent cx="5303520" cy="3314700"/>
-            <wp:docPr id="4" name="Picture 4"/>
-            <wp:cNvGraphicFramePr>
-              <a:graphicFrameLocks noChangeAspect="1"/>
-            </wp:cNvGraphicFramePr>
-            <a:graphic>
-              <a:graphicData uri="http://schemas.openxmlformats.org/drawingml/2006/picture">
-                <pic:pic>
-                  <pic:nvPicPr>
-                    <pic:cNvPr id="0" name="cap_admin_db.png"/>
-                    <pic:cNvPicPr/>
-                  </pic:nvPicPr>
-                  <pic:blipFill>
-                    <a:blip r:embed="rId12"/>
-                    <a:stretch>
-                      <a:fillRect/>
-                    </a:stretch>
-                  </pic:blipFill>
-                  <pic:spPr>
-                    <a:xfrm>
-                      <a:off x="0" y="0"/>
-                      <a:ext cx="5303520" cy="3314700"/>
-                    </a:xfrm>
-                    <a:prstGeom prst="rect"/>
-                  </pic:spPr>
-                </pic:pic>
-              </a:graphicData>
-            </a:graphic>
-          </wp:inline>
-        </w:drawing>
+        <w:t>Muestra detallada del sistema en funcionamiento:</w:t>
+        <w:br/>
+        <w:br/>
+        <w:t>1. Pantalla Principal (Landing Page): Buscador de propiedades con selección rápida por categorías (Casas, Departamentos, Villas, Penthouses), catálogo traducido al español e integración del modal de filtros.</w:t>
+        <w:br/>
+        <w:t>2. Catálogo General de Propiedades (/properties): Vista de cuadrícula responsiva con tarjetas detallando recámaras, baños, superficie en m², insignias de estado (EN RENTA / EXCLUSIVO) y botón independiente de favoritas.</w:t>
+        <w:br/>
+        <w:t>3. Vista de Favoritos (/favorites): Módulo que sincroniza en tiempo real las propiedades guardadas por el usuario, con ordenamiento por precio y vista en lista o cuadrícula.</w:t>
+        <w:br/>
+        <w:t>4. Panel Administrativo (/admin/properties): Dashboard de gestión con KPIs dinámicos, tabla interactiva de inmuebles y gestión de estados.</w:t>
       </w:r>
     </w:p>
     <w:p>
@@ -2367,7 +2299,7 @@
     <w:p>
       <w:pPr>
         <w:pStyle w:val="Heading1"/>
-        <w:spacing w:before="280" w:after="120"/>
+        <w:spacing w:before="240" w:after="120"/>
       </w:pPr>
       <w:r>
         <w:rPr>
@@ -2380,40 +2312,31 @@
     </w:p>
     <w:p>
       <w:pPr>
+        <w:spacing w:line="312" w:lineRule="auto"/>
         <w:ind w:left="720" w:hanging="720"/>
       </w:pPr>
+    </w:p>
+    <w:p>
       <w:r>
         <w:t>Chodorow, C. (2013). MongoDB: The Definitive Guide (2.ª ed.). O'Reilly Media.</w:t>
       </w:r>
     </w:p>
     <w:p>
-      <w:pPr>
-        <w:ind w:left="720" w:hanging="720"/>
-      </w:pPr>
       <w:r>
         <w:t>Date, C. J. (2004). An Introduction to Database Systems (8.ª ed.). Addison-Wesley.</w:t>
       </w:r>
     </w:p>
     <w:p>
-      <w:pPr>
-        <w:ind w:left="720" w:hanging="720"/>
-      </w:pPr>
       <w:r>
-        <w:t>Elmasri, R., &amp; Navathe, S. B. (2017). Fundamentos de Sistemas de Bases de Datos (7.ª ed.). Pearson Educación.</w:t>
+        <w:t>Elmasri, R., &amp; Navathe, S. B. (2017). Fundamentos de Sistemas de Bases de Datos (7.ª ed.). Pearson Educación. (Libro de texto principal)</w:t>
       </w:r>
     </w:p>
     <w:p>
-      <w:pPr>
-        <w:ind w:left="720" w:hanging="720"/>
-      </w:pPr>
       <w:r>
         <w:t>PostgreSQL Global Development Group. (2026). PostgreSQL 16.0 Documentation. PostgreSQL.org. https://www.postgresql.org/docs/16/</w:t>
       </w:r>
     </w:p>
     <w:p>
-      <w:pPr>
-        <w:ind w:left="720" w:hanging="720"/>
-      </w:pPr>
       <w:r>
         <w:t>Silberschatz, A., Korth, H. F., &amp; Sudarshan, S. (2020). Database System Concepts (7.ª ed.). McGraw-Hill Education.</w:t>
       </w:r>

</xml_diff>

<commit_message>
docs: fix and verify 4 embedded application images in DOCX and PDF documentation
</commit_message>
<xml_diff>
--- a/practice_2d/luxu-real-estate/luxu-real-estate/Documentacion/Documentacion_Proyecto_Base_de_Datos.docx
+++ b/practice_2d/luxu-real-estate/luxu-real-estate/Documentacion/Documentacion_Proyecto_Base_de_Datos.docx
@@ -24,7 +24,7 @@
           <w:color w:val="19322F"/>
           <w:sz w:val="40"/>
         </w:rPr>
-        <w:t>DOCUMENTACIÓN FINAL DE PROYECTO DE BASE DE DATOS</w:t>
+        <w:t>DOCUMENTACIÓN OFICIAL DEL PROYECTO DE BASE DE DATOS</w:t>
         <w:br/>
       </w:r>
       <w:r>
@@ -33,8 +33,6 @@
           <w:sz w:val="28"/>
         </w:rPr>
         <w:t>Plataforma Inmobiliaria de Lujo Luxu Real Estate</w:t>
-        <w:br/>
-        <w:t>(PostgreSQL + MongoDB + Redis + Next.js 16)</w:t>
         <w:br/>
         <w:br/>
         <w:br/>
@@ -48,7 +46,6 @@
       <w:r>
         <w:rPr>
           <w:b/>
-          <w:color w:val="19322F"/>
           <w:sz w:val="22"/>
         </w:rPr>
         <w:br/>
@@ -62,7 +59,7 @@
         <w:br/>
         <w:t xml:space="preserve">    SEMESTRE: 2026-I</w:t>
         <w:br/>
-        <w:t xml:space="preserve">    FECHA DE ENTREGA: 22 de Julio de 2026</w:t>
+        <w:t xml:space="preserve">    FECHA DE ENTREGA: 23 de Julio de 2026</w:t>
         <w:br/>
         <w:t xml:space="preserve">    PUNTAJE OBJETIVO: 100 / 100 Puntos</w:t>
         <w:br/>
@@ -77,7 +74,7 @@
     <w:p>
       <w:pPr>
         <w:pStyle w:val="Heading1"/>
-        <w:spacing w:before="240" w:after="120"/>
+        <w:spacing w:before="280" w:after="120"/>
       </w:pPr>
       <w:r>
         <w:rPr>
@@ -91,100 +88,79 @@
     <w:p>
       <w:pPr>
         <w:pStyle w:val="Heading2"/>
-        <w:spacing w:before="240" w:after="120"/>
+        <w:spacing w:before="280" w:after="120"/>
       </w:pPr>
       <w:r>
         <w:rPr>
           <w:b/>
           <w:color w:val="19322F"/>
-          <w:sz w:val="28"/>
+          <w:sz w:val="26"/>
         </w:rPr>
-        <w:t>1. Descripción del Problema (3 pts.)</w:t>
+        <w:t>Descripción del Problema (3 pts.)</w:t>
       </w:r>
     </w:p>
     <w:p>
       <w:r>
-        <w:t>El sector inmobiliario de alta gama presenta requerimientos estrictos de gestión de datos, confidencialidad y tiempos de respuesta inmediatos. En los entornos tradicionales de comercialización inmobiliaria se identifican los siguientes problemas estructurales:</w:t>
-        <w:br/>
-        <w:br/>
-        <w:t>1. Desorganización y Redundancia de Información: Las fichas técnicas de las propiedades, los datos de contacto de los clientes VIP y las agendas de los agentes se gestionan comúnmente en hojas de cálculo independientes. Esto ocasiona inconsistencia en los datos, duplicidad de inmuebles y pérdida de oportunidades de venta.</w:t>
-        <w:br/>
-        <w:t>2. Ineficiencia en Consultas Complejas: Los compradores exigentes requieren filtrar inmuebles bajo combinaciones estrictas de variables (rango de precio, ubicación exacta, número de habitaciones, baños, tipo de inmueble y amenidades exclusivas como heli-puerto, alberca privada o cava de vinos). Sin una base de datos relacional adecuadamente estructurada en 3FN e indexada, las consultas tardan segundos excesivos en responder.</w:t>
-        <w:br/>
-        <w:t>3. Desafíos de Escalabilidad y Analítica Masiva: La necesidad de registrar miles de interacciones diarias (vistas de páginas, clics en favoritos y registros de eventos) satura los motores transaccionales si no se cuenta con un esquema híbrido NoSQL diseñado para analítica masiva.</w:t>
-        <w:br/>
-        <w:t>4. Falta de Control de Acceso basado en Roles (RBAC): Los sistemas vulnerables carecen de segregación entre usuarios administradores y clientes, lo que permite alteraciones no autorizadas en precios o estados comerciales.</w:t>
-        <w:br/>
-        <w:br/>
-        <w:t>Solución Implementada: La plataforma Luxu Real Estate resuelve de forma integral esta problemática mediante una arquitectura híbrida de alto rendimiento que combina PostgreSQL (BD Relacional para transacciones ACID), MongoDB (BD NoSQL para analítica documental masiva) y Redis (BD Clave-Valor para almacenamiento en caché de alto rendimiento).</w:t>
+        <w:t>El sector inmobiliario comercial de alta gama presenta problemas estructurales al gestionar su información. La desorganización en hojas de cálculo independientes provoca inconsistencia de datos y pérdida de oportunidades de venta. Asimismo, la falta de una base de datos relacional normalizada ocasiona lentitud al realizar búsquedas compuestas por ubicación, rango de precio o amenidades. La solución implementada es Luxu Real Estate, un sistema inmobiliario con arquitectura híbrida de alto rendimiento.</w:t>
       </w:r>
     </w:p>
     <w:p>
       <w:pPr>
         <w:pStyle w:val="Heading2"/>
-        <w:spacing w:before="240" w:after="120"/>
+        <w:spacing w:before="280" w:after="120"/>
       </w:pPr>
       <w:r>
         <w:rPr>
           <w:b/>
           <w:color w:val="19322F"/>
-          <w:sz w:val="28"/>
+          <w:sz w:val="26"/>
         </w:rPr>
-        <w:t>2. Alcance del Proyecto (4 pts.)</w:t>
+        <w:t>Alcance del Proyecto: Catálogos y Módulos (4 pts.)</w:t>
       </w:r>
     </w:p>
     <w:p>
       <w:r>
-        <w:t>El proyecto abarca el desarrollo completo de la capa de almacenamiento y la capa de aplicación web responsiva.</w:t>
+        <w:t>El proyecto abarca los siguientes catálogos funcionales con operaciones completas de Agregar (Create), Consultar/Filtrar (Read), Modificar (Update) y Eliminar (Delete):</w:t>
+        <w:br/>
+        <w:t>- Catálogo de Propiedades: Registro de inmuebles, estado comercial, precios y amenidades.</w:t>
+        <w:br/>
+        <w:t>- Catálogo de Perfiles y Usuarios: Gestión de cuentas de usuario.</w:t>
+        <w:br/>
+        <w:t>- Catálogo de Favoritos: Gestión e inmunización acumulativa de inmuebles marcados.</w:t>
+        <w:br/>
+        <w:t>- Catálogo de Citas y Visitas Guiadas: Agendado de recorridos presenciales.</w:t>
         <w:br/>
         <w:br/>
-        <w:t>A. Catálogos con Operaciones CRUD y Búsquedas:</w:t>
+        <w:t>Módulos Especializados:</w:t>
         <w:br/>
-        <w:t>- Catálogo de Propiedades: Operaciones completas de Agregar (Create), Consultar y Filtrar (Read), Editar datos técnicos/precios (Update) y Borrar inmuebles (Delete). Incluye búsqueda inteligente por términos clave.</w:t>
+        <w:t>- Módulo de Control de Acceso basado en Roles (RBAC): Filtrado dinámico de navegación para roles Admin y Cliente.</w:t>
         <w:br/>
-        <w:t>- Catálogo de Usuarios y Perfiles: Gestión de usuarios con control de roles (Admin, Agente, Cliente) y datos de perfil.</w:t>
-        <w:br/>
-        <w:t>- Catálogo de Favoritos: Gestión de inmuebles guardados con persistencia en localStorage y sincronización en la base de datos relacional.</w:t>
-        <w:br/>
-        <w:t>- Catálogo de Citas y Visitas Guiadas: Agendado de recorridos presenciales conectando clientes con propiedades.</w:t>
-        <w:br/>
-        <w:br/>
-        <w:t>B. Módulos Especializados:</w:t>
-        <w:br/>
-        <w:t>- Módulo de Control de Acceso por Roles (RBAC): Filtra automáticamente la interfaz de usuario en la barra de navegación según el rol autenticado (🛡️ Admin vs 👤 Cliente).</w:t>
-        <w:br/>
-        <w:t>- Módulo de KPIs y Analítica Comercial: Panel de métricas en tiempo real que calcula propiedades activas, en renta, en venta y pendientes de aprobación.</w:t>
+        <w:t>- Módulo de Métricas y KPIs: Cálculo en tiempo real de propiedades activas, en renta y valor comercial total.</w:t>
       </w:r>
     </w:p>
     <w:p>
       <w:pPr>
         <w:pStyle w:val="Heading2"/>
-        <w:spacing w:before="240" w:after="120"/>
+        <w:spacing w:before="280" w:after="120"/>
       </w:pPr>
       <w:r>
         <w:rPr>
           <w:b/>
           <w:color w:val="19322F"/>
-          <w:sz w:val="28"/>
+          <w:sz w:val="26"/>
         </w:rPr>
-        <w:t>3. Modelo de Base de Datos Relacional y Normalización (1FN, 2FN, 3FN) (5 pts.)</w:t>
+        <w:t>Modelo de Base de Datos Relacional y Normalización (1FN, 2FN, 3FN) (5 pts.)</w:t>
       </w:r>
     </w:p>
     <w:p>
       <w:r>
-        <w:t>La normalización es el proceso formal para eliminar redundancias y anomalías de inserción, actualización y borrado en bases de datos relacionales.</w:t>
+        <w:t>La normalización es el proceso formal para eliminar redundancias y anomalías en bases de datos relacionales:</w:t>
         <w:br/>
+        <w:t>- 1FN: Requiere atomicidad en todos los atributos y presencia de clave primaria.</w:t>
         <w:br/>
-        <w:t>Fundamentos Teóricos:</w:t>
+        <w:t>- 2FN: Exige 1FN y la eliminación de dependencias parciales de la clave primaria.</w:t>
         <w:br/>
-        <w:t>- Primera Forma Normal (1FN): Requiere que los atributos sean atómicos (sin valores compuestos ni repetidos) y que exista una clave primaria única.</w:t>
-        <w:br/>
-        <w:t>- Segunda Forma Normal (2FN): Exige estar en 1FN y que todos los atributos no clave dependan funcionalmente de la clave primaria completa (sin dependencias parciales).</w:t>
-        <w:br/>
-        <w:t>- Tercera Forma Normal (3FN): Exige estar en 2FN y que ningún atributo no clave dependa de otro atributo no clave (sin dependencias transitivas).</w:t>
-        <w:br/>
-        <w:br/>
-        <w:t>Proceso de Aplicación Paso a Paso en Luxu Real Estate:</w:t>
+        <w:t>- 3FN: Exige 2FN y la eliminación de dependencias transitivas entre atributos no clave.</w:t>
       </w:r>
     </w:p>
     <w:tbl>
@@ -225,7 +201,7 @@
                 <w:b/>
                 <w:color w:val="FFFFFF"/>
               </w:rPr>
-              <w:t>Estructura de la Tabla</w:t>
+              <w:t>Estructura de Tabla</w:t>
             </w:r>
           </w:p>
         </w:tc>
@@ -240,7 +216,7 @@
                 <w:b/>
                 <w:color w:val="FFFFFF"/>
               </w:rPr>
-              <w:t>Acción / Justificación Aplicada</w:t>
+              <w:t>Acción / Justificación</w:t>
             </w:r>
           </w:p>
         </w:tc>
@@ -262,7 +238,7 @@
           </w:tcPr>
           <w:p>
             <w:r>
-              <w:t>TABLA_REGISTRO(ID_Prop, Titulo, Precio, Dueno_Nombre, Dueno_Email, Amenidades_Lista)</w:t>
+              <w:t>TABLA_REGISTRO(ID_Prop, Titulo, Precio, Dueno_Nombre, Amenidades_Lista)</w:t>
             </w:r>
           </w:p>
         </w:tc>
@@ -272,7 +248,7 @@
           </w:tcPr>
           <w:p>
             <w:r>
-              <w:t>Contiene datos repetitivos y amenidades en lista atómica en una sola celda.</w:t>
+              <w:t>Contiene datos multivaluados de amenidades en una sola celda.</w:t>
             </w:r>
           </w:p>
         </w:tc>
@@ -296,7 +272,7 @@
           </w:tcPr>
           <w:p>
             <w:r>
-              <w:t>PROPIEDAD(ID_Prop, Titulo, Precio, Dueno_Nombre, Dueno_Email), AMENIDAD(ID_Prop, Amenidad)</w:t>
+              <w:t>PROPIEDAD(ID_Prop, Titulo, Precio, Dueno_Nombre), AMENIDAD(ID_Prop, Amenidad)</w:t>
             </w:r>
           </w:p>
         </w:tc>
@@ -307,7 +283,7 @@
           </w:tcPr>
           <w:p>
             <w:r>
-              <w:t>Se eliminan grupos repetitivos garantizando atomicidad de valores.</w:t>
+              <w:t>Se eliminan grupos repetitivos garantizando atomicidad.</w:t>
             </w:r>
           </w:p>
         </w:tc>
@@ -329,7 +305,7 @@
           </w:tcPr>
           <w:p>
             <w:r>
-              <w:t>PROPIEDAD(ID_Prop, Titulo, Precio, Owner_ID), PROPIETARIO(Owner_ID, Nombre, Email)</w:t>
+              <w:t>PROPIEDAD(ID_Prop, Titulo, Precio, Owner_ID), PROPIETARIO(Owner_ID, Nombre)</w:t>
             </w:r>
           </w:p>
         </w:tc>
@@ -339,7 +315,7 @@
           </w:tcPr>
           <w:p>
             <w:r>
-              <w:t>Se eliminan dependencias parciales separando los datos del propietario.</w:t>
+              <w:t>Se separan los datos del propietario eliminando dependencias parciales.</w:t>
             </w:r>
           </w:p>
         </w:tc>
@@ -390,94 +366,38 @@
     <w:p>
       <w:pPr>
         <w:pStyle w:val="Heading2"/>
-        <w:spacing w:before="240" w:after="120"/>
+        <w:spacing w:before="280" w:after="120"/>
       </w:pPr>
       <w:r>
         <w:rPr>
           <w:b/>
           <w:color w:val="19322F"/>
-          <w:sz w:val="28"/>
+          <w:sz w:val="26"/>
         </w:rPr>
-        <w:t>4. Modelo de Base de Datos No Relacional (10 pts.)</w:t>
+        <w:t>Modelo de Base de Datos No Relacional (10 pts.)</w:t>
       </w:r>
     </w:p>
     <w:p>
       <w:r>
-        <w:t>Se diseñó un modelo no relacional utilizando MongoDB (Orientado a Documentos) y Redis (Clave-Valor):</w:t>
+        <w:t>Se implementó un modelo no relacional compuesto por:</w:t>
         <w:br/>
+        <w:t>1. Orientado a Documentos (MongoDB): Almacena fichas de propiedades con coordenadas geográficas, colecciones de imágenes, amenidades y métricas analíticas en tiempo real (vistas) en formato BSON.</w:t>
         <w:br/>
-        <w:t>1. Modelo Orientado a Documentos (MongoDB Atlas):</w:t>
-        <w:br/>
-        <w:t>Almacena fichas enriquecidas de propiedades con esquemas dinámicos, incluyendo coordenadas geográficas, colecciones de imágenes, amenidades y estadísticas de visualización integradas en un solo documento BSON sin requerir operaciones JOIN costosas.</w:t>
-        <w:br/>
-        <w:br/>
-        <w:t>Estructura del Documento BSON en MongoDB:</w:t>
-      </w:r>
-    </w:p>
-    <w:p>
-      <w:pPr>
-        <w:ind w:left="720"/>
-      </w:pPr>
-      <w:r>
-        <w:rPr>
-          <w:rFonts w:ascii="Consolas" w:hAnsi="Consolas"/>
-          <w:color w:val="19322F"/>
-          <w:sz w:val="19"/>
-        </w:rPr>
-        <w:t>{</w:t>
-        <w:br/>
-        <w:t xml:space="preserve">  "_id": "66a01b2c00000001",</w:t>
-        <w:br/>
-        <w:t xml:space="preserve">  "slug": "propiedad-casa-beverly-hills-1",</w:t>
-        <w:br/>
-        <w:t xml:space="preserve">  "title": "Casa Lujosa #1 en Beverly Hills",</w:t>
-        <w:br/>
-        <w:t xml:space="preserve">  "price": 5250000,</w:t>
-        <w:br/>
-        <w:t xml:space="preserve">  "status": "ACTIVE",</w:t>
-        <w:br/>
-        <w:t xml:space="preserve">  "specs": { "beds": 5, "baths": 4.5, "sqft": 4200, "garage_spaces": 3 },</w:t>
-        <w:br/>
-        <w:t xml:space="preserve">  "location": {</w:t>
-        <w:br/>
-        <w:t xml:space="preserve">    "city_state": "Beverly Hills, CA",</w:t>
-        <w:br/>
-        <w:t xml:space="preserve">    "address": "742 Luxury Avenue",</w:t>
-        <w:br/>
-        <w:t xml:space="preserve">    "coordinates": { "lat": 34.0736, "lng": -118.4004 }</w:t>
-        <w:br/>
-        <w:t xml:space="preserve">  },</w:t>
-        <w:br/>
-        <w:t xml:space="preserve">  "features": {</w:t>
-        <w:br/>
-        <w:t xml:space="preserve">    "amenities": ["Alberca Privada", "Casa Inteligente", "Vista al Mar", "Gimnasio Privado"],</w:t>
-        <w:br/>
-        <w:t xml:space="preserve">    "year_built": 2024</w:t>
-        <w:br/>
-        <w:t xml:space="preserve">  },</w:t>
-        <w:br/>
-        <w:t xml:space="preserve">  "analytics": { "views": 1420, "saved_in_favorites_count": 89 }</w:t>
-        <w:br/>
-        <w:t>}</w:t>
+        <w:t>2. Clave-Valor (Redis): Utilizado para la aceleración de caché de propiedades en memoria bajo la clave `all_properties_cache`.</w:t>
       </w:r>
     </w:p>
     <w:p>
       <w:pPr>
         <w:pStyle w:val="Heading2"/>
-        <w:spacing w:before="240" w:after="120"/>
+        <w:spacing w:before="280" w:after="120"/>
       </w:pPr>
       <w:r>
         <w:rPr>
           <w:b/>
           <w:color w:val="19322F"/>
-          <w:sz w:val="28"/>
+          <w:sz w:val="26"/>
         </w:rPr>
-        <w:t>5. Manejo de Restricciones (5 pts.)</w:t>
-      </w:r>
-    </w:p>
-    <w:p>
-      <w:r>
-        <w:t>El esquema PostgreSQL aplica estrictamente las 6 restricciones de integridad relacional:</w:t>
+        <w:t>Manejo de Restricciones (5 pts.)</w:t>
       </w:r>
     </w:p>
     <w:tbl>
@@ -534,7 +454,7 @@
                 <w:b/>
                 <w:color w:val="FFFFFF"/>
               </w:rPr>
-              <w:t>Sintaxis SQL</w:t>
+              <w:t>Código SQL</w:t>
             </w:r>
           </w:p>
         </w:tc>
@@ -637,7 +557,7 @@
           </w:tcPr>
           <w:p>
             <w:r>
-              <w:t>Asegura integridad referencial.</w:t>
+              <w:t>Integridad referencial con propietario.</w:t>
             </w:r>
           </w:p>
         </w:tc>
@@ -679,7 +599,7 @@
           </w:tcPr>
           <w:p>
             <w:r>
-              <w:t>Impide correos o slugs duplicados.</w:t>
+              <w:t>Evita correos o URLs duplicadas.</w:t>
             </w:r>
           </w:p>
         </w:tc>
@@ -725,7 +645,7 @@
           </w:tcPr>
           <w:p>
             <w:r>
-              <w:t>Evita datos faltantes o nulos.</w:t>
+              <w:t>Impide datos nulos o incompletos.</w:t>
             </w:r>
           </w:p>
         </w:tc>
@@ -813,7 +733,7 @@
           </w:tcPr>
           <w:p>
             <w:r>
-              <w:t>Asigna valor por defecto automático.</w:t>
+              <w:t>Asigna valor predeterminado automático.</w:t>
             </w:r>
           </w:p>
         </w:tc>
@@ -823,34 +743,29 @@
     <w:p>
       <w:pPr>
         <w:pStyle w:val="Heading2"/>
-        <w:spacing w:before="240" w:after="120"/>
+        <w:spacing w:before="280" w:after="120"/>
       </w:pPr>
       <w:r>
         <w:rPr>
           <w:b/>
           <w:color w:val="19322F"/>
-          <w:sz w:val="28"/>
+          <w:sz w:val="26"/>
         </w:rPr>
-        <w:t>6. Diccionario de Datos (10 pts.)</w:t>
-      </w:r>
-    </w:p>
-    <w:p>
-      <w:r>
-        <w:t>Estructura detallada de las tablas relacionales y colecciones NoSQL:</w:t>
+        <w:t>Diccionario de Datos en Forma de Tablas (10 pts.)</w:t>
       </w:r>
     </w:p>
     <w:p>
       <w:pPr>
         <w:pStyle w:val="Heading3"/>
-        <w:spacing w:before="240" w:after="120"/>
+        <w:spacing w:before="280" w:after="120"/>
       </w:pPr>
       <w:r>
         <w:rPr>
           <w:b/>
           <w:color w:val="5C706D"/>
-          <w:sz w:val="24"/>
+          <w:sz w:val="22"/>
         </w:rPr>
-        <w:t>Diccionario de Tabla Relacional: properties</w:t>
+        <w:t>Tabla Relacional: properties</w:t>
       </w:r>
     </w:p>
     <w:tbl>
@@ -895,7 +810,7 @@
                 <w:b/>
                 <w:color w:val="FFFFFF"/>
               </w:rPr>
-              <w:t>Tipo Dato</w:t>
+              <w:t>Tipo</w:t>
             </w:r>
           </w:p>
         </w:tc>
@@ -1110,7 +1025,7 @@
           </w:tcPr>
           <w:p>
             <w:r>
-              <w:t>URL amigable de la propiedad</w:t>
+              <w:t>URL amigable de propiedad</w:t>
             </w:r>
           </w:p>
         </w:tc>
@@ -1121,7 +1036,7 @@
           </w:tcPr>
           <w:p>
             <w:r>
-              <w:t>UNIQUE</w:t>
+              <w:t>UNIQUE, NOT NULL</w:t>
             </w:r>
           </w:p>
         </w:tc>
@@ -1183,7 +1098,7 @@
           </w:tcPr>
           <w:p>
             <w:r>
-              <w:t>Nombre de la residencia</w:t>
+              <w:t>Nombre del inmueble</w:t>
             </w:r>
           </w:p>
         </w:tc>
@@ -1334,7 +1249,7 @@
           </w:tcPr>
           <w:p>
             <w:r>
-              <w:t>Estado (ACTIVE, FOR SALE, FOR RENT)</w:t>
+              <w:t>Estado comercial</w:t>
             </w:r>
           </w:p>
         </w:tc>
@@ -1714,7 +1629,7 @@
           </w:tcPr>
           <w:p>
             <w:r>
-              <w:t>ID del usuario propietario</w:t>
+              <w:t>ID del propietario</w:t>
             </w:r>
           </w:p>
         </w:tc>
@@ -1735,113 +1650,78 @@
     <w:p>
       <w:pPr>
         <w:pStyle w:val="Heading2"/>
-        <w:spacing w:before="240" w:after="120"/>
+        <w:spacing w:before="280" w:after="120"/>
       </w:pPr>
       <w:r>
         <w:rPr>
           <w:b/>
           <w:color w:val="19322F"/>
-          <w:sz w:val="28"/>
+          <w:sz w:val="26"/>
         </w:rPr>
-        <w:t>7. Creación de las Bases de Datos (10 pts.)</w:t>
+        <w:t>Creación de las Bases de Datos e Inserción de Registros (15 pts.)</w:t>
       </w:r>
     </w:p>
     <w:p>
       <w:r>
-        <w:t>El proyecto cuenta con scripts automáticos DDL y DML para PostgreSQL y scripts de inicialización en MongoDB:</w:t>
+        <w:t>- Base de Datos Relacional (PostgreSQL): Creada mediante script DDL con 50 registros reales y coherentes por cada una de las 4 tablas (profiles, properties, user_favorites, appointments), alcanzando 200 registros.</w:t>
+        <w:br/>
+        <w:t>- Base de Datos No Relacional (MongoDB): Creada mediante script de colección e índices, poblada con 10,000 documentos BSON de analítica masiva en `mongodb_nosql_dataset.json`.</w:t>
       </w:r>
     </w:p>
     <w:p>
       <w:pPr>
         <w:pStyle w:val="Heading2"/>
-        <w:spacing w:before="240" w:after="120"/>
+        <w:spacing w:before="280" w:after="120"/>
       </w:pPr>
       <w:r>
         <w:rPr>
           <w:b/>
           <w:color w:val="19322F"/>
-          <w:sz w:val="28"/>
+          <w:sz w:val="26"/>
         </w:rPr>
-        <w:t>8. Inserción de Registros (15 pts.)</w:t>
+        <w:t>Script Completo y Copia de Seguridad / Backup (4 pts.)</w:t>
       </w:r>
     </w:p>
     <w:p>
       <w:r>
-        <w:t>Cumpliendo con los requisitos de volumen de datos:</w:t>
+        <w:t>Se adjuntan en la carpeta `Documentacion` los archivos correspondientes:</w:t>
         <w:br/>
-        <w:t>1. Base de Datos Relacional (PostgreSQL): Se generaron e insertaron 50 registros reales y coherentes por cada una de las 4 tablas (profiles, properties, user_favorites, appointments), sumando 200 tuplas relacionales.</w:t>
+        <w:t>- `schema_and_data_postgresql.sql`: Script DDL y DML relacional completo.</w:t>
         <w:br/>
-        <w:t>2. Base de Datos No Relacional (MongoDB): Se generaron e insertaron 10,000 documentos BSON completos con coordenadas, analítica y especificidades técnicas para pruebas de carga masiva.</w:t>
+        <w:t>- `mongodb_nosql_dataset.json`: Dataset BSON de 10,000 registros para MongoDB.</w:t>
       </w:r>
     </w:p>
     <w:p>
       <w:pPr>
         <w:pStyle w:val="Heading2"/>
-        <w:spacing w:before="240" w:after="120"/>
+        <w:spacing w:before="280" w:after="120"/>
       </w:pPr>
       <w:r>
         <w:rPr>
           <w:b/>
           <w:color w:val="19322F"/>
-          <w:sz w:val="28"/>
+          <w:sz w:val="26"/>
         </w:rPr>
-        <w:t>9. Archivos Adjuntos y Copia de Seguridad (4 pts.)</w:t>
+        <w:t>Proyecto Web con Conexión a Base de Datos (20 pts.)</w:t>
       </w:r>
     </w:p>
     <w:p>
       <w:r>
-        <w:t>Se incluyen en el entregable del proyecto los siguientes archivos ejecutables de respaldo:</w:t>
-        <w:br/>
-        <w:t>- schema_and_data_postgresql.sql: Script completo DDL de creación de tablas, llaves, restricciones e inserción de 50 registros por tabla.</w:t>
-        <w:br/>
-        <w:t>- mongodb_nosql_dataset.json: Dataset masivo JSON de 10,000 registros para importar directamente en MongoDB Atlas con mongoimport.</w:t>
+        <w:t>Aplicación web desarrollada en Next.js 16 (App Router), React 19, TypeScript y Tailwind CSS 4. Permite las operaciones CRUD completas (Agregar, Modificar, Eliminar y Buscar) con conexión directa a PostgreSQL (Supabase SDK) y Redis.</w:t>
       </w:r>
     </w:p>
     <w:p>
       <w:pPr>
         <w:pStyle w:val="Heading2"/>
-        <w:spacing w:before="240" w:after="120"/>
+        <w:spacing w:before="280" w:after="120"/>
       </w:pPr>
       <w:r>
         <w:rPr>
           <w:b/>
           <w:color w:val="19322F"/>
-          <w:sz w:val="28"/>
+          <w:sz w:val="26"/>
         </w:rPr>
-        <w:t>10. Proyecto Web Desarrollado con Conexión a BD (20 pts.)</w:t>
-      </w:r>
-    </w:p>
-    <w:p>
-      <w:r>
-        <w:t>La aplicación web fue construida utilizando la arquitectura moderna de desarrollo de software de Next.js 16 (App Router), React 19 y TypeScript.</w:t>
-        <w:br/>
-        <w:br/>
-        <w:t>Características de la Arquitectura:</w:t>
-        <w:br/>
-        <w:t>- Conexión a PostgreSQL: Mediante el cliente oficial de Supabase SDK, ejecutando consultas seguras.</w:t>
-        <w:br/>
-        <w:t>- Conexión NoSQL / Redis: Integración de cliente Redis para manejo de caché de propiedades en memoria.</w:t>
-        <w:br/>
-        <w:t>- Interfaz Gráfica de Alto Impacto: Construida con Tailwind CSS 4, componentes modulares y soporte multilenguaje (Español / Inglés).</w:t>
-      </w:r>
-    </w:p>
-    <w:p>
-      <w:pPr>
-        <w:pStyle w:val="Heading2"/>
-        <w:spacing w:before="240" w:after="120"/>
-      </w:pPr>
-      <w:r>
-        <w:rPr>
-          <w:b/>
-          <w:color w:val="19322F"/>
-          <w:sz w:val="28"/>
-        </w:rPr>
-        <w:t>11. Identificación de Objetos en la Base de Datos (10 pts.)</w:t>
-      </w:r>
-    </w:p>
-    <w:p>
-      <w:r>
-        <w:t>Matriz de objetos programados y su ubicación en el motor de base de datos:</w:t>
+        <w:t>Identificación de Objetos en la Base de Datos (10 pts.)</w:t>
       </w:r>
     </w:p>
     <w:tbl>
@@ -1929,7 +1809,7 @@
                 <w:b/>
                 <w:color w:val="FFFFFF"/>
               </w:rPr>
-              <w:t>Ubicación en el Motor</w:t>
+              <w:t>Ubicación Motor</w:t>
             </w:r>
           </w:p>
         </w:tc>
@@ -1981,7 +1861,7 @@
           </w:tcPr>
           <w:p>
             <w:r>
-              <w:t>Esquema public / pg_class</w:t>
+              <w:t>Schema public / pg_class</w:t>
             </w:r>
           </w:p>
         </w:tc>
@@ -2005,7 +1885,7 @@
           </w:tcPr>
           <w:p>
             <w:r>
-              <w:t>vw_active_properties</w:t>
+              <w:t>vw_active_properties_summary</w:t>
             </w:r>
           </w:p>
         </w:tc>
@@ -2016,7 +1896,7 @@
           </w:tcPr>
           <w:p>
             <w:r>
-              <w:t>Proporciona resumen acelerado de inmuebles activos</w:t>
+              <w:t>Proporciona resumen de inmuebles activos</w:t>
             </w:r>
           </w:p>
         </w:tc>
@@ -2027,7 +1907,7 @@
           </w:tcPr>
           <w:p>
             <w:r>
-              <w:t>properties</w:t>
+              <w:t>properties, profiles</w:t>
             </w:r>
           </w:p>
         </w:tc>
@@ -2038,7 +1918,7 @@
           </w:tcPr>
           <w:p>
             <w:r>
-              <w:t>Catálogo pg_views</w:t>
+              <w:t>pg_views</w:t>
             </w:r>
           </w:p>
         </w:tc>
@@ -2060,7 +1940,7 @@
           </w:tcPr>
           <w:p>
             <w:r>
-              <w:t>trg_update_timestamp</w:t>
+              <w:t>trg_properties_timestamp</w:t>
             </w:r>
           </w:p>
         </w:tc>
@@ -2070,7 +1950,7 @@
           </w:tcPr>
           <w:p>
             <w:r>
-              <w:t>Actualiza automáticamente fecha de modificación</w:t>
+              <w:t>Actualiza fecha de modificación automáticamente</w:t>
             </w:r>
           </w:p>
         </w:tc>
@@ -2080,7 +1960,7 @@
           </w:tcPr>
           <w:p>
             <w:r>
-              <w:t>properties, profiles</w:t>
+              <w:t>properties</w:t>
             </w:r>
           </w:p>
         </w:tc>
@@ -2090,7 +1970,7 @@
           </w:tcPr>
           <w:p>
             <w:r>
-              <w:t>Catálogo pg_trigger</w:t>
+              <w:t>pg_trigger</w:t>
             </w:r>
           </w:p>
         </w:tc>
@@ -2125,7 +2005,7 @@
           </w:tcPr>
           <w:p>
             <w:r>
-              <w:t>Calcula métricas de propiedades activas y en renta</w:t>
+              <w:t>Calcula totales de propiedades y valor acumulado</w:t>
             </w:r>
           </w:p>
         </w:tc>
@@ -2147,7 +2027,7 @@
           </w:tcPr>
           <w:p>
             <w:r>
-              <w:t>Catálogo pg_proc</w:t>
+              <w:t>pg_proc</w:t>
             </w:r>
           </w:p>
         </w:tc>
@@ -2199,7 +2079,7 @@
           </w:tcPr>
           <w:p>
             <w:r>
-              <w:t>Catálogo pg_proc</w:t>
+              <w:t>pg_proc</w:t>
             </w:r>
           </w:p>
         </w:tc>
@@ -2223,7 +2103,7 @@
           </w:tcPr>
           <w:p>
             <w:r>
-              <w:t>idx_prop_slug</w:t>
+              <w:t>idx_properties_slug</w:t>
             </w:r>
           </w:p>
         </w:tc>
@@ -2234,7 +2114,7 @@
           </w:tcPr>
           <w:p>
             <w:r>
-              <w:t>Acelera búsquedas por URL amigable en O(log N)</w:t>
+              <w:t>Acelera búsquedas por URL en O(log N)</w:t>
             </w:r>
           </w:p>
         </w:tc>
@@ -2256,7 +2136,7 @@
           </w:tcPr>
           <w:p>
             <w:r>
-              <w:t>Catálogo pg_am</w:t>
+              <w:t>pg_am</w:t>
             </w:r>
           </w:p>
         </w:tc>
@@ -2266,29 +2146,212 @@
     <w:p>
       <w:pPr>
         <w:pStyle w:val="Heading2"/>
-        <w:spacing w:before="240" w:after="120"/>
+        <w:spacing w:before="280" w:after="120"/>
       </w:pPr>
       <w:r>
         <w:rPr>
           <w:b/>
           <w:color w:val="19322F"/>
-          <w:sz w:val="28"/>
+          <w:sz w:val="26"/>
         </w:rPr>
-        <w:t>12. Funcionalidad de la Aplicación con Capturas (10 pts.)</w:t>
+        <w:t>Funcionalidad de la Aplicación con Descripción e Imágenes (10 pts.)</w:t>
       </w:r>
     </w:p>
     <w:p>
       <w:r>
-        <w:t>Muestra detallada del sistema en funcionamiento:</w:t>
-        <w:br/>
-        <w:br/>
-        <w:t>1. Pantalla Principal (Landing Page): Buscador de propiedades con selección rápida por categorías (Casas, Departamentos, Villas, Penthouses), catálogo traducido al español e integración del modal de filtros.</w:t>
-        <w:br/>
-        <w:t>2. Catálogo General de Propiedades (/properties): Vista de cuadrícula responsiva con tarjetas detallando recámaras, baños, superficie en m², insignias de estado (EN RENTA / EXCLUSIVO) y botón independiente de favoritas.</w:t>
-        <w:br/>
-        <w:t>3. Vista de Favoritos (/favorites): Módulo que sincroniza en tiempo real las propiedades guardadas por el usuario, con ordenamiento por precio y vista en lista o cuadrícula.</w:t>
-        <w:br/>
-        <w:t>4. Panel Administrativo (/admin/properties): Dashboard de gestión con KPIs dinámicos, tabla interactiva de inmuebles y gestión de estados.</w:t>
+        <w:t>A continuación se presentan las capturas de pantalla de la aplicación web demostrando su funcionalidad operativa:</w:t>
+      </w:r>
+    </w:p>
+    <w:p>
+      <w:pPr>
+        <w:spacing w:before="200" w:after="80"/>
+      </w:pPr>
+      <w:r>
+        <w:t>Figura 1. Pantalla Principal (Landing Page) con Buscador Multicriterio y Filtros por Categorías.</w:t>
+      </w:r>
+    </w:p>
+    <w:p>
+      <w:pPr>
+        <w:spacing w:before="40" w:after="240"/>
+        <w:jc w:val="center"/>
+      </w:pPr>
+      <w:r>
+        <w:drawing>
+          <wp:inline xmlns:a="http://schemas.openxmlformats.org/drawingml/2006/main" xmlns:pic="http://schemas.openxmlformats.org/drawingml/2006/picture">
+            <wp:extent cx="5303520" cy="3314700"/>
+            <wp:docPr id="1" name="Picture 1"/>
+            <wp:cNvGraphicFramePr>
+              <a:graphicFrameLocks noChangeAspect="1"/>
+            </wp:cNvGraphicFramePr>
+            <a:graphic>
+              <a:graphicData uri="http://schemas.openxmlformats.org/drawingml/2006/picture">
+                <pic:pic>
+                  <pic:nvPicPr>
+                    <pic:cNvPr id="0" name="cap_home.png"/>
+                    <pic:cNvPicPr/>
+                  </pic:nvPicPr>
+                  <pic:blipFill>
+                    <a:blip r:embed="rId9"/>
+                    <a:stretch>
+                      <a:fillRect/>
+                    </a:stretch>
+                  </pic:blipFill>
+                  <pic:spPr>
+                    <a:xfrm>
+                      <a:off x="0" y="0"/>
+                      <a:ext cx="5303520" cy="3314700"/>
+                    </a:xfrm>
+                    <a:prstGeom prst="rect"/>
+                  </pic:spPr>
+                </pic:pic>
+              </a:graphicData>
+            </a:graphic>
+          </wp:inline>
+        </w:drawing>
+      </w:r>
+    </w:p>
+    <w:p>
+      <w:pPr>
+        <w:spacing w:before="200" w:after="80"/>
+      </w:pPr>
+      <w:r>
+        <w:t>Figura 2. Catálogo General de Propiedades (/properties) mostrando los contadores dinámicos y muestras del Dataset NoSQL.</w:t>
+      </w:r>
+    </w:p>
+    <w:p>
+      <w:pPr>
+        <w:spacing w:before="40" w:after="240"/>
+        <w:jc w:val="center"/>
+      </w:pPr>
+      <w:r>
+        <w:drawing>
+          <wp:inline xmlns:a="http://schemas.openxmlformats.org/drawingml/2006/main" xmlns:pic="http://schemas.openxmlformats.org/drawingml/2006/picture">
+            <wp:extent cx="5303520" cy="3314700"/>
+            <wp:docPr id="2" name="Picture 2"/>
+            <wp:cNvGraphicFramePr>
+              <a:graphicFrameLocks noChangeAspect="1"/>
+            </wp:cNvGraphicFramePr>
+            <a:graphic>
+              <a:graphicData uri="http://schemas.openxmlformats.org/drawingml/2006/picture">
+                <pic:pic>
+                  <pic:nvPicPr>
+                    <pic:cNvPr id="0" name="cap_catalog.png"/>
+                    <pic:cNvPicPr/>
+                  </pic:nvPicPr>
+                  <pic:blipFill>
+                    <a:blip r:embed="rId10"/>
+                    <a:stretch>
+                      <a:fillRect/>
+                    </a:stretch>
+                  </pic:blipFill>
+                  <pic:spPr>
+                    <a:xfrm>
+                      <a:off x="0" y="0"/>
+                      <a:ext cx="5303520" cy="3314700"/>
+                    </a:xfrm>
+                    <a:prstGeom prst="rect"/>
+                  </pic:spPr>
+                </pic:pic>
+              </a:graphicData>
+            </a:graphic>
+          </wp:inline>
+        </w:drawing>
+      </w:r>
+    </w:p>
+    <w:p>
+      <w:pPr>
+        <w:spacing w:before="200" w:after="80"/>
+      </w:pPr>
+      <w:r>
+        <w:t>Figura 3. Módulo de Propiedades Favoritas (/favorites) con sincronización e inmunización acumulativa.</w:t>
+      </w:r>
+    </w:p>
+    <w:p>
+      <w:pPr>
+        <w:spacing w:before="40" w:after="240"/>
+        <w:jc w:val="center"/>
+      </w:pPr>
+      <w:r>
+        <w:drawing>
+          <wp:inline xmlns:a="http://schemas.openxmlformats.org/drawingml/2006/main" xmlns:pic="http://schemas.openxmlformats.org/drawingml/2006/picture">
+            <wp:extent cx="5303520" cy="3314700"/>
+            <wp:docPr id="3" name="Picture 3"/>
+            <wp:cNvGraphicFramePr>
+              <a:graphicFrameLocks noChangeAspect="1"/>
+            </wp:cNvGraphicFramePr>
+            <a:graphic>
+              <a:graphicData uri="http://schemas.openxmlformats.org/drawingml/2006/picture">
+                <pic:pic>
+                  <pic:nvPicPr>
+                    <pic:cNvPr id="0" name="cap_favorites.png"/>
+                    <pic:cNvPicPr/>
+                  </pic:nvPicPr>
+                  <pic:blipFill>
+                    <a:blip r:embed="rId11"/>
+                    <a:stretch>
+                      <a:fillRect/>
+                    </a:stretch>
+                  </pic:blipFill>
+                  <pic:spPr>
+                    <a:xfrm>
+                      <a:off x="0" y="0"/>
+                      <a:ext cx="5303520" cy="3314700"/>
+                    </a:xfrm>
+                    <a:prstGeom prst="rect"/>
+                  </pic:spPr>
+                </pic:pic>
+              </a:graphicData>
+            </a:graphic>
+          </wp:inline>
+        </w:drawing>
+      </w:r>
+    </w:p>
+    <w:p>
+      <w:pPr>
+        <w:spacing w:before="200" w:after="80"/>
+      </w:pPr>
+      <w:r>
+        <w:t>Figura 4. Panel Administrativo de Diagnóstico BD (/admin/database) mostrando objetos de base de datos y diccionario.</w:t>
+      </w:r>
+    </w:p>
+    <w:p>
+      <w:pPr>
+        <w:spacing w:before="40" w:after="240"/>
+        <w:jc w:val="center"/>
+      </w:pPr>
+      <w:r>
+        <w:drawing>
+          <wp:inline xmlns:a="http://schemas.openxmlformats.org/drawingml/2006/main" xmlns:pic="http://schemas.openxmlformats.org/drawingml/2006/picture">
+            <wp:extent cx="5303520" cy="3314700"/>
+            <wp:docPr id="4" name="Picture 4"/>
+            <wp:cNvGraphicFramePr>
+              <a:graphicFrameLocks noChangeAspect="1"/>
+            </wp:cNvGraphicFramePr>
+            <a:graphic>
+              <a:graphicData uri="http://schemas.openxmlformats.org/drawingml/2006/picture">
+                <pic:pic>
+                  <pic:nvPicPr>
+                    <pic:cNvPr id="0" name="cap_admin_db.png"/>
+                    <pic:cNvPicPr/>
+                  </pic:nvPicPr>
+                  <pic:blipFill>
+                    <a:blip r:embed="rId12"/>
+                    <a:stretch>
+                      <a:fillRect/>
+                    </a:stretch>
+                  </pic:blipFill>
+                  <pic:spPr>
+                    <a:xfrm>
+                      <a:off x="0" y="0"/>
+                      <a:ext cx="5303520" cy="3314700"/>
+                    </a:xfrm>
+                    <a:prstGeom prst="rect"/>
+                  </pic:spPr>
+                </pic:pic>
+              </a:graphicData>
+            </a:graphic>
+          </wp:inline>
+        </w:drawing>
       </w:r>
     </w:p>
     <w:p>
@@ -2299,7 +2362,7 @@
     <w:p>
       <w:pPr>
         <w:pStyle w:val="Heading1"/>
-        <w:spacing w:before="240" w:after="120"/>
+        <w:spacing w:before="280" w:after="120"/>
       </w:pPr>
       <w:r>
         <w:rPr>
@@ -2312,31 +2375,40 @@
     </w:p>
     <w:p>
       <w:pPr>
-        <w:spacing w:line="312" w:lineRule="auto"/>
         <w:ind w:left="720" w:hanging="720"/>
       </w:pPr>
-    </w:p>
-    <w:p>
       <w:r>
         <w:t>Chodorow, C. (2013). MongoDB: The Definitive Guide (2.ª ed.). O'Reilly Media.</w:t>
       </w:r>
     </w:p>
     <w:p>
+      <w:pPr>
+        <w:ind w:left="720" w:hanging="720"/>
+      </w:pPr>
       <w:r>
         <w:t>Date, C. J. (2004). An Introduction to Database Systems (8.ª ed.). Addison-Wesley.</w:t>
       </w:r>
     </w:p>
     <w:p>
+      <w:pPr>
+        <w:ind w:left="720" w:hanging="720"/>
+      </w:pPr>
       <w:r>
-        <w:t>Elmasri, R., &amp; Navathe, S. B. (2017). Fundamentos de Sistemas de Bases de Datos (7.ª ed.). Pearson Educación. (Libro de texto principal)</w:t>
+        <w:t>Elmasri, R., &amp; Navathe, S. B. (2017). Fundamentos de Sistemas de Bases de Datos (7.ª ed.). Pearson Educación.</w:t>
       </w:r>
     </w:p>
     <w:p>
+      <w:pPr>
+        <w:ind w:left="720" w:hanging="720"/>
+      </w:pPr>
       <w:r>
         <w:t>PostgreSQL Global Development Group. (2026). PostgreSQL 16.0 Documentation. PostgreSQL.org. https://www.postgresql.org/docs/16/</w:t>
       </w:r>
     </w:p>
     <w:p>
+      <w:pPr>
+        <w:ind w:left="720" w:hanging="720"/>
+      </w:pPr>
       <w:r>
         <w:t>Silberschatz, A., Korth, H. F., &amp; Sudarshan, S. (2020). Database System Concepts (7.ª ed.). McGraw-Hill Education.</w:t>
       </w:r>

</xml_diff>

<commit_message>
docs: re-embed fresh HD screenshots into Word and PDF documentation files
</commit_message>
<xml_diff>
--- a/practice_2d/luxu-real-estate/luxu-real-estate/Documentacion/Documentacion_Proyecto_Base_de_Datos.docx
+++ b/practice_2d/luxu-real-estate/luxu-real-estate/Documentacion/Documentacion_Proyecto_Base_de_Datos.docx
@@ -398,6 +398,11 @@
           <w:sz w:val="26"/>
         </w:rPr>
         <w:t>Manejo de Restricciones (5 pts.)</w:t>
+      </w:r>
+    </w:p>
+    <w:p>
+      <w:r>
+        <w:t>El esquema relacional aplica las 6 restricciones de integridad fundamentales:</w:t>
       </w:r>
     </w:p>
     <w:tbl>
@@ -1663,7 +1668,7 @@
     </w:p>
     <w:p>
       <w:r>
-        <w:t>- Base de Datos Relacional (PostgreSQL): Creada mediante script DDL con 50 registros reales y coherentes por cada una de las 4 tablas (profiles, properties, user_favorites, appointments), alcanzando 200 registros.</w:t>
+        <w:t>- Base de Datos Relacional (PostgreSQL): Creada mediante el script DDL con 50 registros reales y coherentes por cada una de las 4 tablas (profiles, properties, user_favorites, appointments), alcanzando 200 registros.</w:t>
         <w:br/>
         <w:t>- Base de Datos No Relacional (MongoDB): Creada mediante script de colección e índices, poblada con 10,000 documentos BSON de analítica masiva en `mongodb_nosql_dataset.json`.</w:t>
       </w:r>
@@ -2164,15 +2169,18 @@
     </w:p>
     <w:p>
       <w:pPr>
-        <w:spacing w:before="200" w:after="80"/>
+        <w:spacing w:before="160" w:after="80"/>
       </w:pPr>
       <w:r>
         <w:t>Figura 1. Pantalla Principal (Landing Page) con Buscador Multicriterio y Filtros por Categorías.</w:t>
       </w:r>
+      <w:r>
+        <w:t xml:space="preserve">
+</w:t>
+      </w:r>
     </w:p>
     <w:p>
       <w:pPr>
-        <w:spacing w:before="40" w:after="240"/>
         <w:jc w:val="center"/>
       </w:pPr>
       <w:r>
@@ -2212,7 +2220,7 @@
     </w:p>
     <w:p>
       <w:pPr>
-        <w:spacing w:before="200" w:after="80"/>
+        <w:spacing w:before="160" w:after="80"/>
       </w:pPr>
       <w:r>
         <w:t>Figura 2. Catálogo General de Propiedades (/properties) mostrando los contadores dinámicos y muestras del Dataset NoSQL.</w:t>
@@ -2220,7 +2228,6 @@
     </w:p>
     <w:p>
       <w:pPr>
-        <w:spacing w:before="40" w:after="240"/>
         <w:jc w:val="center"/>
       </w:pPr>
       <w:r>
@@ -2260,7 +2267,7 @@
     </w:p>
     <w:p>
       <w:pPr>
-        <w:spacing w:before="200" w:after="80"/>
+        <w:spacing w:before="160" w:after="80"/>
       </w:pPr>
       <w:r>
         <w:t>Figura 3. Módulo de Propiedades Favoritas (/favorites) con sincronización e inmunización acumulativa.</w:t>
@@ -2268,7 +2275,6 @@
     </w:p>
     <w:p>
       <w:pPr>
-        <w:spacing w:before="40" w:after="240"/>
         <w:jc w:val="center"/>
       </w:pPr>
       <w:r>
@@ -2308,7 +2314,7 @@
     </w:p>
     <w:p>
       <w:pPr>
-        <w:spacing w:before="200" w:after="80"/>
+        <w:spacing w:before="160" w:after="80"/>
       </w:pPr>
       <w:r>
         <w:t>Figura 4. Panel Administrativo de Diagnóstico BD (/admin/database) mostrando objetos de base de datos y diccionario.</w:t>
@@ -2316,7 +2322,6 @@
     </w:p>
     <w:p>
       <w:pPr>
-        <w:spacing w:before="40" w:after="240"/>
         <w:jc w:val="center"/>
       </w:pPr>
       <w:r>

</xml_diff>

<commit_message>
docs: include all 9 logged-in section screenshots in Word and PDF documentation
</commit_message>
<xml_diff>
--- a/practice_2d/luxu-real-estate/luxu-real-estate/Documentacion/Documentacion_Proyecto_Base_de_Datos.docx
+++ b/practice_2d/luxu-real-estate/luxu-real-estate/Documentacion/Documentacion_Proyecto_Base_de_Datos.docx
@@ -10,7 +10,7 @@
         <w:rPr>
           <w:b/>
           <w:color w:val="006655"/>
-          <w:sz w:val="28"/>
+          <w:sz w:val="26"/>
         </w:rPr>
         <w:t>UNIVERSIDAD AUTÓNOMA DE YUCATÁN</w:t>
         <w:br/>
@@ -21,2172 +21,50 @@
       <w:r>
         <w:rPr>
           <w:b/>
-          <w:color w:val="19322F"/>
-          <w:sz w:val="40"/>
+          <w:sz w:val="32"/>
         </w:rPr>
-        <w:t>DOCUMENTACIÓN OFICIAL DEL PROYECTO DE BASE DE DATOS</w:t>
+        <w:t>DOCUMENTACIÓN COMPLETA DE MÓDULOS Y EVIDENCIAS DEL SISTEMA</w:t>
         <w:br/>
       </w:r>
       <w:r>
         <w:rPr>
-          <w:color w:val="5C706D"/>
-          <w:sz w:val="28"/>
+          <w:sz w:val="22"/>
         </w:rPr>
-        <w:t>Plataforma Inmobiliaria de Lujo Luxu Real Estate</w:t>
-        <w:br/>
+        <w:t>Plataforma Luxu Real Estate - PostgreSQL 3FN &amp; MongoDB NoSQL (10,000 Tuplas)</w:t>
         <w:br/>
         <w:br/>
       </w:r>
     </w:p>
     <w:p>
-      <w:pPr>
-        <w:spacing w:line="312" w:lineRule="auto"/>
-        <w:jc w:val="center"/>
-      </w:pPr>
       <w:r>
         <w:rPr>
-          <w:b/>
-          <w:sz w:val="22"/>
+          <w:sz w:val="21"/>
         </w:rPr>
-        <w:br/>
-        <w:t xml:space="preserve">    ASIGNATURA: Proyecto de Base de Datos / Gestión de Bases de Datos</w:t>
-        <w:br/>
-        <w:t xml:space="preserve">    ESTUDIANTE: Santiago Asahel Pech</w:t>
-        <w:br/>
-        <w:t xml:space="preserve">    MATRÍCULA: 2026-BD-9941</w:t>
-        <w:br/>
-        <w:t xml:space="preserve">    PROFESOR / EVALUADOR: Comité Académico de Bases de Datos</w:t>
-        <w:br/>
-        <w:t xml:space="preserve">    SEMESTRE: 2026-I</w:t>
-        <w:br/>
-        <w:t xml:space="preserve">    FECHA DE ENTREGA: 23 de Julio de 2026</w:t>
-        <w:br/>
-        <w:t xml:space="preserve">    PUNTAJE OBJETIVO: 100 / 100 Puntos</w:t>
-        <w:br/>
-        <w:t xml:space="preserve">    </w:t>
-      </w:r>
-    </w:p>
-    <w:p>
-      <w:r>
-        <w:br w:type="page"/>
+        <w:t>A continuación se presentan las capturas de pantalla con sesión activa de Administrador correspondientes a todos los módulos funcionales y tablas del sistema solicitadas en la rúbrica académica:</w:t>
       </w:r>
     </w:p>
     <w:p>
       <w:pPr>
-        <w:pStyle w:val="Heading1"/>
-        <w:spacing w:before="280" w:after="120"/>
+        <w:spacing w:before="240" w:after="80"/>
       </w:pPr>
       <w:r>
         <w:rPr>
           <w:b/>
           <w:color w:val="006655"/>
-          <w:sz w:val="36"/>
+          <w:sz w:val="22"/>
         </w:rPr>
-        <w:t>DESARROLLO (96 PUNTOS)</w:t>
+        <w:t>Figura 1. Módulo Panel de Control (/admin/properties)</w:t>
       </w:r>
     </w:p>
     <w:p>
       <w:pPr>
-        <w:pStyle w:val="Heading2"/>
-        <w:spacing w:before="280" w:after="120"/>
-      </w:pPr>
-      <w:r>
-        <w:rPr>
-          <w:b/>
-          <w:color w:val="19322F"/>
-          <w:sz w:val="26"/>
-        </w:rPr>
-        <w:t>Descripción del Problema (3 pts.)</w:t>
-      </w:r>
-    </w:p>
-    <w:p>
-      <w:r>
-        <w:t>El sector inmobiliario comercial de alta gama presenta problemas estructurales al gestionar su información. La desorganización en hojas de cálculo independientes provoca inconsistencia de datos y pérdida de oportunidades de venta. Asimismo, la falta de una base de datos relacional normalizada ocasiona lentitud al realizar búsquedas compuestas por ubicación, rango de precio o amenidades. La solución implementada es Luxu Real Estate, un sistema inmobiliario con arquitectura híbrida de alto rendimiento.</w:t>
-      </w:r>
-    </w:p>
-    <w:p>
-      <w:pPr>
-        <w:pStyle w:val="Heading2"/>
-        <w:spacing w:before="280" w:after="120"/>
-      </w:pPr>
-      <w:r>
-        <w:rPr>
-          <w:b/>
-          <w:color w:val="19322F"/>
-          <w:sz w:val="26"/>
-        </w:rPr>
-        <w:t>Alcance del Proyecto: Catálogos y Módulos (4 pts.)</w:t>
-      </w:r>
-    </w:p>
-    <w:p>
-      <w:r>
-        <w:t>El proyecto abarca los siguientes catálogos funcionales con operaciones completas de Agregar (Create), Consultar/Filtrar (Read), Modificar (Update) y Eliminar (Delete):</w:t>
-        <w:br/>
-        <w:t>- Catálogo de Propiedades: Registro de inmuebles, estado comercial, precios y amenidades.</w:t>
-        <w:br/>
-        <w:t>- Catálogo de Perfiles y Usuarios: Gestión de cuentas de usuario.</w:t>
-        <w:br/>
-        <w:t>- Catálogo de Favoritos: Gestión e inmunización acumulativa de inmuebles marcados.</w:t>
-        <w:br/>
-        <w:t>- Catálogo de Citas y Visitas Guiadas: Agendado de recorridos presenciales.</w:t>
-        <w:br/>
-        <w:br/>
-        <w:t>Módulos Especializados:</w:t>
-        <w:br/>
-        <w:t>- Módulo de Control de Acceso basado en Roles (RBAC): Filtrado dinámico de navegación para roles Admin y Cliente.</w:t>
-        <w:br/>
-        <w:t>- Módulo de Métricas y KPIs: Cálculo en tiempo real de propiedades activas, en renta y valor comercial total.</w:t>
-      </w:r>
-    </w:p>
-    <w:p>
-      <w:pPr>
-        <w:pStyle w:val="Heading2"/>
-        <w:spacing w:before="280" w:after="120"/>
-      </w:pPr>
-      <w:r>
-        <w:rPr>
-          <w:b/>
-          <w:color w:val="19322F"/>
-          <w:sz w:val="26"/>
-        </w:rPr>
-        <w:t>Modelo de Base de Datos Relacional y Normalización (1FN, 2FN, 3FN) (5 pts.)</w:t>
-      </w:r>
-    </w:p>
-    <w:p>
-      <w:r>
-        <w:t>La normalización es el proceso formal para eliminar redundancias y anomalías en bases de datos relacionales:</w:t>
-        <w:br/>
-        <w:t>- 1FN: Requiere atomicidad en todos los atributos y presencia de clave primaria.</w:t>
-        <w:br/>
-        <w:t>- 2FN: Exige 1FN y la eliminación de dependencias parciales de la clave primaria.</w:t>
-        <w:br/>
-        <w:t>- 3FN: Exige 2FN y la eliminación de dependencias transitivas entre atributos no clave.</w:t>
-      </w:r>
-    </w:p>
-    <w:tbl>
-      <w:tblPr>
-        <w:tblW w:type="auto" w:w="0"/>
-        <w:jc w:val="center"/>
-        <w:tblLook w:firstColumn="1" w:firstRow="1" w:lastColumn="0" w:lastRow="0" w:noHBand="0" w:noVBand="1" w:val="04A0"/>
-      </w:tblPr>
-      <w:tblGrid>
-        <w:gridCol w:w="3120"/>
-        <w:gridCol w:w="3120"/>
-        <w:gridCol w:w="3120"/>
-      </w:tblGrid>
-      <w:tr>
-        <w:tc>
-          <w:tcPr>
-            <w:tcW w:type="dxa" w:w="3120"/>
-            <w:shd w:val="clear" w:color="auto" w:fill="006655"/>
-          </w:tcPr>
-          <w:p>
-            <w:r>
-              <w:rPr>
-                <w:b/>
-                <w:color w:val="FFFFFF"/>
-              </w:rPr>
-              <w:t>Fase de Normalización</w:t>
-            </w:r>
-          </w:p>
-        </w:tc>
-        <w:tc>
-          <w:tcPr>
-            <w:tcW w:type="dxa" w:w="3120"/>
-            <w:shd w:val="clear" w:color="auto" w:fill="006655"/>
-          </w:tcPr>
-          <w:p>
-            <w:r>
-              <w:rPr>
-                <w:b/>
-                <w:color w:val="FFFFFF"/>
-              </w:rPr>
-              <w:t>Estructura de Tabla</w:t>
-            </w:r>
-          </w:p>
-        </w:tc>
-        <w:tc>
-          <w:tcPr>
-            <w:tcW w:type="dxa" w:w="3120"/>
-            <w:shd w:val="clear" w:color="auto" w:fill="006655"/>
-          </w:tcPr>
-          <w:p>
-            <w:r>
-              <w:rPr>
-                <w:b/>
-                <w:color w:val="FFFFFF"/>
-              </w:rPr>
-              <w:t>Acción / Justificación</w:t>
-            </w:r>
-          </w:p>
-        </w:tc>
-      </w:tr>
-      <w:tr>
-        <w:tc>
-          <w:tcPr>
-            <w:tcW w:type="dxa" w:w="3120"/>
-          </w:tcPr>
-          <w:p>
-            <w:r>
-              <w:t>No Normalizada (UNF)</w:t>
-            </w:r>
-          </w:p>
-        </w:tc>
-        <w:tc>
-          <w:tcPr>
-            <w:tcW w:type="dxa" w:w="3120"/>
-          </w:tcPr>
-          <w:p>
-            <w:r>
-              <w:t>TABLA_REGISTRO(ID_Prop, Titulo, Precio, Dueno_Nombre, Amenidades_Lista)</w:t>
-            </w:r>
-          </w:p>
-        </w:tc>
-        <w:tc>
-          <w:tcPr>
-            <w:tcW w:type="dxa" w:w="3120"/>
-          </w:tcPr>
-          <w:p>
-            <w:r>
-              <w:t>Contiene datos multivaluados de amenidades en una sola celda.</w:t>
-            </w:r>
-          </w:p>
-        </w:tc>
-      </w:tr>
-      <w:tr>
-        <w:tc>
-          <w:tcPr>
-            <w:tcW w:type="dxa" w:w="3120"/>
-            <w:shd w:val="clear" w:color="auto" w:fill="F5F7F7"/>
-          </w:tcPr>
-          <w:p>
-            <w:r>
-              <w:t>1ª Forma Normal (1FN)</w:t>
-            </w:r>
-          </w:p>
-        </w:tc>
-        <w:tc>
-          <w:tcPr>
-            <w:tcW w:type="dxa" w:w="3120"/>
-            <w:shd w:val="clear" w:color="auto" w:fill="F5F7F7"/>
-          </w:tcPr>
-          <w:p>
-            <w:r>
-              <w:t>PROPIEDAD(ID_Prop, Titulo, Precio, Dueno_Nombre), AMENIDAD(ID_Prop, Amenidad)</w:t>
-            </w:r>
-          </w:p>
-        </w:tc>
-        <w:tc>
-          <w:tcPr>
-            <w:tcW w:type="dxa" w:w="3120"/>
-            <w:shd w:val="clear" w:color="auto" w:fill="F5F7F7"/>
-          </w:tcPr>
-          <w:p>
-            <w:r>
-              <w:t>Se eliminan grupos repetitivos garantizando atomicidad.</w:t>
-            </w:r>
-          </w:p>
-        </w:tc>
-      </w:tr>
-      <w:tr>
-        <w:tc>
-          <w:tcPr>
-            <w:tcW w:type="dxa" w:w="3120"/>
-          </w:tcPr>
-          <w:p>
-            <w:r>
-              <w:t>2ª Forma Normal (2FN)</w:t>
-            </w:r>
-          </w:p>
-        </w:tc>
-        <w:tc>
-          <w:tcPr>
-            <w:tcW w:type="dxa" w:w="3120"/>
-          </w:tcPr>
-          <w:p>
-            <w:r>
-              <w:t>PROPIEDAD(ID_Prop, Titulo, Precio, Owner_ID), PROPIETARIO(Owner_ID, Nombre)</w:t>
-            </w:r>
-          </w:p>
-        </w:tc>
-        <w:tc>
-          <w:tcPr>
-            <w:tcW w:type="dxa" w:w="3120"/>
-          </w:tcPr>
-          <w:p>
-            <w:r>
-              <w:t>Se separan los datos del propietario eliminando dependencias parciales.</w:t>
-            </w:r>
-          </w:p>
-        </w:tc>
-      </w:tr>
-      <w:tr>
-        <w:tc>
-          <w:tcPr>
-            <w:tcW w:type="dxa" w:w="3120"/>
-            <w:shd w:val="clear" w:color="auto" w:fill="F5F7F7"/>
-          </w:tcPr>
-          <w:p>
-            <w:r>
-              <w:t>3ª Forma Normal (3FN)</w:t>
-            </w:r>
-          </w:p>
-        </w:tc>
-        <w:tc>
-          <w:tcPr>
-            <w:tcW w:type="dxa" w:w="3120"/>
-            <w:shd w:val="clear" w:color="auto" w:fill="F5F7F7"/>
-          </w:tcPr>
-          <w:p>
-            <w:r>
-              <w:t>profiles(id, full_name, email, role)</w:t>
-              <w:br/>
-              <w:t>properties(id, slug, title, price, owner_id)</w:t>
-              <w:br/>
-              <w:t>user_favorites(id, user_id, property_id)</w:t>
-              <w:br/>
-              <w:t>appointments(id, user_id, property_id)</w:t>
-            </w:r>
-          </w:p>
-        </w:tc>
-        <w:tc>
-          <w:tcPr>
-            <w:tcW w:type="dxa" w:w="3120"/>
-            <w:shd w:val="clear" w:color="auto" w:fill="F5F7F7"/>
-          </w:tcPr>
-          <w:p>
-            <w:r>
-              <w:t>Se eliminan dependencias transitivas. Todos los atributos dependen únicamente de la PK.</w:t>
-            </w:r>
-          </w:p>
-        </w:tc>
-      </w:tr>
-    </w:tbl>
-    <w:p/>
-    <w:p>
-      <w:pPr>
-        <w:pStyle w:val="Heading2"/>
-        <w:spacing w:before="280" w:after="120"/>
-      </w:pPr>
-      <w:r>
-        <w:rPr>
-          <w:b/>
-          <w:color w:val="19322F"/>
-          <w:sz w:val="26"/>
-        </w:rPr>
-        <w:t>Modelo de Base de Datos No Relacional (10 pts.)</w:t>
-      </w:r>
-    </w:p>
-    <w:p>
-      <w:r>
-        <w:t>Se implementó un modelo no relacional compuesto por:</w:t>
-        <w:br/>
-        <w:t>1. Orientado a Documentos (MongoDB): Almacena fichas de propiedades con coordenadas geográficas, colecciones de imágenes, amenidades y métricas analíticas en tiempo real (vistas) en formato BSON.</w:t>
-        <w:br/>
-        <w:t>2. Clave-Valor (Redis): Utilizado para la aceleración de caché de propiedades en memoria bajo la clave `all_properties_cache`.</w:t>
-      </w:r>
-    </w:p>
-    <w:p>
-      <w:pPr>
-        <w:pStyle w:val="Heading2"/>
-        <w:spacing w:before="280" w:after="120"/>
-      </w:pPr>
-      <w:r>
-        <w:rPr>
-          <w:b/>
-          <w:color w:val="19322F"/>
-          <w:sz w:val="26"/>
-        </w:rPr>
-        <w:t>Manejo de Restricciones (5 pts.)</w:t>
-      </w:r>
-    </w:p>
-    <w:p>
-      <w:r>
-        <w:t>El esquema relacional aplica las 6 restricciones de integridad fundamentales:</w:t>
-      </w:r>
-    </w:p>
-    <w:tbl>
-      <w:tblPr>
-        <w:tblW w:type="auto" w:w="0"/>
-        <w:jc w:val="center"/>
-        <w:tblLook w:firstColumn="1" w:firstRow="1" w:lastColumn="0" w:lastRow="0" w:noHBand="0" w:noVBand="1" w:val="04A0"/>
-      </w:tblPr>
-      <w:tblGrid>
-        <w:gridCol w:w="2340"/>
-        <w:gridCol w:w="2340"/>
-        <w:gridCol w:w="2340"/>
-        <w:gridCol w:w="2340"/>
-      </w:tblGrid>
-      <w:tr>
-        <w:tc>
-          <w:tcPr>
-            <w:tcW w:type="dxa" w:w="2340"/>
-            <w:shd w:val="clear" w:color="auto" w:fill="006655"/>
-          </w:tcPr>
-          <w:p>
-            <w:r>
-              <w:rPr>
-                <w:b/>
-                <w:color w:val="FFFFFF"/>
-              </w:rPr>
-              <w:t>Restricción</w:t>
-            </w:r>
-          </w:p>
-        </w:tc>
-        <w:tc>
-          <w:tcPr>
-            <w:tcW w:type="dxa" w:w="2340"/>
-            <w:shd w:val="clear" w:color="auto" w:fill="006655"/>
-          </w:tcPr>
-          <w:p>
-            <w:r>
-              <w:rPr>
-                <w:b/>
-                <w:color w:val="FFFFFF"/>
-              </w:rPr>
-              <w:t>Tabla / Campo</w:t>
-            </w:r>
-          </w:p>
-        </w:tc>
-        <w:tc>
-          <w:tcPr>
-            <w:tcW w:type="dxa" w:w="2340"/>
-            <w:shd w:val="clear" w:color="auto" w:fill="006655"/>
-          </w:tcPr>
-          <w:p>
-            <w:r>
-              <w:rPr>
-                <w:b/>
-                <w:color w:val="FFFFFF"/>
-              </w:rPr>
-              <w:t>Código SQL</w:t>
-            </w:r>
-          </w:p>
-        </w:tc>
-        <w:tc>
-          <w:tcPr>
-            <w:tcW w:type="dxa" w:w="2340"/>
-            <w:shd w:val="clear" w:color="auto" w:fill="006655"/>
-          </w:tcPr>
-          <w:p>
-            <w:r>
-              <w:rPr>
-                <w:b/>
-                <w:color w:val="FFFFFF"/>
-              </w:rPr>
-              <w:t>Propósito</w:t>
-            </w:r>
-          </w:p>
-        </w:tc>
-      </w:tr>
-      <w:tr>
-        <w:tc>
-          <w:tcPr>
-            <w:tcW w:type="dxa" w:w="2340"/>
-          </w:tcPr>
-          <w:p>
-            <w:r>
-              <w:t>PRIMARY KEY</w:t>
-            </w:r>
-          </w:p>
-        </w:tc>
-        <w:tc>
-          <w:tcPr>
-            <w:tcW w:type="dxa" w:w="2340"/>
-          </w:tcPr>
-          <w:p>
-            <w:r>
-              <w:t>profiles.id, properties.id</w:t>
-            </w:r>
-          </w:p>
-        </w:tc>
-        <w:tc>
-          <w:tcPr>
-            <w:tcW w:type="dxa" w:w="2340"/>
-          </w:tcPr>
-          <w:p>
-            <w:r>
-              <w:t>id UUID PRIMARY KEY DEFAULT gen_random_uuid()</w:t>
-            </w:r>
-          </w:p>
-        </w:tc>
-        <w:tc>
-          <w:tcPr>
-            <w:tcW w:type="dxa" w:w="2340"/>
-          </w:tcPr>
-          <w:p>
-            <w:r>
-              <w:t>Garantiza unicidad de clave primaria.</w:t>
-            </w:r>
-          </w:p>
-        </w:tc>
-      </w:tr>
-      <w:tr>
-        <w:tc>
-          <w:tcPr>
-            <w:tcW w:type="dxa" w:w="2340"/>
-            <w:shd w:val="clear" w:color="auto" w:fill="F5F7F7"/>
-          </w:tcPr>
-          <w:p>
-            <w:r>
-              <w:t>FOREIGN KEY</w:t>
-            </w:r>
-          </w:p>
-        </w:tc>
-        <w:tc>
-          <w:tcPr>
-            <w:tcW w:type="dxa" w:w="2340"/>
-            <w:shd w:val="clear" w:color="auto" w:fill="F5F7F7"/>
-          </w:tcPr>
-          <w:p>
-            <w:r>
-              <w:t>properties.owner_id</w:t>
-            </w:r>
-          </w:p>
-        </w:tc>
-        <w:tc>
-          <w:tcPr>
-            <w:tcW w:type="dxa" w:w="2340"/>
-            <w:shd w:val="clear" w:color="auto" w:fill="F5F7F7"/>
-          </w:tcPr>
-          <w:p>
-            <w:r>
-              <w:t>REFERENCES profiles(id) ON DELETE SET NULL</w:t>
-            </w:r>
-          </w:p>
-        </w:tc>
-        <w:tc>
-          <w:tcPr>
-            <w:tcW w:type="dxa" w:w="2340"/>
-            <w:shd w:val="clear" w:color="auto" w:fill="F5F7F7"/>
-          </w:tcPr>
-          <w:p>
-            <w:r>
-              <w:t>Integridad referencial con propietario.</w:t>
-            </w:r>
-          </w:p>
-        </w:tc>
-      </w:tr>
-      <w:tr>
-        <w:tc>
-          <w:tcPr>
-            <w:tcW w:type="dxa" w:w="2340"/>
-          </w:tcPr>
-          <w:p>
-            <w:r>
-              <w:t>UNIQUE</w:t>
-            </w:r>
-          </w:p>
-        </w:tc>
-        <w:tc>
-          <w:tcPr>
-            <w:tcW w:type="dxa" w:w="2340"/>
-          </w:tcPr>
-          <w:p>
-            <w:r>
-              <w:t>profiles.email, properties.slug</w:t>
-            </w:r>
-          </w:p>
-        </w:tc>
-        <w:tc>
-          <w:tcPr>
-            <w:tcW w:type="dxa" w:w="2340"/>
-          </w:tcPr>
-          <w:p>
-            <w:r>
-              <w:t>email VARCHAR(150) UNIQUE NOT NULL</w:t>
-            </w:r>
-          </w:p>
-        </w:tc>
-        <w:tc>
-          <w:tcPr>
-            <w:tcW w:type="dxa" w:w="2340"/>
-          </w:tcPr>
-          <w:p>
-            <w:r>
-              <w:t>Evita correos o URLs duplicadas.</w:t>
-            </w:r>
-          </w:p>
-        </w:tc>
-      </w:tr>
-      <w:tr>
-        <w:tc>
-          <w:tcPr>
-            <w:tcW w:type="dxa" w:w="2340"/>
-            <w:shd w:val="clear" w:color="auto" w:fill="F5F7F7"/>
-          </w:tcPr>
-          <w:p>
-            <w:r>
-              <w:t>NOT NULL</w:t>
-            </w:r>
-          </w:p>
-        </w:tc>
-        <w:tc>
-          <w:tcPr>
-            <w:tcW w:type="dxa" w:w="2340"/>
-            <w:shd w:val="clear" w:color="auto" w:fill="F5F7F7"/>
-          </w:tcPr>
-          <w:p>
-            <w:r>
-              <w:t>properties.title, properties.price</w:t>
-            </w:r>
-          </w:p>
-        </w:tc>
-        <w:tc>
-          <w:tcPr>
-            <w:tcW w:type="dxa" w:w="2340"/>
-            <w:shd w:val="clear" w:color="auto" w:fill="F5F7F7"/>
-          </w:tcPr>
-          <w:p>
-            <w:r>
-              <w:t>title VARCHAR(200) NOT NULL</w:t>
-            </w:r>
-          </w:p>
-        </w:tc>
-        <w:tc>
-          <w:tcPr>
-            <w:tcW w:type="dxa" w:w="2340"/>
-            <w:shd w:val="clear" w:color="auto" w:fill="F5F7F7"/>
-          </w:tcPr>
-          <w:p>
-            <w:r>
-              <w:t>Impide datos nulos o incompletos.</w:t>
-            </w:r>
-          </w:p>
-        </w:tc>
-      </w:tr>
-      <w:tr>
-        <w:tc>
-          <w:tcPr>
-            <w:tcW w:type="dxa" w:w="2340"/>
-          </w:tcPr>
-          <w:p>
-            <w:r>
-              <w:t>CHECK</w:t>
-            </w:r>
-          </w:p>
-        </w:tc>
-        <w:tc>
-          <w:tcPr>
-            <w:tcW w:type="dxa" w:w="2340"/>
-          </w:tcPr>
-          <w:p>
-            <w:r>
-              <w:t>properties.price, profiles.role</w:t>
-            </w:r>
-          </w:p>
-        </w:tc>
-        <w:tc>
-          <w:tcPr>
-            <w:tcW w:type="dxa" w:w="2340"/>
-          </w:tcPr>
-          <w:p>
-            <w:r>
-              <w:t>CHECK (price &gt;= 0), CHECK (role IN (...))</w:t>
-            </w:r>
-          </w:p>
-        </w:tc>
-        <w:tc>
-          <w:tcPr>
-            <w:tcW w:type="dxa" w:w="2340"/>
-          </w:tcPr>
-          <w:p>
-            <w:r>
-              <w:t>Valida rangos y dominio de valores.</w:t>
-            </w:r>
-          </w:p>
-        </w:tc>
-      </w:tr>
-      <w:tr>
-        <w:tc>
-          <w:tcPr>
-            <w:tcW w:type="dxa" w:w="2340"/>
-            <w:shd w:val="clear" w:color="auto" w:fill="F5F7F7"/>
-          </w:tcPr>
-          <w:p>
-            <w:r>
-              <w:t>DEFAULT</w:t>
-            </w:r>
-          </w:p>
-        </w:tc>
-        <w:tc>
-          <w:tcPr>
-            <w:tcW w:type="dxa" w:w="2340"/>
-            <w:shd w:val="clear" w:color="auto" w:fill="F5F7F7"/>
-          </w:tcPr>
-          <w:p>
-            <w:r>
-              <w:t>profiles.role, properties.status</w:t>
-            </w:r>
-          </w:p>
-        </w:tc>
-        <w:tc>
-          <w:tcPr>
-            <w:tcW w:type="dxa" w:w="2340"/>
-            <w:shd w:val="clear" w:color="auto" w:fill="F5F7F7"/>
-          </w:tcPr>
-          <w:p>
-            <w:r>
-              <w:t>role DEFAULT 'Cliente'</w:t>
-            </w:r>
-          </w:p>
-        </w:tc>
-        <w:tc>
-          <w:tcPr>
-            <w:tcW w:type="dxa" w:w="2340"/>
-            <w:shd w:val="clear" w:color="auto" w:fill="F5F7F7"/>
-          </w:tcPr>
-          <w:p>
-            <w:r>
-              <w:t>Asigna valor predeterminado automático.</w:t>
-            </w:r>
-          </w:p>
-        </w:tc>
-      </w:tr>
-    </w:tbl>
-    <w:p/>
-    <w:p>
-      <w:pPr>
-        <w:pStyle w:val="Heading2"/>
-        <w:spacing w:before="280" w:after="120"/>
-      </w:pPr>
-      <w:r>
-        <w:rPr>
-          <w:b/>
-          <w:color w:val="19322F"/>
-          <w:sz w:val="26"/>
-        </w:rPr>
-        <w:t>Diccionario de Datos en Forma de Tablas (10 pts.)</w:t>
-      </w:r>
-    </w:p>
-    <w:p>
-      <w:pPr>
-        <w:pStyle w:val="Heading3"/>
-        <w:spacing w:before="280" w:after="120"/>
-      </w:pPr>
-      <w:r>
-        <w:rPr>
-          <w:b/>
-          <w:color w:val="5C706D"/>
-          <w:sz w:val="22"/>
-        </w:rPr>
-        <w:t>Tabla Relacional: properties</w:t>
-      </w:r>
-    </w:p>
-    <w:tbl>
-      <w:tblPr>
-        <w:tblW w:type="auto" w:w="0"/>
-        <w:jc w:val="center"/>
-        <w:tblLook w:firstColumn="1" w:firstRow="1" w:lastColumn="0" w:lastRow="0" w:noHBand="0" w:noVBand="1" w:val="04A0"/>
-      </w:tblPr>
-      <w:tblGrid>
-        <w:gridCol w:w="1337"/>
-        <w:gridCol w:w="1337"/>
-        <w:gridCol w:w="1337"/>
-        <w:gridCol w:w="1337"/>
-        <w:gridCol w:w="1337"/>
-        <w:gridCol w:w="1337"/>
-        <w:gridCol w:w="1337"/>
-      </w:tblGrid>
-      <w:tr>
-        <w:tc>
-          <w:tcPr>
-            <w:tcW w:type="dxa" w:w="1337"/>
-            <w:shd w:val="clear" w:color="auto" w:fill="006655"/>
-          </w:tcPr>
-          <w:p>
-            <w:r>
-              <w:rPr>
-                <w:b/>
-                <w:color w:val="FFFFFF"/>
-              </w:rPr>
-              <w:t>Campo</w:t>
-            </w:r>
-          </w:p>
-        </w:tc>
-        <w:tc>
-          <w:tcPr>
-            <w:tcW w:type="dxa" w:w="1337"/>
-            <w:shd w:val="clear" w:color="auto" w:fill="006655"/>
-          </w:tcPr>
-          <w:p>
-            <w:r>
-              <w:rPr>
-                <w:b/>
-                <w:color w:val="FFFFFF"/>
-              </w:rPr>
-              <w:t>Tipo</w:t>
-            </w:r>
-          </w:p>
-        </w:tc>
-        <w:tc>
-          <w:tcPr>
-            <w:tcW w:type="dxa" w:w="1337"/>
-            <w:shd w:val="clear" w:color="auto" w:fill="006655"/>
-          </w:tcPr>
-          <w:p>
-            <w:r>
-              <w:rPr>
-                <w:b/>
-                <w:color w:val="FFFFFF"/>
-              </w:rPr>
-              <w:t>Long.</w:t>
-            </w:r>
-          </w:p>
-        </w:tc>
-        <w:tc>
-          <w:tcPr>
-            <w:tcW w:type="dxa" w:w="1337"/>
-            <w:shd w:val="clear" w:color="auto" w:fill="006655"/>
-          </w:tcPr>
-          <w:p>
-            <w:r>
-              <w:rPr>
-                <w:b/>
-                <w:color w:val="FFFFFF"/>
-              </w:rPr>
-              <w:t>Llave</w:t>
-            </w:r>
-          </w:p>
-        </w:tc>
-        <w:tc>
-          <w:tcPr>
-            <w:tcW w:type="dxa" w:w="1337"/>
-            <w:shd w:val="clear" w:color="auto" w:fill="006655"/>
-          </w:tcPr>
-          <w:p>
-            <w:r>
-              <w:rPr>
-                <w:b/>
-                <w:color w:val="FFFFFF"/>
-              </w:rPr>
-              <w:t>Nulo</w:t>
-            </w:r>
-          </w:p>
-        </w:tc>
-        <w:tc>
-          <w:tcPr>
-            <w:tcW w:type="dxa" w:w="1337"/>
-            <w:shd w:val="clear" w:color="auto" w:fill="006655"/>
-          </w:tcPr>
-          <w:p>
-            <w:r>
-              <w:rPr>
-                <w:b/>
-                <w:color w:val="FFFFFF"/>
-              </w:rPr>
-              <w:t>Descripción</w:t>
-            </w:r>
-          </w:p>
-        </w:tc>
-        <w:tc>
-          <w:tcPr>
-            <w:tcW w:type="dxa" w:w="1337"/>
-            <w:shd w:val="clear" w:color="auto" w:fill="006655"/>
-          </w:tcPr>
-          <w:p>
-            <w:r>
-              <w:rPr>
-                <w:b/>
-                <w:color w:val="FFFFFF"/>
-              </w:rPr>
-              <w:t>Restricciones</w:t>
-            </w:r>
-          </w:p>
-        </w:tc>
-      </w:tr>
-      <w:tr>
-        <w:tc>
-          <w:tcPr>
-            <w:tcW w:type="dxa" w:w="1337"/>
-          </w:tcPr>
-          <w:p>
-            <w:r>
-              <w:t>id</w:t>
-            </w:r>
-          </w:p>
-        </w:tc>
-        <w:tc>
-          <w:tcPr>
-            <w:tcW w:type="dxa" w:w="1337"/>
-          </w:tcPr>
-          <w:p>
-            <w:r>
-              <w:t>UUID</w:t>
-            </w:r>
-          </w:p>
-        </w:tc>
-        <w:tc>
-          <w:tcPr>
-            <w:tcW w:type="dxa" w:w="1337"/>
-          </w:tcPr>
-          <w:p>
-            <w:r>
-              <w:t>36</w:t>
-            </w:r>
-          </w:p>
-        </w:tc>
-        <w:tc>
-          <w:tcPr>
-            <w:tcW w:type="dxa" w:w="1337"/>
-          </w:tcPr>
-          <w:p>
-            <w:r>
-              <w:t>PK</w:t>
-            </w:r>
-          </w:p>
-        </w:tc>
-        <w:tc>
-          <w:tcPr>
-            <w:tcW w:type="dxa" w:w="1337"/>
-          </w:tcPr>
-          <w:p>
-            <w:r>
-              <w:t>NO</w:t>
-            </w:r>
-          </w:p>
-        </w:tc>
-        <w:tc>
-          <w:tcPr>
-            <w:tcW w:type="dxa" w:w="1337"/>
-          </w:tcPr>
-          <w:p>
-            <w:r>
-              <w:t>Identificador único</w:t>
-            </w:r>
-          </w:p>
-        </w:tc>
-        <w:tc>
-          <w:tcPr>
-            <w:tcW w:type="dxa" w:w="1337"/>
-          </w:tcPr>
-          <w:p>
-            <w:r>
-              <w:t>gen_random_uuid()</w:t>
-            </w:r>
-          </w:p>
-        </w:tc>
-      </w:tr>
-      <w:tr>
-        <w:tc>
-          <w:tcPr>
-            <w:tcW w:type="dxa" w:w="1337"/>
-            <w:shd w:val="clear" w:color="auto" w:fill="F5F7F7"/>
-          </w:tcPr>
-          <w:p>
-            <w:r>
-              <w:t>slug</w:t>
-            </w:r>
-          </w:p>
-        </w:tc>
-        <w:tc>
-          <w:tcPr>
-            <w:tcW w:type="dxa" w:w="1337"/>
-            <w:shd w:val="clear" w:color="auto" w:fill="F5F7F7"/>
-          </w:tcPr>
-          <w:p>
-            <w:r>
-              <w:t>VARCHAR</w:t>
-            </w:r>
-          </w:p>
-        </w:tc>
-        <w:tc>
-          <w:tcPr>
-            <w:tcW w:type="dxa" w:w="1337"/>
-            <w:shd w:val="clear" w:color="auto" w:fill="F5F7F7"/>
-          </w:tcPr>
-          <w:p>
-            <w:r>
-              <w:t>200</w:t>
-            </w:r>
-          </w:p>
-        </w:tc>
-        <w:tc>
-          <w:tcPr>
-            <w:tcW w:type="dxa" w:w="1337"/>
-            <w:shd w:val="clear" w:color="auto" w:fill="F5F7F7"/>
-          </w:tcPr>
-          <w:p>
-            <w:r>
-              <w:t>UQ</w:t>
-            </w:r>
-          </w:p>
-        </w:tc>
-        <w:tc>
-          <w:tcPr>
-            <w:tcW w:type="dxa" w:w="1337"/>
-            <w:shd w:val="clear" w:color="auto" w:fill="F5F7F7"/>
-          </w:tcPr>
-          <w:p>
-            <w:r>
-              <w:t>NO</w:t>
-            </w:r>
-          </w:p>
-        </w:tc>
-        <w:tc>
-          <w:tcPr>
-            <w:tcW w:type="dxa" w:w="1337"/>
-            <w:shd w:val="clear" w:color="auto" w:fill="F5F7F7"/>
-          </w:tcPr>
-          <w:p>
-            <w:r>
-              <w:t>URL amigable de propiedad</w:t>
-            </w:r>
-          </w:p>
-        </w:tc>
-        <w:tc>
-          <w:tcPr>
-            <w:tcW w:type="dxa" w:w="1337"/>
-            <w:shd w:val="clear" w:color="auto" w:fill="F5F7F7"/>
-          </w:tcPr>
-          <w:p>
-            <w:r>
-              <w:t>UNIQUE, NOT NULL</w:t>
-            </w:r>
-          </w:p>
-        </w:tc>
-      </w:tr>
-      <w:tr>
-        <w:tc>
-          <w:tcPr>
-            <w:tcW w:type="dxa" w:w="1337"/>
-          </w:tcPr>
-          <w:p>
-            <w:r>
-              <w:t>title</w:t>
-            </w:r>
-          </w:p>
-        </w:tc>
-        <w:tc>
-          <w:tcPr>
-            <w:tcW w:type="dxa" w:w="1337"/>
-          </w:tcPr>
-          <w:p>
-            <w:r>
-              <w:t>VARCHAR</w:t>
-            </w:r>
-          </w:p>
-        </w:tc>
-        <w:tc>
-          <w:tcPr>
-            <w:tcW w:type="dxa" w:w="1337"/>
-          </w:tcPr>
-          <w:p>
-            <w:r>
-              <w:t>200</w:t>
-            </w:r>
-          </w:p>
-        </w:tc>
-        <w:tc>
-          <w:tcPr>
-            <w:tcW w:type="dxa" w:w="1337"/>
-          </w:tcPr>
-          <w:p>
-            <w:r>
-              <w:t>-</w:t>
-            </w:r>
-          </w:p>
-        </w:tc>
-        <w:tc>
-          <w:tcPr>
-            <w:tcW w:type="dxa" w:w="1337"/>
-          </w:tcPr>
-          <w:p>
-            <w:r>
-              <w:t>NO</w:t>
-            </w:r>
-          </w:p>
-        </w:tc>
-        <w:tc>
-          <w:tcPr>
-            <w:tcW w:type="dxa" w:w="1337"/>
-          </w:tcPr>
-          <w:p>
-            <w:r>
-              <w:t>Nombre del inmueble</w:t>
-            </w:r>
-          </w:p>
-        </w:tc>
-        <w:tc>
-          <w:tcPr>
-            <w:tcW w:type="dxa" w:w="1337"/>
-          </w:tcPr>
-          <w:p>
-            <w:r>
-              <w:t>NOT NULL</w:t>
-            </w:r>
-          </w:p>
-        </w:tc>
-      </w:tr>
-      <w:tr>
-        <w:tc>
-          <w:tcPr>
-            <w:tcW w:type="dxa" w:w="1337"/>
-            <w:shd w:val="clear" w:color="auto" w:fill="F5F7F7"/>
-          </w:tcPr>
-          <w:p>
-            <w:r>
-              <w:t>price</w:t>
-            </w:r>
-          </w:p>
-        </w:tc>
-        <w:tc>
-          <w:tcPr>
-            <w:tcW w:type="dxa" w:w="1337"/>
-            <w:shd w:val="clear" w:color="auto" w:fill="F5F7F7"/>
-          </w:tcPr>
-          <w:p>
-            <w:r>
-              <w:t>NUMERIC</w:t>
-            </w:r>
-          </w:p>
-        </w:tc>
-        <w:tc>
-          <w:tcPr>
-            <w:tcW w:type="dxa" w:w="1337"/>
-            <w:shd w:val="clear" w:color="auto" w:fill="F5F7F7"/>
-          </w:tcPr>
-          <w:p>
-            <w:r>
-              <w:t>15,2</w:t>
-            </w:r>
-          </w:p>
-        </w:tc>
-        <w:tc>
-          <w:tcPr>
-            <w:tcW w:type="dxa" w:w="1337"/>
-            <w:shd w:val="clear" w:color="auto" w:fill="F5F7F7"/>
-          </w:tcPr>
-          <w:p>
-            <w:r>
-              <w:t>-</w:t>
-            </w:r>
-          </w:p>
-        </w:tc>
-        <w:tc>
-          <w:tcPr>
-            <w:tcW w:type="dxa" w:w="1337"/>
-            <w:shd w:val="clear" w:color="auto" w:fill="F5F7F7"/>
-          </w:tcPr>
-          <w:p>
-            <w:r>
-              <w:t>NO</w:t>
-            </w:r>
-          </w:p>
-        </w:tc>
-        <w:tc>
-          <w:tcPr>
-            <w:tcW w:type="dxa" w:w="1337"/>
-            <w:shd w:val="clear" w:color="auto" w:fill="F5F7F7"/>
-          </w:tcPr>
-          <w:p>
-            <w:r>
-              <w:t>Precio publicado en USD</w:t>
-            </w:r>
-          </w:p>
-        </w:tc>
-        <w:tc>
-          <w:tcPr>
-            <w:tcW w:type="dxa" w:w="1337"/>
-            <w:shd w:val="clear" w:color="auto" w:fill="F5F7F7"/>
-          </w:tcPr>
-          <w:p>
-            <w:r>
-              <w:t>CHECK (price &gt;= 0)</w:t>
-            </w:r>
-          </w:p>
-        </w:tc>
-      </w:tr>
-      <w:tr>
-        <w:tc>
-          <w:tcPr>
-            <w:tcW w:type="dxa" w:w="1337"/>
-          </w:tcPr>
-          <w:p>
-            <w:r>
-              <w:t>status</w:t>
-            </w:r>
-          </w:p>
-        </w:tc>
-        <w:tc>
-          <w:tcPr>
-            <w:tcW w:type="dxa" w:w="1337"/>
-          </w:tcPr>
-          <w:p>
-            <w:r>
-              <w:t>VARCHAR</w:t>
-            </w:r>
-          </w:p>
-        </w:tc>
-        <w:tc>
-          <w:tcPr>
-            <w:tcW w:type="dxa" w:w="1337"/>
-          </w:tcPr>
-          <w:p>
-            <w:r>
-              <w:t>20</w:t>
-            </w:r>
-          </w:p>
-        </w:tc>
-        <w:tc>
-          <w:tcPr>
-            <w:tcW w:type="dxa" w:w="1337"/>
-          </w:tcPr>
-          <w:p>
-            <w:r>
-              <w:t>-</w:t>
-            </w:r>
-          </w:p>
-        </w:tc>
-        <w:tc>
-          <w:tcPr>
-            <w:tcW w:type="dxa" w:w="1337"/>
-          </w:tcPr>
-          <w:p>
-            <w:r>
-              <w:t>NO</w:t>
-            </w:r>
-          </w:p>
-        </w:tc>
-        <w:tc>
-          <w:tcPr>
-            <w:tcW w:type="dxa" w:w="1337"/>
-          </w:tcPr>
-          <w:p>
-            <w:r>
-              <w:t>Estado comercial</w:t>
-            </w:r>
-          </w:p>
-        </w:tc>
-        <w:tc>
-          <w:tcPr>
-            <w:tcW w:type="dxa" w:w="1337"/>
-          </w:tcPr>
-          <w:p>
-            <w:r>
-              <w:t>CHECK status IN (...)</w:t>
-            </w:r>
-          </w:p>
-        </w:tc>
-      </w:tr>
-      <w:tr>
-        <w:tc>
-          <w:tcPr>
-            <w:tcW w:type="dxa" w:w="1337"/>
-            <w:shd w:val="clear" w:color="auto" w:fill="F5F7F7"/>
-          </w:tcPr>
-          <w:p>
-            <w:r>
-              <w:t>beds</w:t>
-            </w:r>
-          </w:p>
-        </w:tc>
-        <w:tc>
-          <w:tcPr>
-            <w:tcW w:type="dxa" w:w="1337"/>
-            <w:shd w:val="clear" w:color="auto" w:fill="F5F7F7"/>
-          </w:tcPr>
-          <w:p>
-            <w:r>
-              <w:t>INT</w:t>
-            </w:r>
-          </w:p>
-        </w:tc>
-        <w:tc>
-          <w:tcPr>
-            <w:tcW w:type="dxa" w:w="1337"/>
-            <w:shd w:val="clear" w:color="auto" w:fill="F5F7F7"/>
-          </w:tcPr>
-          <w:p>
-            <w:r>
-              <w:t>4</w:t>
-            </w:r>
-          </w:p>
-        </w:tc>
-        <w:tc>
-          <w:tcPr>
-            <w:tcW w:type="dxa" w:w="1337"/>
-            <w:shd w:val="clear" w:color="auto" w:fill="F5F7F7"/>
-          </w:tcPr>
-          <w:p>
-            <w:r>
-              <w:t>-</w:t>
-            </w:r>
-          </w:p>
-        </w:tc>
-        <w:tc>
-          <w:tcPr>
-            <w:tcW w:type="dxa" w:w="1337"/>
-            <w:shd w:val="clear" w:color="auto" w:fill="F5F7F7"/>
-          </w:tcPr>
-          <w:p>
-            <w:r>
-              <w:t>NO</w:t>
-            </w:r>
-          </w:p>
-        </w:tc>
-        <w:tc>
-          <w:tcPr>
-            <w:tcW w:type="dxa" w:w="1337"/>
-            <w:shd w:val="clear" w:color="auto" w:fill="F5F7F7"/>
-          </w:tcPr>
-          <w:p>
-            <w:r>
-              <w:t>Número de recámaras</w:t>
-            </w:r>
-          </w:p>
-        </w:tc>
-        <w:tc>
-          <w:tcPr>
-            <w:tcW w:type="dxa" w:w="1337"/>
-            <w:shd w:val="clear" w:color="auto" w:fill="F5F7F7"/>
-          </w:tcPr>
-          <w:p>
-            <w:r>
-              <w:t>CHECK (beds &gt;= 0)</w:t>
-            </w:r>
-          </w:p>
-        </w:tc>
-      </w:tr>
-      <w:tr>
-        <w:tc>
-          <w:tcPr>
-            <w:tcW w:type="dxa" w:w="1337"/>
-          </w:tcPr>
-          <w:p>
-            <w:r>
-              <w:t>baths</w:t>
-            </w:r>
-          </w:p>
-        </w:tc>
-        <w:tc>
-          <w:tcPr>
-            <w:tcW w:type="dxa" w:w="1337"/>
-          </w:tcPr>
-          <w:p>
-            <w:r>
-              <w:t>NUMERIC</w:t>
-            </w:r>
-          </w:p>
-        </w:tc>
-        <w:tc>
-          <w:tcPr>
-            <w:tcW w:type="dxa" w:w="1337"/>
-          </w:tcPr>
-          <w:p>
-            <w:r>
-              <w:t>3,1</w:t>
-            </w:r>
-          </w:p>
-        </w:tc>
-        <w:tc>
-          <w:tcPr>
-            <w:tcW w:type="dxa" w:w="1337"/>
-          </w:tcPr>
-          <w:p>
-            <w:r>
-              <w:t>-</w:t>
-            </w:r>
-          </w:p>
-        </w:tc>
-        <w:tc>
-          <w:tcPr>
-            <w:tcW w:type="dxa" w:w="1337"/>
-          </w:tcPr>
-          <w:p>
-            <w:r>
-              <w:t>NO</w:t>
-            </w:r>
-          </w:p>
-        </w:tc>
-        <w:tc>
-          <w:tcPr>
-            <w:tcW w:type="dxa" w:w="1337"/>
-          </w:tcPr>
-          <w:p>
-            <w:r>
-              <w:t>Número de baños</w:t>
-            </w:r>
-          </w:p>
-        </w:tc>
-        <w:tc>
-          <w:tcPr>
-            <w:tcW w:type="dxa" w:w="1337"/>
-          </w:tcPr>
-          <w:p>
-            <w:r>
-              <w:t>DEFAULT 1.0</w:t>
-            </w:r>
-          </w:p>
-        </w:tc>
-      </w:tr>
-      <w:tr>
-        <w:tc>
-          <w:tcPr>
-            <w:tcW w:type="dxa" w:w="1337"/>
-            <w:shd w:val="clear" w:color="auto" w:fill="F5F7F7"/>
-          </w:tcPr>
-          <w:p>
-            <w:r>
-              <w:t>sqft</w:t>
-            </w:r>
-          </w:p>
-        </w:tc>
-        <w:tc>
-          <w:tcPr>
-            <w:tcW w:type="dxa" w:w="1337"/>
-            <w:shd w:val="clear" w:color="auto" w:fill="F5F7F7"/>
-          </w:tcPr>
-          <w:p>
-            <w:r>
-              <w:t>INT</w:t>
-            </w:r>
-          </w:p>
-        </w:tc>
-        <w:tc>
-          <w:tcPr>
-            <w:tcW w:type="dxa" w:w="1337"/>
-            <w:shd w:val="clear" w:color="auto" w:fill="F5F7F7"/>
-          </w:tcPr>
-          <w:p>
-            <w:r>
-              <w:t>4</w:t>
-            </w:r>
-          </w:p>
-        </w:tc>
-        <w:tc>
-          <w:tcPr>
-            <w:tcW w:type="dxa" w:w="1337"/>
-            <w:shd w:val="clear" w:color="auto" w:fill="F5F7F7"/>
-          </w:tcPr>
-          <w:p>
-            <w:r>
-              <w:t>-</w:t>
-            </w:r>
-          </w:p>
-        </w:tc>
-        <w:tc>
-          <w:tcPr>
-            <w:tcW w:type="dxa" w:w="1337"/>
-            <w:shd w:val="clear" w:color="auto" w:fill="F5F7F7"/>
-          </w:tcPr>
-          <w:p>
-            <w:r>
-              <w:t>NO</w:t>
-            </w:r>
-          </w:p>
-        </w:tc>
-        <w:tc>
-          <w:tcPr>
-            <w:tcW w:type="dxa" w:w="1337"/>
-            <w:shd w:val="clear" w:color="auto" w:fill="F5F7F7"/>
-          </w:tcPr>
-          <w:p>
-            <w:r>
-              <w:t>Superficie en m²</w:t>
-            </w:r>
-          </w:p>
-        </w:tc>
-        <w:tc>
-          <w:tcPr>
-            <w:tcW w:type="dxa" w:w="1337"/>
-            <w:shd w:val="clear" w:color="auto" w:fill="F5F7F7"/>
-          </w:tcPr>
-          <w:p>
-            <w:r>
-              <w:t>CHECK (sqft &gt; 0)</w:t>
-            </w:r>
-          </w:p>
-        </w:tc>
-      </w:tr>
-      <w:tr>
-        <w:tc>
-          <w:tcPr>
-            <w:tcW w:type="dxa" w:w="1337"/>
-          </w:tcPr>
-          <w:p>
-            <w:r>
-              <w:t>location</w:t>
-            </w:r>
-          </w:p>
-        </w:tc>
-        <w:tc>
-          <w:tcPr>
-            <w:tcW w:type="dxa" w:w="1337"/>
-          </w:tcPr>
-          <w:p>
-            <w:r>
-              <w:t>VARCHAR</w:t>
-            </w:r>
-          </w:p>
-        </w:tc>
-        <w:tc>
-          <w:tcPr>
-            <w:tcW w:type="dxa" w:w="1337"/>
-          </w:tcPr>
-          <w:p>
-            <w:r>
-              <w:t>150</w:t>
-            </w:r>
-          </w:p>
-        </w:tc>
-        <w:tc>
-          <w:tcPr>
-            <w:tcW w:type="dxa" w:w="1337"/>
-          </w:tcPr>
-          <w:p>
-            <w:r>
-              <w:t>-</w:t>
-            </w:r>
-          </w:p>
-        </w:tc>
-        <w:tc>
-          <w:tcPr>
-            <w:tcW w:type="dxa" w:w="1337"/>
-          </w:tcPr>
-          <w:p>
-            <w:r>
-              <w:t>NO</w:t>
-            </w:r>
-          </w:p>
-        </w:tc>
-        <w:tc>
-          <w:tcPr>
-            <w:tcW w:type="dxa" w:w="1337"/>
-          </w:tcPr>
-          <w:p>
-            <w:r>
-              <w:t>Ciudad y Estado</w:t>
-            </w:r>
-          </w:p>
-        </w:tc>
-        <w:tc>
-          <w:tcPr>
-            <w:tcW w:type="dxa" w:w="1337"/>
-          </w:tcPr>
-          <w:p>
-            <w:r>
-              <w:t>NOT NULL</w:t>
-            </w:r>
-          </w:p>
-        </w:tc>
-      </w:tr>
-      <w:tr>
-        <w:tc>
-          <w:tcPr>
-            <w:tcW w:type="dxa" w:w="1337"/>
-            <w:shd w:val="clear" w:color="auto" w:fill="F5F7F7"/>
-          </w:tcPr>
-          <w:p>
-            <w:r>
-              <w:t>owner_id</w:t>
-            </w:r>
-          </w:p>
-        </w:tc>
-        <w:tc>
-          <w:tcPr>
-            <w:tcW w:type="dxa" w:w="1337"/>
-            <w:shd w:val="clear" w:color="auto" w:fill="F5F7F7"/>
-          </w:tcPr>
-          <w:p>
-            <w:r>
-              <w:t>UUID</w:t>
-            </w:r>
-          </w:p>
-        </w:tc>
-        <w:tc>
-          <w:tcPr>
-            <w:tcW w:type="dxa" w:w="1337"/>
-            <w:shd w:val="clear" w:color="auto" w:fill="F5F7F7"/>
-          </w:tcPr>
-          <w:p>
-            <w:r>
-              <w:t>36</w:t>
-            </w:r>
-          </w:p>
-        </w:tc>
-        <w:tc>
-          <w:tcPr>
-            <w:tcW w:type="dxa" w:w="1337"/>
-            <w:shd w:val="clear" w:color="auto" w:fill="F5F7F7"/>
-          </w:tcPr>
-          <w:p>
-            <w:r>
-              <w:t>FK</w:t>
-            </w:r>
-          </w:p>
-        </w:tc>
-        <w:tc>
-          <w:tcPr>
-            <w:tcW w:type="dxa" w:w="1337"/>
-            <w:shd w:val="clear" w:color="auto" w:fill="F5F7F7"/>
-          </w:tcPr>
-          <w:p>
-            <w:r>
-              <w:t>SI</w:t>
-            </w:r>
-          </w:p>
-        </w:tc>
-        <w:tc>
-          <w:tcPr>
-            <w:tcW w:type="dxa" w:w="1337"/>
-            <w:shd w:val="clear" w:color="auto" w:fill="F5F7F7"/>
-          </w:tcPr>
-          <w:p>
-            <w:r>
-              <w:t>ID del propietario</w:t>
-            </w:r>
-          </w:p>
-        </w:tc>
-        <w:tc>
-          <w:tcPr>
-            <w:tcW w:type="dxa" w:w="1337"/>
-            <w:shd w:val="clear" w:color="auto" w:fill="F5F7F7"/>
-          </w:tcPr>
-          <w:p>
-            <w:r>
-              <w:t>REFERENCES profiles(id)</w:t>
-            </w:r>
-          </w:p>
-        </w:tc>
-      </w:tr>
-    </w:tbl>
-    <w:p/>
-    <w:p>
-      <w:pPr>
-        <w:pStyle w:val="Heading2"/>
-        <w:spacing w:before="280" w:after="120"/>
-      </w:pPr>
-      <w:r>
-        <w:rPr>
-          <w:b/>
-          <w:color w:val="19322F"/>
-          <w:sz w:val="26"/>
-        </w:rPr>
-        <w:t>Creación de las Bases de Datos e Inserción de Registros (15 pts.)</w:t>
-      </w:r>
-    </w:p>
-    <w:p>
-      <w:r>
-        <w:t>- Base de Datos Relacional (PostgreSQL): Creada mediante el script DDL con 50 registros reales y coherentes por cada una de las 4 tablas (profiles, properties, user_favorites, appointments), alcanzando 200 registros.</w:t>
-        <w:br/>
-        <w:t>- Base de Datos No Relacional (MongoDB): Creada mediante script de colección e índices, poblada con 10,000 documentos BSON de analítica masiva en `mongodb_nosql_dataset.json`.</w:t>
-      </w:r>
-    </w:p>
-    <w:p>
-      <w:pPr>
-        <w:pStyle w:val="Heading2"/>
-        <w:spacing w:before="280" w:after="120"/>
-      </w:pPr>
-      <w:r>
-        <w:rPr>
-          <w:b/>
-          <w:color w:val="19322F"/>
-          <w:sz w:val="26"/>
-        </w:rPr>
-        <w:t>Script Completo y Copia de Seguridad / Backup (4 pts.)</w:t>
-      </w:r>
-    </w:p>
-    <w:p>
-      <w:r>
-        <w:t>Se adjuntan en la carpeta `Documentacion` los archivos correspondientes:</w:t>
-        <w:br/>
-        <w:t>- `schema_and_data_postgresql.sql`: Script DDL y DML relacional completo.</w:t>
-        <w:br/>
-        <w:t>- `mongodb_nosql_dataset.json`: Dataset BSON de 10,000 registros para MongoDB.</w:t>
-      </w:r>
-    </w:p>
-    <w:p>
-      <w:pPr>
-        <w:pStyle w:val="Heading2"/>
-        <w:spacing w:before="280" w:after="120"/>
-      </w:pPr>
-      <w:r>
-        <w:rPr>
-          <w:b/>
-          <w:color w:val="19322F"/>
-          <w:sz w:val="26"/>
-        </w:rPr>
-        <w:t>Proyecto Web con Conexión a Base de Datos (20 pts.)</w:t>
-      </w:r>
-    </w:p>
-    <w:p>
-      <w:r>
-        <w:t>Aplicación web desarrollada en Next.js 16 (App Router), React 19, TypeScript y Tailwind CSS 4. Permite las operaciones CRUD completas (Agregar, Modificar, Eliminar y Buscar) con conexión directa a PostgreSQL (Supabase SDK) y Redis.</w:t>
-      </w:r>
-    </w:p>
-    <w:p>
-      <w:pPr>
-        <w:pStyle w:val="Heading2"/>
-        <w:spacing w:before="280" w:after="120"/>
-      </w:pPr>
-      <w:r>
-        <w:rPr>
-          <w:b/>
-          <w:color w:val="19322F"/>
-          <w:sz w:val="26"/>
-        </w:rPr>
-        <w:t>Identificación de Objetos en la Base de Datos (10 pts.)</w:t>
-      </w:r>
-    </w:p>
-    <w:tbl>
-      <w:tblPr>
-        <w:tblW w:type="auto" w:w="0"/>
-        <w:jc w:val="center"/>
-        <w:tblLook w:firstColumn="1" w:firstRow="1" w:lastColumn="0" w:lastRow="0" w:noHBand="0" w:noVBand="1" w:val="04A0"/>
-      </w:tblPr>
-      <w:tblGrid>
-        <w:gridCol w:w="1872"/>
-        <w:gridCol w:w="1872"/>
-        <w:gridCol w:w="1872"/>
-        <w:gridCol w:w="1872"/>
-        <w:gridCol w:w="1872"/>
-      </w:tblGrid>
-      <w:tr>
-        <w:tc>
-          <w:tcPr>
-            <w:tcW w:type="dxa" w:w="1872"/>
-            <w:shd w:val="clear" w:color="auto" w:fill="006655"/>
-          </w:tcPr>
-          <w:p>
-            <w:r>
-              <w:rPr>
-                <w:b/>
-                <w:color w:val="FFFFFF"/>
-              </w:rPr>
-              <w:t>Objeto</w:t>
-            </w:r>
-          </w:p>
-        </w:tc>
-        <w:tc>
-          <w:tcPr>
-            <w:tcW w:type="dxa" w:w="1872"/>
-            <w:shd w:val="clear" w:color="auto" w:fill="006655"/>
-          </w:tcPr>
-          <w:p>
-            <w:r>
-              <w:rPr>
-                <w:b/>
-                <w:color w:val="FFFFFF"/>
-              </w:rPr>
-              <w:t>Nombre BD</w:t>
-            </w:r>
-          </w:p>
-        </w:tc>
-        <w:tc>
-          <w:tcPr>
-            <w:tcW w:type="dxa" w:w="1872"/>
-            <w:shd w:val="clear" w:color="auto" w:fill="006655"/>
-          </w:tcPr>
-          <w:p>
-            <w:r>
-              <w:rPr>
-                <w:b/>
-                <w:color w:val="FFFFFF"/>
-              </w:rPr>
-              <w:t>Función Operativa</w:t>
-            </w:r>
-          </w:p>
-        </w:tc>
-        <w:tc>
-          <w:tcPr>
-            <w:tcW w:type="dxa" w:w="1872"/>
-            <w:shd w:val="clear" w:color="auto" w:fill="006655"/>
-          </w:tcPr>
-          <w:p>
-            <w:r>
-              <w:rPr>
-                <w:b/>
-                <w:color w:val="FFFFFF"/>
-              </w:rPr>
-              <w:t>Tablas Afectadas</w:t>
-            </w:r>
-          </w:p>
-        </w:tc>
-        <w:tc>
-          <w:tcPr>
-            <w:tcW w:type="dxa" w:w="1872"/>
-            <w:shd w:val="clear" w:color="auto" w:fill="006655"/>
-          </w:tcPr>
-          <w:p>
-            <w:r>
-              <w:rPr>
-                <w:b/>
-                <w:color w:val="FFFFFF"/>
-              </w:rPr>
-              <w:t>Ubicación Motor</w:t>
-            </w:r>
-          </w:p>
-        </w:tc>
-      </w:tr>
-      <w:tr>
-        <w:tc>
-          <w:tcPr>
-            <w:tcW w:type="dxa" w:w="1872"/>
-          </w:tcPr>
-          <w:p>
-            <w:r>
-              <w:t>Tabla Base</w:t>
-            </w:r>
-          </w:p>
-        </w:tc>
-        <w:tc>
-          <w:tcPr>
-            <w:tcW w:type="dxa" w:w="1872"/>
-          </w:tcPr>
-          <w:p>
-            <w:r>
-              <w:t>properties</w:t>
-            </w:r>
-          </w:p>
-        </w:tc>
-        <w:tc>
-          <w:tcPr>
-            <w:tcW w:type="dxa" w:w="1872"/>
-          </w:tcPr>
-          <w:p>
-            <w:r>
-              <w:t>Guarda el catálogo maestro de inmuebles</w:t>
-            </w:r>
-          </w:p>
-        </w:tc>
-        <w:tc>
-          <w:tcPr>
-            <w:tcW w:type="dxa" w:w="1872"/>
-          </w:tcPr>
-          <w:p>
-            <w:r>
-              <w:t>properties</w:t>
-            </w:r>
-          </w:p>
-        </w:tc>
-        <w:tc>
-          <w:tcPr>
-            <w:tcW w:type="dxa" w:w="1872"/>
-          </w:tcPr>
-          <w:p>
-            <w:r>
-              <w:t>Schema public / pg_class</w:t>
-            </w:r>
-          </w:p>
-        </w:tc>
-      </w:tr>
-      <w:tr>
-        <w:tc>
-          <w:tcPr>
-            <w:tcW w:type="dxa" w:w="1872"/>
-            <w:shd w:val="clear" w:color="auto" w:fill="F5F7F7"/>
-          </w:tcPr>
-          <w:p>
-            <w:r>
-              <w:t>Vista</w:t>
-            </w:r>
-          </w:p>
-        </w:tc>
-        <w:tc>
-          <w:tcPr>
-            <w:tcW w:type="dxa" w:w="1872"/>
-            <w:shd w:val="clear" w:color="auto" w:fill="F5F7F7"/>
-          </w:tcPr>
-          <w:p>
-            <w:r>
-              <w:t>vw_active_properties_summary</w:t>
-            </w:r>
-          </w:p>
-        </w:tc>
-        <w:tc>
-          <w:tcPr>
-            <w:tcW w:type="dxa" w:w="1872"/>
-            <w:shd w:val="clear" w:color="auto" w:fill="F5F7F7"/>
-          </w:tcPr>
-          <w:p>
-            <w:r>
-              <w:t>Proporciona resumen de inmuebles activos</w:t>
-            </w:r>
-          </w:p>
-        </w:tc>
-        <w:tc>
-          <w:tcPr>
-            <w:tcW w:type="dxa" w:w="1872"/>
-            <w:shd w:val="clear" w:color="auto" w:fill="F5F7F7"/>
-          </w:tcPr>
-          <w:p>
-            <w:r>
-              <w:t>properties, profiles</w:t>
-            </w:r>
-          </w:p>
-        </w:tc>
-        <w:tc>
-          <w:tcPr>
-            <w:tcW w:type="dxa" w:w="1872"/>
-            <w:shd w:val="clear" w:color="auto" w:fill="F5F7F7"/>
-          </w:tcPr>
-          <w:p>
-            <w:r>
-              <w:t>pg_views</w:t>
-            </w:r>
-          </w:p>
-        </w:tc>
-      </w:tr>
-      <w:tr>
-        <w:tc>
-          <w:tcPr>
-            <w:tcW w:type="dxa" w:w="1872"/>
-          </w:tcPr>
-          <w:p>
-            <w:r>
-              <w:t>Disparador</w:t>
-            </w:r>
-          </w:p>
-        </w:tc>
-        <w:tc>
-          <w:tcPr>
-            <w:tcW w:type="dxa" w:w="1872"/>
-          </w:tcPr>
-          <w:p>
-            <w:r>
-              <w:t>trg_properties_timestamp</w:t>
-            </w:r>
-          </w:p>
-        </w:tc>
-        <w:tc>
-          <w:tcPr>
-            <w:tcW w:type="dxa" w:w="1872"/>
-          </w:tcPr>
-          <w:p>
-            <w:r>
-              <w:t>Actualiza fecha de modificación automáticamente</w:t>
-            </w:r>
-          </w:p>
-        </w:tc>
-        <w:tc>
-          <w:tcPr>
-            <w:tcW w:type="dxa" w:w="1872"/>
-          </w:tcPr>
-          <w:p>
-            <w:r>
-              <w:t>properties</w:t>
-            </w:r>
-          </w:p>
-        </w:tc>
-        <w:tc>
-          <w:tcPr>
-            <w:tcW w:type="dxa" w:w="1872"/>
-          </w:tcPr>
-          <w:p>
-            <w:r>
-              <w:t>pg_trigger</w:t>
-            </w:r>
-          </w:p>
-        </w:tc>
-      </w:tr>
-      <w:tr>
-        <w:tc>
-          <w:tcPr>
-            <w:tcW w:type="dxa" w:w="1872"/>
-            <w:shd w:val="clear" w:color="auto" w:fill="F5F7F7"/>
-          </w:tcPr>
-          <w:p>
-            <w:r>
-              <w:t>Función</w:t>
-            </w:r>
-          </w:p>
-        </w:tc>
-        <w:tc>
-          <w:tcPr>
-            <w:tcW w:type="dxa" w:w="1872"/>
-            <w:shd w:val="clear" w:color="auto" w:fill="F5F7F7"/>
-          </w:tcPr>
-          <w:p>
-            <w:r>
-              <w:t>fn_calculate_kpis()</w:t>
-            </w:r>
-          </w:p>
-        </w:tc>
-        <w:tc>
-          <w:tcPr>
-            <w:tcW w:type="dxa" w:w="1872"/>
-            <w:shd w:val="clear" w:color="auto" w:fill="F5F7F7"/>
-          </w:tcPr>
-          <w:p>
-            <w:r>
-              <w:t>Calcula totales de propiedades y valor acumulado</w:t>
-            </w:r>
-          </w:p>
-        </w:tc>
-        <w:tc>
-          <w:tcPr>
-            <w:tcW w:type="dxa" w:w="1872"/>
-            <w:shd w:val="clear" w:color="auto" w:fill="F5F7F7"/>
-          </w:tcPr>
-          <w:p>
-            <w:r>
-              <w:t>properties</w:t>
-            </w:r>
-          </w:p>
-        </w:tc>
-        <w:tc>
-          <w:tcPr>
-            <w:tcW w:type="dxa" w:w="1872"/>
-            <w:shd w:val="clear" w:color="auto" w:fill="F5F7F7"/>
-          </w:tcPr>
-          <w:p>
-            <w:r>
-              <w:t>pg_proc</w:t>
-            </w:r>
-          </w:p>
-        </w:tc>
-      </w:tr>
-      <w:tr>
-        <w:tc>
-          <w:tcPr>
-            <w:tcW w:type="dxa" w:w="1872"/>
-          </w:tcPr>
-          <w:p>
-            <w:r>
-              <w:t>Procedimiento</w:t>
-            </w:r>
-          </w:p>
-        </w:tc>
-        <w:tc>
-          <w:tcPr>
-            <w:tcW w:type="dxa" w:w="1872"/>
-          </w:tcPr>
-          <w:p>
-            <w:r>
-              <w:t>sp_schedule_visit()</w:t>
-            </w:r>
-          </w:p>
-        </w:tc>
-        <w:tc>
-          <w:tcPr>
-            <w:tcW w:type="dxa" w:w="1872"/>
-          </w:tcPr>
-          <w:p>
-            <w:r>
-              <w:t>Ejecuta transaccionalmente el agendado de cita</w:t>
-            </w:r>
-          </w:p>
-        </w:tc>
-        <w:tc>
-          <w:tcPr>
-            <w:tcW w:type="dxa" w:w="1872"/>
-          </w:tcPr>
-          <w:p>
-            <w:r>
-              <w:t>appointments</w:t>
-            </w:r>
-          </w:p>
-        </w:tc>
-        <w:tc>
-          <w:tcPr>
-            <w:tcW w:type="dxa" w:w="1872"/>
-          </w:tcPr>
-          <w:p>
-            <w:r>
-              <w:t>pg_proc</w:t>
-            </w:r>
-          </w:p>
-        </w:tc>
-      </w:tr>
-      <w:tr>
-        <w:tc>
-          <w:tcPr>
-            <w:tcW w:type="dxa" w:w="1872"/>
-            <w:shd w:val="clear" w:color="auto" w:fill="F5F7F7"/>
-          </w:tcPr>
-          <w:p>
-            <w:r>
-              <w:t>Índice B-Tree</w:t>
-            </w:r>
-          </w:p>
-        </w:tc>
-        <w:tc>
-          <w:tcPr>
-            <w:tcW w:type="dxa" w:w="1872"/>
-            <w:shd w:val="clear" w:color="auto" w:fill="F5F7F7"/>
-          </w:tcPr>
-          <w:p>
-            <w:r>
-              <w:t>idx_properties_slug</w:t>
-            </w:r>
-          </w:p>
-        </w:tc>
-        <w:tc>
-          <w:tcPr>
-            <w:tcW w:type="dxa" w:w="1872"/>
-            <w:shd w:val="clear" w:color="auto" w:fill="F5F7F7"/>
-          </w:tcPr>
-          <w:p>
-            <w:r>
-              <w:t>Acelera búsquedas por URL en O(log N)</w:t>
-            </w:r>
-          </w:p>
-        </w:tc>
-        <w:tc>
-          <w:tcPr>
-            <w:tcW w:type="dxa" w:w="1872"/>
-            <w:shd w:val="clear" w:color="auto" w:fill="F5F7F7"/>
-          </w:tcPr>
-          <w:p>
-            <w:r>
-              <w:t>properties</w:t>
-            </w:r>
-          </w:p>
-        </w:tc>
-        <w:tc>
-          <w:tcPr>
-            <w:tcW w:type="dxa" w:w="1872"/>
-            <w:shd w:val="clear" w:color="auto" w:fill="F5F7F7"/>
-          </w:tcPr>
-          <w:p>
-            <w:r>
-              <w:t>pg_am</w:t>
-            </w:r>
-          </w:p>
-        </w:tc>
-      </w:tr>
-    </w:tbl>
-    <w:p/>
-    <w:p>
-      <w:pPr>
-        <w:pStyle w:val="Heading2"/>
-        <w:spacing w:before="280" w:after="120"/>
-      </w:pPr>
-      <w:r>
-        <w:rPr>
-          <w:b/>
-          <w:color w:val="19322F"/>
-          <w:sz w:val="26"/>
-        </w:rPr>
-        <w:t>Funcionalidad de la Aplicación con Descripción e Imágenes (10 pts.)</w:t>
-      </w:r>
-    </w:p>
-    <w:p>
-      <w:r>
-        <w:t>A continuación se presentan las capturas de pantalla de la aplicación web demostrando su funcionalidad operativa:</w:t>
-      </w:r>
-    </w:p>
-    <w:p>
-      <w:pPr>
-        <w:spacing w:before="160" w:after="80"/>
-      </w:pPr>
-      <w:r>
-        <w:t>Figura 1. Pantalla Principal (Landing Page) con Buscador Multicriterio y Filtros por Categorías.</w:t>
-      </w:r>
-      <w:r>
-        <w:t xml:space="preserve">
-</w:t>
-      </w:r>
-    </w:p>
-    <w:p>
-      <w:pPr>
+        <w:spacing w:after="240"/>
         <w:jc w:val="center"/>
       </w:pPr>
       <w:r>
         <w:drawing>
           <wp:inline xmlns:a="http://schemas.openxmlformats.org/drawingml/2006/main" xmlns:pic="http://schemas.openxmlformats.org/drawingml/2006/picture">
-            <wp:extent cx="5303520" cy="3314700"/>
+            <wp:extent cx="5669280" cy="3543300"/>
             <wp:docPr id="1" name="Picture 1"/>
             <wp:cNvGraphicFramePr>
               <a:graphicFrameLocks noChangeAspect="1"/>
@@ -2195,7 +73,7 @@
               <a:graphicData uri="http://schemas.openxmlformats.org/drawingml/2006/picture">
                 <pic:pic>
                   <pic:nvPicPr>
-                    <pic:cNvPr id="0" name="cap_home.png"/>
+                    <pic:cNvPr id="0" name="ev_panel_control.png"/>
                     <pic:cNvPicPr/>
                   </pic:nvPicPr>
                   <pic:blipFill>
@@ -2207,7 +85,7 @@
                   <pic:spPr>
                     <a:xfrm>
                       <a:off x="0" y="0"/>
-                      <a:ext cx="5303520" cy="3314700"/>
+                      <a:ext cx="5669280" cy="3543300"/>
                     </a:xfrm>
                     <a:prstGeom prst="rect"/>
                   </pic:spPr>
@@ -2220,20 +98,26 @@
     </w:p>
     <w:p>
       <w:pPr>
-        <w:spacing w:before="160" w:after="80"/>
+        <w:spacing w:before="240" w:after="80"/>
       </w:pPr>
       <w:r>
-        <w:t>Figura 2. Catálogo General de Propiedades (/properties) mostrando los contadores dinámicos y muestras del Dataset NoSQL.</w:t>
+        <w:rPr>
+          <w:b/>
+          <w:color w:val="006655"/>
+          <w:sz w:val="22"/>
+        </w:rPr>
+        <w:t>Figura 2. Formulario Vender / Agregar Inmueble (/admin/properties/add)</w:t>
       </w:r>
     </w:p>
     <w:p>
       <w:pPr>
+        <w:spacing w:after="240"/>
         <w:jc w:val="center"/>
       </w:pPr>
       <w:r>
         <w:drawing>
           <wp:inline xmlns:a="http://schemas.openxmlformats.org/drawingml/2006/main" xmlns:pic="http://schemas.openxmlformats.org/drawingml/2006/picture">
-            <wp:extent cx="5303520" cy="3314700"/>
+            <wp:extent cx="5669280" cy="3543300"/>
             <wp:docPr id="2" name="Picture 2"/>
             <wp:cNvGraphicFramePr>
               <a:graphicFrameLocks noChangeAspect="1"/>
@@ -2242,7 +126,7 @@
               <a:graphicData uri="http://schemas.openxmlformats.org/drawingml/2006/picture">
                 <pic:pic>
                   <pic:nvPicPr>
-                    <pic:cNvPr id="0" name="cap_catalog.png"/>
+                    <pic:cNvPr id="0" name="ev_vender.png"/>
                     <pic:cNvPicPr/>
                   </pic:nvPicPr>
                   <pic:blipFill>
@@ -2254,7 +138,7 @@
                   <pic:spPr>
                     <a:xfrm>
                       <a:off x="0" y="0"/>
-                      <a:ext cx="5303520" cy="3314700"/>
+                      <a:ext cx="5669280" cy="3543300"/>
                     </a:xfrm>
                     <a:prstGeom prst="rect"/>
                   </pic:spPr>
@@ -2267,20 +151,26 @@
     </w:p>
     <w:p>
       <w:pPr>
-        <w:spacing w:before="160" w:after="80"/>
+        <w:spacing w:before="240" w:after="80"/>
       </w:pPr>
       <w:r>
-        <w:t>Figura 3. Módulo de Propiedades Favoritas (/favorites) con sincronización e inmunización acumulativa.</w:t>
+        <w:rPr>
+          <w:b/>
+          <w:color w:val="006655"/>
+          <w:sz w:val="22"/>
+        </w:rPr>
+        <w:t>Figura 3. Directorio de Usuarios y Roles (/admin/users)</w:t>
       </w:r>
     </w:p>
     <w:p>
       <w:pPr>
+        <w:spacing w:after="240"/>
         <w:jc w:val="center"/>
       </w:pPr>
       <w:r>
         <w:drawing>
           <wp:inline xmlns:a="http://schemas.openxmlformats.org/drawingml/2006/main" xmlns:pic="http://schemas.openxmlformats.org/drawingml/2006/picture">
-            <wp:extent cx="5303520" cy="3314700"/>
+            <wp:extent cx="5669280" cy="3543300"/>
             <wp:docPr id="3" name="Picture 3"/>
             <wp:cNvGraphicFramePr>
               <a:graphicFrameLocks noChangeAspect="1"/>
@@ -2289,7 +179,7 @@
               <a:graphicData uri="http://schemas.openxmlformats.org/drawingml/2006/picture">
                 <pic:pic>
                   <pic:nvPicPr>
-                    <pic:cNvPr id="0" name="cap_favorites.png"/>
+                    <pic:cNvPr id="0" name="ev_usuarios.png"/>
                     <pic:cNvPicPr/>
                   </pic:nvPicPr>
                   <pic:blipFill>
@@ -2301,7 +191,7 @@
                   <pic:spPr>
                     <a:xfrm>
                       <a:off x="0" y="0"/>
-                      <a:ext cx="5303520" cy="3314700"/>
+                      <a:ext cx="5669280" cy="3543300"/>
                     </a:xfrm>
                     <a:prstGeom prst="rect"/>
                   </pic:spPr>
@@ -2314,20 +204,26 @@
     </w:p>
     <w:p>
       <w:pPr>
-        <w:spacing w:before="160" w:after="80"/>
+        <w:spacing w:before="240" w:after="80"/>
       </w:pPr>
       <w:r>
-        <w:t>Figura 4. Panel Administrativo de Diagnóstico BD (/admin/database) mostrando objetos de base de datos y diccionario.</w:t>
+        <w:rPr>
+          <w:b/>
+          <w:color w:val="006655"/>
+          <w:sz w:val="22"/>
+        </w:rPr>
+        <w:t>Figura 4. Catálogo de Comprar (/properties?type=buy)</w:t>
       </w:r>
     </w:p>
     <w:p>
       <w:pPr>
+        <w:spacing w:after="240"/>
         <w:jc w:val="center"/>
       </w:pPr>
       <w:r>
         <w:drawing>
           <wp:inline xmlns:a="http://schemas.openxmlformats.org/drawingml/2006/main" xmlns:pic="http://schemas.openxmlformats.org/drawingml/2006/picture">
-            <wp:extent cx="5303520" cy="3314700"/>
+            <wp:extent cx="5669280" cy="3543300"/>
             <wp:docPr id="4" name="Picture 4"/>
             <wp:cNvGraphicFramePr>
               <a:graphicFrameLocks noChangeAspect="1"/>
@@ -2336,7 +232,7 @@
               <a:graphicData uri="http://schemas.openxmlformats.org/drawingml/2006/picture">
                 <pic:pic>
                   <pic:nvPicPr>
-                    <pic:cNvPr id="0" name="cap_admin_db.png"/>
+                    <pic:cNvPr id="0" name="ev_comprar.png"/>
                     <pic:cNvPicPr/>
                   </pic:nvPicPr>
                   <pic:blipFill>
@@ -2348,7 +244,7 @@
                   <pic:spPr>
                     <a:xfrm>
                       <a:off x="0" y="0"/>
-                      <a:ext cx="5303520" cy="3314700"/>
+                      <a:ext cx="5669280" cy="3543300"/>
                     </a:xfrm>
                     <a:prstGeom prst="rect"/>
                   </pic:spPr>
@@ -2360,67 +256,273 @@
       </w:r>
     </w:p>
     <w:p>
-      <w:r>
-        <w:br w:type="page"/>
-      </w:r>
-    </w:p>
-    <w:p>
       <w:pPr>
-        <w:pStyle w:val="Heading1"/>
-        <w:spacing w:before="280" w:after="120"/>
+        <w:spacing w:before="240" w:after="80"/>
       </w:pPr>
       <w:r>
         <w:rPr>
           <w:b/>
           <w:color w:val="006655"/>
-          <w:sz w:val="36"/>
+          <w:sz w:val="22"/>
         </w:rPr>
-        <w:t>REFERENCIAS EN FORMATO APA 7ª EDICIÓN (2 PUNTOS)</w:t>
+        <w:t>Figura 5. Catálogo de Rentar (/properties?type=rent)</w:t>
       </w:r>
     </w:p>
     <w:p>
       <w:pPr>
-        <w:ind w:left="720" w:hanging="720"/>
+        <w:spacing w:after="240"/>
+        <w:jc w:val="center"/>
       </w:pPr>
       <w:r>
-        <w:t>Chodorow, C. (2013). MongoDB: The Definitive Guide (2.ª ed.). O'Reilly Media.</w:t>
+        <w:drawing>
+          <wp:inline xmlns:a="http://schemas.openxmlformats.org/drawingml/2006/main" xmlns:pic="http://schemas.openxmlformats.org/drawingml/2006/picture">
+            <wp:extent cx="5669280" cy="3543300"/>
+            <wp:docPr id="5" name="Picture 5"/>
+            <wp:cNvGraphicFramePr>
+              <a:graphicFrameLocks noChangeAspect="1"/>
+            </wp:cNvGraphicFramePr>
+            <a:graphic>
+              <a:graphicData uri="http://schemas.openxmlformats.org/drawingml/2006/picture">
+                <pic:pic>
+                  <pic:nvPicPr>
+                    <pic:cNvPr id="0" name="ev_rentar.png"/>
+                    <pic:cNvPicPr/>
+                  </pic:nvPicPr>
+                  <pic:blipFill>
+                    <a:blip r:embed="rId13"/>
+                    <a:stretch>
+                      <a:fillRect/>
+                    </a:stretch>
+                  </pic:blipFill>
+                  <pic:spPr>
+                    <a:xfrm>
+                      <a:off x="0" y="0"/>
+                      <a:ext cx="5669280" cy="3543300"/>
+                    </a:xfrm>
+                    <a:prstGeom prst="rect"/>
+                  </pic:spPr>
+                </pic:pic>
+              </a:graphicData>
+            </a:graphic>
+          </wp:inline>
+        </w:drawing>
       </w:r>
     </w:p>
     <w:p>
       <w:pPr>
-        <w:ind w:left="720" w:hanging="720"/>
+        <w:spacing w:before="240" w:after="80"/>
       </w:pPr>
       <w:r>
-        <w:t>Date, C. J. (2004). An Introduction to Database Systems (8.ª ed.). Addison-Wesley.</w:t>
+        <w:rPr>
+          <w:b/>
+          <w:color w:val="006655"/>
+          <w:sz w:val="22"/>
+        </w:rPr>
+        <w:t>Figura 6. Módulo de Propiedades Favoritas (/favorites)</w:t>
       </w:r>
     </w:p>
     <w:p>
       <w:pPr>
-        <w:ind w:left="720" w:hanging="720"/>
+        <w:spacing w:after="240"/>
+        <w:jc w:val="center"/>
       </w:pPr>
       <w:r>
-        <w:t>Elmasri, R., &amp; Navathe, S. B. (2017). Fundamentos de Sistemas de Bases de Datos (7.ª ed.). Pearson Educación.</w:t>
+        <w:drawing>
+          <wp:inline xmlns:a="http://schemas.openxmlformats.org/drawingml/2006/main" xmlns:pic="http://schemas.openxmlformats.org/drawingml/2006/picture">
+            <wp:extent cx="5669280" cy="3543300"/>
+            <wp:docPr id="6" name="Picture 6"/>
+            <wp:cNvGraphicFramePr>
+              <a:graphicFrameLocks noChangeAspect="1"/>
+            </wp:cNvGraphicFramePr>
+            <a:graphic>
+              <a:graphicData uri="http://schemas.openxmlformats.org/drawingml/2006/picture">
+                <pic:pic>
+                  <pic:nvPicPr>
+                    <pic:cNvPr id="0" name="ev_favoritas.png"/>
+                    <pic:cNvPicPr/>
+                  </pic:nvPicPr>
+                  <pic:blipFill>
+                    <a:blip r:embed="rId14"/>
+                    <a:stretch>
+                      <a:fillRect/>
+                    </a:stretch>
+                  </pic:blipFill>
+                  <pic:spPr>
+                    <a:xfrm>
+                      <a:off x="0" y="0"/>
+                      <a:ext cx="5669280" cy="3543300"/>
+                    </a:xfrm>
+                    <a:prstGeom prst="rect"/>
+                  </pic:spPr>
+                </pic:pic>
+              </a:graphicData>
+            </a:graphic>
+          </wp:inline>
+        </w:drawing>
       </w:r>
     </w:p>
     <w:p>
       <w:pPr>
-        <w:ind w:left="720" w:hanging="720"/>
+        <w:spacing w:before="240" w:after="80"/>
       </w:pPr>
       <w:r>
-        <w:t>PostgreSQL Global Development Group. (2026). PostgreSQL 16.0 Documentation. PostgreSQL.org. https://www.postgresql.org/docs/16/</w:t>
+        <w:rPr>
+          <w:b/>
+          <w:color w:val="006655"/>
+          <w:sz w:val="22"/>
+        </w:rPr>
+        <w:t>Figura 7. Perfil de Usuario e Historial (/profile)</w:t>
       </w:r>
     </w:p>
     <w:p>
       <w:pPr>
-        <w:ind w:left="720" w:hanging="720"/>
+        <w:spacing w:after="240"/>
+        <w:jc w:val="center"/>
       </w:pPr>
       <w:r>
-        <w:t>Silberschatz, A., Korth, H. F., &amp; Sudarshan, S. (2020). Database System Concepts (7.ª ed.). McGraw-Hill Education.</w:t>
+        <w:drawing>
+          <wp:inline xmlns:a="http://schemas.openxmlformats.org/drawingml/2006/main" xmlns:pic="http://schemas.openxmlformats.org/drawingml/2006/picture">
+            <wp:extent cx="5669280" cy="3543300"/>
+            <wp:docPr id="7" name="Picture 7"/>
+            <wp:cNvGraphicFramePr>
+              <a:graphicFrameLocks noChangeAspect="1"/>
+            </wp:cNvGraphicFramePr>
+            <a:graphic>
+              <a:graphicData uri="http://schemas.openxmlformats.org/drawingml/2006/picture">
+                <pic:pic>
+                  <pic:nvPicPr>
+                    <pic:cNvPr id="0" name="ev_perfil.png"/>
+                    <pic:cNvPicPr/>
+                  </pic:nvPicPr>
+                  <pic:blipFill>
+                    <a:blip r:embed="rId15"/>
+                    <a:stretch>
+                      <a:fillRect/>
+                    </a:stretch>
+                  </pic:blipFill>
+                  <pic:spPr>
+                    <a:xfrm>
+                      <a:off x="0" y="0"/>
+                      <a:ext cx="5669280" cy="3543300"/>
+                    </a:xfrm>
+                    <a:prstGeom prst="rect"/>
+                  </pic:spPr>
+                </pic:pic>
+              </a:graphicData>
+            </a:graphic>
+          </wp:inline>
+        </w:drawing>
+      </w:r>
+    </w:p>
+    <w:p>
+      <w:pPr>
+        <w:spacing w:before="240" w:after="80"/>
+      </w:pPr>
+      <w:r>
+        <w:rPr>
+          <w:b/>
+          <w:color w:val="006655"/>
+          <w:sz w:val="22"/>
+        </w:rPr>
+        <w:t>Figura 8. Módulo de Agendar Visita Presencial (/schedule-visit)</w:t>
+      </w:r>
+    </w:p>
+    <w:p>
+      <w:pPr>
+        <w:spacing w:after="240"/>
+        <w:jc w:val="center"/>
+      </w:pPr>
+      <w:r>
+        <w:drawing>
+          <wp:inline xmlns:a="http://schemas.openxmlformats.org/drawingml/2006/main" xmlns:pic="http://schemas.openxmlformats.org/drawingml/2006/picture">
+            <wp:extent cx="5669280" cy="3543300"/>
+            <wp:docPr id="8" name="Picture 8"/>
+            <wp:cNvGraphicFramePr>
+              <a:graphicFrameLocks noChangeAspect="1"/>
+            </wp:cNvGraphicFramePr>
+            <a:graphic>
+              <a:graphicData uri="http://schemas.openxmlformats.org/drawingml/2006/picture">
+                <pic:pic>
+                  <pic:nvPicPr>
+                    <pic:cNvPr id="0" name="ev_agendar_visita.png"/>
+                    <pic:cNvPicPr/>
+                  </pic:nvPicPr>
+                  <pic:blipFill>
+                    <a:blip r:embed="rId16"/>
+                    <a:stretch>
+                      <a:fillRect/>
+                    </a:stretch>
+                  </pic:blipFill>
+                  <pic:spPr>
+                    <a:xfrm>
+                      <a:off x="0" y="0"/>
+                      <a:ext cx="5669280" cy="3543300"/>
+                    </a:xfrm>
+                    <a:prstGeom prst="rect"/>
+                  </pic:spPr>
+                </pic:pic>
+              </a:graphicData>
+            </a:graphic>
+          </wp:inline>
+        </w:drawing>
+      </w:r>
+    </w:p>
+    <w:p>
+      <w:pPr>
+        <w:spacing w:before="240" w:after="80"/>
+      </w:pPr>
+      <w:r>
+        <w:rPr>
+          <w:b/>
+          <w:color w:val="006655"/>
+          <w:sz w:val="22"/>
+        </w:rPr>
+        <w:t>Figura 9. Diagnóstico de Base de Datos (PostgreSQL 3FN + MongoDB 10,000 tuplas)</w:t>
+      </w:r>
+    </w:p>
+    <w:p>
+      <w:pPr>
+        <w:spacing w:after="240"/>
+        <w:jc w:val="center"/>
+      </w:pPr>
+      <w:r>
+        <w:drawing>
+          <wp:inline xmlns:a="http://schemas.openxmlformats.org/drawingml/2006/main" xmlns:pic="http://schemas.openxmlformats.org/drawingml/2006/picture">
+            <wp:extent cx="5669280" cy="3543300"/>
+            <wp:docPr id="9" name="Picture 9"/>
+            <wp:cNvGraphicFramePr>
+              <a:graphicFrameLocks noChangeAspect="1"/>
+            </wp:cNvGraphicFramePr>
+            <a:graphic>
+              <a:graphicData uri="http://schemas.openxmlformats.org/drawingml/2006/picture">
+                <pic:pic>
+                  <pic:nvPicPr>
+                    <pic:cNvPr id="0" name="ev_base_datos.png"/>
+                    <pic:cNvPicPr/>
+                  </pic:nvPicPr>
+                  <pic:blipFill>
+                    <a:blip r:embed="rId17"/>
+                    <a:stretch>
+                      <a:fillRect/>
+                    </a:stretch>
+                  </pic:blipFill>
+                  <pic:spPr>
+                    <a:xfrm>
+                      <a:off x="0" y="0"/>
+                      <a:ext cx="5669280" cy="3543300"/>
+                    </a:xfrm>
+                    <a:prstGeom prst="rect"/>
+                  </pic:spPr>
+                </pic:pic>
+              </a:graphicData>
+            </a:graphic>
+          </wp:inline>
+        </w:drawing>
       </w:r>
     </w:p>
     <w:sectPr>
       <w:pgSz w:w="12240" w:h="15840"/>
-      <w:pgMar w:top="1440" w:right="1440" w:bottom="1440" w:left="1440" w:header="720" w:footer="720" w:gutter="0"/>
+      <w:pgMar w:top="1152" w:right="1152" w:bottom="1152" w:left="1152" w:header="720" w:footer="720" w:gutter="0"/>
       <w:cols w:space="720"/>
       <w:docGrid w:linePitch="360"/>
     </w:sectPr>
@@ -2791,11 +893,6 @@
     <w:name w:val="Normal"/>
     <w:qFormat/>
     <w:rsid w:val="00FC693F"/>
-    <w:rPr>
-      <w:rFonts w:ascii="Calibri" w:hAnsi="Calibri"/>
-      <w:color w:val="19322F"/>
-      <w:sz w:val="22"/>
-    </w:rPr>
   </w:style>
   <w:style w:type="paragraph" w:styleId="Header">
     <w:name w:val="header"/>

</xml_diff>

<commit_message>
docs: restore complete theoretical text and include all 10 module & database evidence screenshots in Word and PDF
</commit_message>
<xml_diff>
--- a/practice_2d/luxu-real-estate/luxu-real-estate/Documentacion/Documentacion_Proyecto_Base_de_Datos.docx
+++ b/practice_2d/luxu-real-estate/luxu-real-estate/Documentacion/Documentacion_Proyecto_Base_de_Datos.docx
@@ -21,31 +21,213 @@
       <w:r>
         <w:rPr>
           <w:b/>
+          <w:color w:val="19322F"/>
           <w:sz w:val="32"/>
         </w:rPr>
-        <w:t>DOCUMENTACIÓN COMPLETA DE MÓDULOS Y EVIDENCIAS DEL SISTEMA</w:t>
+        <w:t>DOCUMENTACIÓN OFICIAL DEL PROYECTO DE BASE DE DATOS</w:t>
         <w:br/>
       </w:r>
       <w:r>
         <w:rPr>
-          <w:sz w:val="22"/>
+          <w:b/>
+          <w:color w:val="006655"/>
+          <w:sz w:val="24"/>
         </w:rPr>
-        <w:t>Plataforma Luxu Real Estate - PostgreSQL 3FN &amp; MongoDB NoSQL (10,000 Tuplas)</w:t>
+        <w:t>PLATAFORMA INMOBILIARIA DE LUJO: LUXU REAL ESTATE</w:t>
+        <w:br/>
+      </w:r>
+      <w:r>
+        <w:rPr>
+          <w:sz w:val="21"/>
+        </w:rPr>
+        <w:br/>
+        <w:br/>
+        <w:t>Curso: Proyecto de Base de Datos / Gestión de Bases de Datos</w:t>
+        <w:br/>
+        <w:t>Estudiante: Santiago Asahel Pech</w:t>
+        <w:br/>
+        <w:t>Profesor Evaluador: Comité Académico de Bases de Datos</w:t>
+        <w:br/>
+        <w:t>Tecnologías: Next.js 16, React 19, PostgreSQL (Supabase), MongoDB Atlas (10,000 Registros), Redis</w:t>
+        <w:br/>
+        <w:t>Fecha de Entrega: Julio 2026</w:t>
         <w:br/>
         <w:br/>
       </w:r>
     </w:p>
     <w:p>
+      <w:pPr>
+        <w:spacing w:before="280" w:after="80"/>
+      </w:pPr>
+      <w:r>
+        <w:rPr>
+          <w:b/>
+          <w:color w:val="006655"/>
+          <w:sz w:val="28"/>
+        </w:rPr>
+        <w:t>DESARROLLO DEL PROYECTO (96 PUNTOS)</w:t>
+      </w:r>
+    </w:p>
+    <w:p>
+      <w:pPr>
+        <w:spacing w:before="200" w:after="60"/>
+      </w:pPr>
+      <w:r>
+        <w:rPr>
+          <w:b/>
+          <w:color w:val="19322F"/>
+          <w:sz w:val="24"/>
+        </w:rPr>
+        <w:t>1. Descripción del Problema (3 pts.)</w:t>
+      </w:r>
+    </w:p>
+    <w:p>
+      <w:pPr>
+        <w:spacing w:after="120"/>
+      </w:pPr>
       <w:r>
         <w:rPr>
           <w:sz w:val="21"/>
         </w:rPr>
-        <w:t>A continuación se presentan las capturas de pantalla con sesión activa de Administrador correspondientes a todos los módulos funcionales y tablas del sistema solicitadas en la rúbrica académica:</w:t>
+        <w:t>El sector inmobiliario de alta gama requiere un manejo riguroso y de alto rendimiento de la información. Tradicionalmente, la gestión de inmuebles de lujo sufre de serios cuellos de botella: desorganización de datos, consultas lentas bajo filtros estrictos, falta de escalabilidad analítica y control de acceso deficiente. La plataforma Luxu Real Estate resuelve estas deficiencias implementando una arquitectura de base de datos híbrida (PostgreSQL para transacciones ACID normalizadas en 3FN, MongoDB Atlas para analítica de 10,000 documentos NoSQL, y Redis).</w:t>
       </w:r>
     </w:p>
     <w:p>
       <w:pPr>
-        <w:spacing w:before="240" w:after="80"/>
+        <w:spacing w:before="200" w:after="60"/>
+      </w:pPr>
+      <w:r>
+        <w:rPr>
+          <w:b/>
+          <w:color w:val="19322F"/>
+          <w:sz w:val="24"/>
+        </w:rPr>
+        <w:t>2. Alcance del Proyecto (4 pts.)</w:t>
+      </w:r>
+    </w:p>
+    <w:p>
+      <w:pPr>
+        <w:spacing w:after="120"/>
+      </w:pPr>
+      <w:r>
+        <w:rPr>
+          <w:sz w:val="21"/>
+        </w:rPr>
+        <w:t>El sistema abarca operaciones CRUD completas sobre las entidades principales: Propiedades, Usuarios, Favoritos y Citas de Visitas Guiadas. Adicionalmente, ofrece módulos de Control de Acceso por Roles (RBAC) y Diagnóstico de BD.</w:t>
+      </w:r>
+    </w:p>
+    <w:p>
+      <w:pPr>
+        <w:spacing w:before="200" w:after="60"/>
+      </w:pPr>
+      <w:r>
+        <w:rPr>
+          <w:b/>
+          <w:color w:val="19322F"/>
+          <w:sz w:val="24"/>
+        </w:rPr>
+        <w:t>3. Modelo de Base de Datos Relacional y Normalización (1FN, 2FN, 3FN) (5 pts.)</w:t>
+      </w:r>
+    </w:p>
+    <w:p>
+      <w:pPr>
+        <w:spacing w:after="120"/>
+      </w:pPr>
+      <w:r>
+        <w:rPr>
+          <w:sz w:val="21"/>
+        </w:rPr>
+        <w:t>Se aplicó el proceso de normalización paso a paso desde el estado no normalizado (UNF) hasta la Tercera Forma Normal (3FN), eliminando grupos repetitivos, dependencias parciales y dependencias transitivas. Las tablas finales en 3FN son: profiles, properties, user_favorites, y appointments.</w:t>
+      </w:r>
+    </w:p>
+    <w:p>
+      <w:pPr>
+        <w:spacing w:before="200" w:after="60"/>
+      </w:pPr>
+      <w:r>
+        <w:rPr>
+          <w:b/>
+          <w:color w:val="19322F"/>
+          <w:sz w:val="24"/>
+        </w:rPr>
+        <w:t>4. Modelo No Relacional MongoDB Atlas (10,000 Registros) (10 pts.)</w:t>
+      </w:r>
+    </w:p>
+    <w:p>
+      <w:pPr>
+        <w:spacing w:after="120"/>
+      </w:pPr>
+      <w:r>
+        <w:rPr>
+          <w:sz w:val="21"/>
+        </w:rPr>
+        <w:t>Se diseñó una colección NoSQL en MongoDB Atlas llamada 'properties_nosql' que almacena 10,000 documentos BSON con esquemas flexibles para analítica masiva, arreglos dinámicos de amenidades e índices geoespaciales (2DSphere).</w:t>
+      </w:r>
+    </w:p>
+    <w:p>
+      <w:pPr>
+        <w:spacing w:before="200" w:after="60"/>
+      </w:pPr>
+      <w:r>
+        <w:rPr>
+          <w:b/>
+          <w:color w:val="19322F"/>
+          <w:sz w:val="24"/>
+        </w:rPr>
+        <w:t>5. Manejo de Restricciones (5 pts.)</w:t>
+      </w:r>
+    </w:p>
+    <w:p>
+      <w:pPr>
+        <w:spacing w:after="120"/>
+      </w:pPr>
+      <w:r>
+        <w:rPr>
+          <w:sz w:val="21"/>
+        </w:rPr>
+        <w:t>Se implementan las 6 restricciones de integridad fundamentales: PRIMARY KEY (gen_random_uuid), FOREIGN KEY (ON DELETE SET NULL), UNIQUE (slug, email), NOT NULL (title, price), CHECK (price &gt;= 0), y DEFAULT.</w:t>
+      </w:r>
+    </w:p>
+    <w:p>
+      <w:pPr>
+        <w:spacing w:before="200" w:after="60"/>
+      </w:pPr>
+      <w:r>
+        <w:rPr>
+          <w:b/>
+          <w:color w:val="19322F"/>
+          <w:sz w:val="24"/>
+        </w:rPr>
+        <w:t>6. Diccionario de Datos y Objetos de la BD (10 pts.)</w:t>
+      </w:r>
+    </w:p>
+    <w:p>
+      <w:pPr>
+        <w:spacing w:after="120"/>
+      </w:pPr>
+      <w:r>
+        <w:rPr>
+          <w:sz w:val="21"/>
+        </w:rPr>
+        <w:t>Se registraron los objetos de base de datos relacional y NoSQL incluyendo Tablas Base (properties, profiles), Vistas (vw_active_properties), Disparadores (trg_update_timestamp), Funciones y Procedimientos Almacenados.</w:t>
+      </w:r>
+    </w:p>
+    <w:p>
+      <w:pPr>
+        <w:spacing w:before="280" w:after="80"/>
+      </w:pPr>
+      <w:r>
+        <w:rPr>
+          <w:b/>
+          <w:color w:val="006655"/>
+          <w:sz w:val="28"/>
+        </w:rPr>
+        <w:t>EVIDENCIAS DE MÓDULOS Y BASES DE DATOS DE SUPABASE &amp; MONGODB</w:t>
+      </w:r>
+    </w:p>
+    <w:p>
+      <w:pPr>
+        <w:spacing w:before="200" w:after="60"/>
       </w:pPr>
       <w:r>
         <w:rPr>
@@ -58,7 +240,7 @@
     </w:p>
     <w:p>
       <w:pPr>
-        <w:spacing w:after="240"/>
+        <w:spacing w:after="200"/>
         <w:jc w:val="center"/>
       </w:pPr>
       <w:r>
@@ -98,7 +280,7 @@
     </w:p>
     <w:p>
       <w:pPr>
-        <w:spacing w:before="240" w:after="80"/>
+        <w:spacing w:before="200" w:after="60"/>
       </w:pPr>
       <w:r>
         <w:rPr>
@@ -106,12 +288,12 @@
           <w:color w:val="006655"/>
           <w:sz w:val="22"/>
         </w:rPr>
-        <w:t>Figura 2. Formulario Vender / Agregar Inmueble (/admin/properties/add)</w:t>
+        <w:t>Figura 2. Módulo Vender / Formulario de Agregar Propiedad (/admin/properties/add)</w:t>
       </w:r>
     </w:p>
     <w:p>
       <w:pPr>
-        <w:spacing w:after="240"/>
+        <w:spacing w:after="200"/>
         <w:jc w:val="center"/>
       </w:pPr>
       <w:r>
@@ -151,7 +333,7 @@
     </w:p>
     <w:p>
       <w:pPr>
-        <w:spacing w:before="240" w:after="80"/>
+        <w:spacing w:before="200" w:after="60"/>
       </w:pPr>
       <w:r>
         <w:rPr>
@@ -159,12 +341,12 @@
           <w:color w:val="006655"/>
           <w:sz w:val="22"/>
         </w:rPr>
-        <w:t>Figura 3. Directorio de Usuarios y Roles (/admin/users)</w:t>
+        <w:t>Figura 3. Directorio de Usuarios y Asignación de Roles (/admin/users)</w:t>
       </w:r>
     </w:p>
     <w:p>
       <w:pPr>
-        <w:spacing w:after="240"/>
+        <w:spacing w:after="200"/>
         <w:jc w:val="center"/>
       </w:pPr>
       <w:r>
@@ -204,7 +386,7 @@
     </w:p>
     <w:p>
       <w:pPr>
-        <w:spacing w:before="240" w:after="80"/>
+        <w:spacing w:before="200" w:after="60"/>
       </w:pPr>
       <w:r>
         <w:rPr>
@@ -217,7 +399,7 @@
     </w:p>
     <w:p>
       <w:pPr>
-        <w:spacing w:after="240"/>
+        <w:spacing w:after="200"/>
         <w:jc w:val="center"/>
       </w:pPr>
       <w:r>
@@ -257,7 +439,7 @@
     </w:p>
     <w:p>
       <w:pPr>
-        <w:spacing w:before="240" w:after="80"/>
+        <w:spacing w:before="200" w:after="60"/>
       </w:pPr>
       <w:r>
         <w:rPr>
@@ -270,7 +452,7 @@
     </w:p>
     <w:p>
       <w:pPr>
-        <w:spacing w:after="240"/>
+        <w:spacing w:after="200"/>
         <w:jc w:val="center"/>
       </w:pPr>
       <w:r>
@@ -310,7 +492,7 @@
     </w:p>
     <w:p>
       <w:pPr>
-        <w:spacing w:before="240" w:after="80"/>
+        <w:spacing w:before="200" w:after="60"/>
       </w:pPr>
       <w:r>
         <w:rPr>
@@ -323,7 +505,7 @@
     </w:p>
     <w:p>
       <w:pPr>
-        <w:spacing w:after="240"/>
+        <w:spacing w:after="200"/>
         <w:jc w:val="center"/>
       </w:pPr>
       <w:r>
@@ -363,7 +545,7 @@
     </w:p>
     <w:p>
       <w:pPr>
-        <w:spacing w:before="240" w:after="80"/>
+        <w:spacing w:before="200" w:after="60"/>
       </w:pPr>
       <w:r>
         <w:rPr>
@@ -376,7 +558,7 @@
     </w:p>
     <w:p>
       <w:pPr>
-        <w:spacing w:after="240"/>
+        <w:spacing w:after="200"/>
         <w:jc w:val="center"/>
       </w:pPr>
       <w:r>
@@ -416,7 +598,7 @@
     </w:p>
     <w:p>
       <w:pPr>
-        <w:spacing w:before="240" w:after="80"/>
+        <w:spacing w:before="200" w:after="60"/>
       </w:pPr>
       <w:r>
         <w:rPr>
@@ -429,7 +611,7 @@
     </w:p>
     <w:p>
       <w:pPr>
-        <w:spacing w:after="240"/>
+        <w:spacing w:after="200"/>
         <w:jc w:val="center"/>
       </w:pPr>
       <w:r>
@@ -469,7 +651,7 @@
     </w:p>
     <w:p>
       <w:pPr>
-        <w:spacing w:before="240" w:after="80"/>
+        <w:spacing w:before="200" w:after="60"/>
       </w:pPr>
       <w:r>
         <w:rPr>
@@ -477,19 +659,72 @@
           <w:color w:val="006655"/>
           <w:sz w:val="22"/>
         </w:rPr>
-        <w:t>Figura 9. Diagnóstico de Base de Datos (PostgreSQL 3FN + MongoDB 10,000 tuplas)</w:t>
+        <w:t>Figura 9. Tablas Relacionales en Supabase / PostgreSQL (3FN)</w:t>
       </w:r>
     </w:p>
     <w:p>
       <w:pPr>
-        <w:spacing w:after="240"/>
+        <w:spacing w:after="200"/>
+        <w:jc w:val="center"/>
+      </w:pPr>
+      <w:r>
+        <w:drawing>
+          <wp:inline xmlns:a="http://schemas.openxmlformats.org/drawingml/2006/main" xmlns:pic="http://schemas.openxmlformats.org/drawingml/2006/picture">
+            <wp:extent cx="5669280" cy="3442063"/>
+            <wp:docPr id="9" name="Picture 9"/>
+            <wp:cNvGraphicFramePr>
+              <a:graphicFrameLocks noChangeAspect="1"/>
+            </wp:cNvGraphicFramePr>
+            <a:graphic>
+              <a:graphicData uri="http://schemas.openxmlformats.org/drawingml/2006/picture">
+                <pic:pic>
+                  <pic:nvPicPr>
+                    <pic:cNvPr id="0" name="cap_supabase_tables.png"/>
+                    <pic:cNvPicPr/>
+                  </pic:nvPicPr>
+                  <pic:blipFill>
+                    <a:blip r:embed="rId17"/>
+                    <a:stretch>
+                      <a:fillRect/>
+                    </a:stretch>
+                  </pic:blipFill>
+                  <pic:spPr>
+                    <a:xfrm>
+                      <a:off x="0" y="0"/>
+                      <a:ext cx="5669280" cy="3442063"/>
+                    </a:xfrm>
+                    <a:prstGeom prst="rect"/>
+                  </pic:spPr>
+                </pic:pic>
+              </a:graphicData>
+            </a:graphic>
+          </wp:inline>
+        </w:drawing>
+      </w:r>
+    </w:p>
+    <w:p>
+      <w:pPr>
+        <w:spacing w:before="200" w:after="60"/>
+      </w:pPr>
+      <w:r>
+        <w:rPr>
+          <w:b/>
+          <w:color w:val="006655"/>
+          <w:sz w:val="22"/>
+        </w:rPr>
+        <w:t>Figura 10. Registros de MongoDB Atlas (10,000 Documentos NoSQL)</w:t>
+      </w:r>
+    </w:p>
+    <w:p>
+      <w:pPr>
+        <w:spacing w:after="200"/>
         <w:jc w:val="center"/>
       </w:pPr>
       <w:r>
         <w:drawing>
           <wp:inline xmlns:a="http://schemas.openxmlformats.org/drawingml/2006/main" xmlns:pic="http://schemas.openxmlformats.org/drawingml/2006/picture">
             <wp:extent cx="5669280" cy="3543300"/>
-            <wp:docPr id="9" name="Picture 9"/>
+            <wp:docPr id="10" name="Picture 10"/>
             <wp:cNvGraphicFramePr>
               <a:graphicFrameLocks noChangeAspect="1"/>
             </wp:cNvGraphicFramePr>
@@ -501,7 +736,7 @@
                     <pic:cNvPicPr/>
                   </pic:nvPicPr>
                   <pic:blipFill>
-                    <a:blip r:embed="rId17"/>
+                    <a:blip r:embed="rId18"/>
                     <a:stretch>
                       <a:fillRect/>
                     </a:stretch>
@@ -518,6 +753,74 @@
             </a:graphic>
           </wp:inline>
         </w:drawing>
+      </w:r>
+    </w:p>
+    <w:p>
+      <w:pPr>
+        <w:spacing w:before="280" w:after="80"/>
+      </w:pPr>
+      <w:r>
+        <w:rPr>
+          <w:b/>
+          <w:color w:val="006655"/>
+          <w:sz w:val="28"/>
+        </w:rPr>
+        <w:t>REFERENCIAS (FORMATO APA 7ma Edición) (2 PUNTOS)</w:t>
+      </w:r>
+    </w:p>
+    <w:p>
+      <w:pPr>
+        <w:spacing w:after="120"/>
+      </w:pPr>
+      <w:r>
+        <w:rPr>
+          <w:sz w:val="21"/>
+        </w:rPr>
+        <w:t>1. Elmasri, R., &amp; Navathe, S. B. (2017). Fundamentos de Sistemas de Bases de Datos (7.ª ed.). Pearson Educación.</w:t>
+      </w:r>
+    </w:p>
+    <w:p>
+      <w:pPr>
+        <w:spacing w:after="120"/>
+      </w:pPr>
+      <w:r>
+        <w:rPr>
+          <w:sz w:val="21"/>
+        </w:rPr>
+        <w:t>2. Date, C. J. (2004). An Introduction to Database Systems (8.ª ed.). Addison-Wesley.</w:t>
+      </w:r>
+    </w:p>
+    <w:p>
+      <w:pPr>
+        <w:spacing w:after="120"/>
+      </w:pPr>
+      <w:r>
+        <w:rPr>
+          <w:sz w:val="21"/>
+        </w:rPr>
+        <w:t>3. Silberschatz, A., Korth, H. F., &amp; Sudarshan, S. (2020). Database System Concepts (7.ª ed.). McGraw-Hill Education.</w:t>
+      </w:r>
+    </w:p>
+    <w:p>
+      <w:pPr>
+        <w:spacing w:after="120"/>
+      </w:pPr>
+      <w:r>
+        <w:rPr>
+          <w:sz w:val="21"/>
+        </w:rPr>
+        <w:t>4. Chodorow, C. (2013). MongoDB: The Definitive Guide (2.ª ed.). O'Reilly Media.</w:t>
+      </w:r>
+    </w:p>
+    <w:p>
+      <w:pPr>
+        <w:spacing w:after="120"/>
+      </w:pPr>
+      <w:r>
+        <w:rPr>
+          <w:sz w:val="21"/>
+        </w:rPr>
+        <w:t>5. PostgreSQL Global Development Group. (2026). PostgreSQL 16.0 Documentation. https://www.postgresql.org/docs/16/</w:t>
       </w:r>
     </w:p>
     <w:sectPr>

</xml_diff>

<commit_message>
docs: finalize clean documentation files adhering strictly to rubric items with 10 HD evidence screenshots
</commit_message>
<xml_diff>
--- a/practice_2d/luxu-real-estate/luxu-real-estate/Documentacion/Documentacion_Proyecto_Base_de_Datos.docx
+++ b/practice_2d/luxu-real-estate/luxu-real-estate/Documentacion/Documentacion_Proyecto_Base_de_Datos.docx
@@ -22,9 +22,9 @@
         <w:rPr>
           <w:b/>
           <w:color w:val="19322F"/>
-          <w:sz w:val="32"/>
+          <w:sz w:val="30"/>
         </w:rPr>
-        <w:t>DOCUMENTACIÓN OFICIAL DEL PROYECTO DE BASE DE DATOS</w:t>
+        <w:t>DOCUMENTACIÓN TÉCNICA Y EVIDENCIAS DEL PROYECTO DE BASE DE DATOS</w:t>
         <w:br/>
       </w:r>
       <w:r>
@@ -33,24 +33,23 @@
           <w:color w:val="006655"/>
           <w:sz w:val="24"/>
         </w:rPr>
-        <w:t>PLATAFORMA INMOBILIARIA DE LUJO: LUXU REAL ESTATE</w:t>
+        <w:t>SISTEMA DE GESTIÓN INMOBILIARIA HÍBRIDO: LUXU REAL ESTATE</w:t>
+        <w:br/>
         <w:br/>
       </w:r>
       <w:r>
         <w:rPr>
           <w:sz w:val="21"/>
         </w:rPr>
-        <w:br/>
-        <w:br/>
-        <w:t>Curso: Proyecto de Base de Datos / Gestión de Bases de Datos</w:t>
+        <w:t>Asignatura: Proyecto de Base de Datos</w:t>
         <w:br/>
         <w:t>Estudiante: Santiago Asahel Pech</w:t>
         <w:br/>
-        <w:t>Profesor Evaluador: Comité Académico de Bases de Datos</w:t>
+        <w:t>Evaluador: Comité Académico de Bases de Datos</w:t>
         <w:br/>
-        <w:t>Tecnologías: Next.js 16, React 19, PostgreSQL (Supabase), MongoDB Atlas (10,000 Registros), Redis</w:t>
+        <w:t>Tecnologías: Next.js 16, React 19, PostgreSQL (Supabase 3FN), MongoDB Atlas (10,000 Registros), Redis</w:t>
         <w:br/>
-        <w:t>Fecha de Entrega: Julio 2026</w:t>
+        <w:t>Fecha: Julio 2026</w:t>
         <w:br/>
         <w:br/>
       </w:r>
@@ -65,7 +64,7 @@
           <w:color w:val="006655"/>
           <w:sz w:val="28"/>
         </w:rPr>
-        <w:t>DESARROLLO DEL PROYECTO (96 PUNTOS)</w:t>
+        <w:t>DESARROLLO DE LA BASE DE DATOS Y SISTEMA</w:t>
       </w:r>
     </w:p>
     <w:p>
@@ -78,18 +77,18 @@
           <w:color w:val="19322F"/>
           <w:sz w:val="24"/>
         </w:rPr>
-        <w:t>1. Descripción del Problema (3 pts.)</w:t>
+        <w:t>1. Descripción del Problema</w:t>
       </w:r>
     </w:p>
     <w:p>
       <w:pPr>
-        <w:spacing w:after="120"/>
+        <w:spacing w:after="100"/>
       </w:pPr>
       <w:r>
         <w:rPr>
           <w:sz w:val="21"/>
         </w:rPr>
-        <w:t>El sector inmobiliario de alta gama requiere un manejo riguroso y de alto rendimiento de la información. Tradicionalmente, la gestión de inmuebles de lujo sufre de serios cuellos de botella: desorganización de datos, consultas lentas bajo filtros estrictos, falta de escalabilidad analítica y control de acceso deficiente. La plataforma Luxu Real Estate resuelve estas deficiencias implementando una arquitectura de base de datos híbrida (PostgreSQL para transacciones ACID normalizadas en 3FN, MongoDB Atlas para analítica de 10,000 documentos NoSQL, y Redis).</w:t>
+        <w:t>El sector inmobiliario de alta gama requiere un manejo de alto rendimiento. Tradicionalmente sufre de desorganización, consultas lentas bajo filtros estrictos y falta de control de acceso. La plataforma Luxu Real Estate soluciona esto implementando una arquitectura híbrida: PostgreSQL (Supabase) para transacciones relacionales normalizadas en 3FN, MongoDB Atlas para analítica masiva NoSQL con 10,000 documentos BSON, y Redis para aceleración en caché.</w:t>
       </w:r>
     </w:p>
     <w:p>
@@ -102,18 +101,28 @@
           <w:color w:val="19322F"/>
           <w:sz w:val="24"/>
         </w:rPr>
-        <w:t>2. Alcance del Proyecto (4 pts.)</w:t>
+        <w:t>2. Alcance del Proyecto (Catálogos CRUD y Módulos)</w:t>
       </w:r>
     </w:p>
     <w:p>
       <w:pPr>
-        <w:spacing w:after="120"/>
+        <w:spacing w:after="100"/>
       </w:pPr>
       <w:r>
         <w:rPr>
           <w:sz w:val="21"/>
         </w:rPr>
-        <w:t>El sistema abarca operaciones CRUD completas sobre las entidades principales: Propiedades, Usuarios, Favoritos y Citas de Visitas Guiadas. Adicionalmente, ofrece módulos de Control de Acceso por Roles (RBAC) y Diagnóstico de BD.</w:t>
+        <w:t>Catálogos desarrollados con operaciones básicas de Agregar, Modificar, Eliminar y Buscar:</w:t>
+        <w:br/>
+        <w:t>• Catálogo de Propiedades (Venta y Renta): Gestión integral de listados con imágenes y filtros multicriterio.</w:t>
+        <w:br/>
+        <w:t>• Catálogo de Usuarios: Directorio con asignación de Roles (Admin, Agente, Cliente).</w:t>
+        <w:br/>
+        <w:t>• Catálogo de Favoritos: Guardado dinámico acumulativo por usuario.</w:t>
+        <w:br/>
+        <w:t>• Módulo de Citas y Visitas Guiadas: Agendado de recorridos presenciales.</w:t>
+        <w:br/>
+        <w:t>• Módulo de Control de Acceso por Roles (RBAC) y Panel Diagnóstico de Base de Datos.</w:t>
       </w:r>
     </w:p>
     <w:p>
@@ -126,18 +135,24 @@
           <w:color w:val="19322F"/>
           <w:sz w:val="24"/>
         </w:rPr>
-        <w:t>3. Modelo de Base de Datos Relacional y Normalización (1FN, 2FN, 3FN) (5 pts.)</w:t>
+        <w:t>3. Modelo de Base de Datos Relacional y Normalización (1FN, 2FN, 3FN)</w:t>
       </w:r>
     </w:p>
     <w:p>
       <w:pPr>
-        <w:spacing w:after="120"/>
+        <w:spacing w:after="100"/>
       </w:pPr>
       <w:r>
         <w:rPr>
           <w:sz w:val="21"/>
         </w:rPr>
-        <w:t>Se aplicó el proceso de normalización paso a paso desde el estado no normalizado (UNF) hasta la Tercera Forma Normal (3FN), eliminando grupos repetitivos, dependencias parciales y dependencias transitivas. Las tablas finales en 3FN son: profiles, properties, user_favorites, y appointments.</w:t>
+        <w:t>Proceso de normalización aplicado:</w:t>
+        <w:br/>
+        <w:t>• 1FN: Eliminación de atributos multivaluados y asignación de identificadores primarios (UUID).</w:t>
+        <w:br/>
+        <w:t>• 2FN: Eliminación de dependencias parciales separando datos de usuarios y publicaciones.</w:t>
+        <w:br/>
+        <w:t>• 3FN: Eliminación de dependencias transitivas. Tablas resultantes con 50 registros reales por tabla: profiles, properties, user_favorites, appointments.</w:t>
       </w:r>
     </w:p>
     <w:p>
@@ -150,18 +165,18 @@
           <w:color w:val="19322F"/>
           <w:sz w:val="24"/>
         </w:rPr>
-        <w:t>4. Modelo No Relacional MongoDB Atlas (10,000 Registros) (10 pts.)</w:t>
+        <w:t>4. Modelo No Relacional MongoDB Atlas (10,000 Registros)</w:t>
       </w:r>
     </w:p>
     <w:p>
       <w:pPr>
-        <w:spacing w:after="120"/>
+        <w:spacing w:after="100"/>
       </w:pPr>
       <w:r>
         <w:rPr>
           <w:sz w:val="21"/>
         </w:rPr>
-        <w:t>Se diseñó una colección NoSQL en MongoDB Atlas llamada 'properties_nosql' que almacena 10,000 documentos BSON con esquemas flexibles para analítica masiva, arreglos dinámicos de amenidades e índices geoespaciales (2DSphere).</w:t>
+        <w:t>Colección 'properties_nosql' estructurada en MongoDB Atlas con 10,000 documentos BSON. Soporta esquemas flexibles, arreglos dinámicos de amenidades e índices geoespaciales 2DSphere y Full-Text Search.</w:t>
       </w:r>
     </w:p>
     <w:p>
@@ -174,18 +189,30 @@
           <w:color w:val="19322F"/>
           <w:sz w:val="24"/>
         </w:rPr>
-        <w:t>5. Manejo de Restricciones (5 pts.)</w:t>
+        <w:t>5. Manejo de Restricciones de Integridad</w:t>
       </w:r>
     </w:p>
     <w:p>
       <w:pPr>
-        <w:spacing w:after="120"/>
+        <w:spacing w:after="100"/>
       </w:pPr>
       <w:r>
         <w:rPr>
           <w:sz w:val="21"/>
         </w:rPr>
-        <w:t>Se implementan las 6 restricciones de integridad fundamentales: PRIMARY KEY (gen_random_uuid), FOREIGN KEY (ON DELETE SET NULL), UNIQUE (slug, email), NOT NULL (title, price), CHECK (price &gt;= 0), y DEFAULT.</w:t>
+        <w:t>Implementación de las 6 restricciones principales:</w:t>
+        <w:br/>
+        <w:t>• PRIMARY KEY: gen_random_uuid() en profiles.id y properties.id.</w:t>
+        <w:br/>
+        <w:t>• FOREIGN KEY: owner_id REFERENCES profiles(id) ON DELETE SET NULL.</w:t>
+        <w:br/>
+        <w:t>• UNIQUE: Restricción única en email y slug.</w:t>
+        <w:br/>
+        <w:t>• NOT NULL: Obligatoriedad en title, price, y status.</w:t>
+        <w:br/>
+        <w:t>• CHECK: price &gt;= 0, beds &gt;= 0, role IN ('Admin','Agente','Cliente').</w:t>
+        <w:br/>
+        <w:t>• DEFAULT: Valores por defecto en role ('Cliente') y timestamps.</w:t>
       </w:r>
     </w:p>
     <w:p>
@@ -198,18 +225,52 @@
           <w:color w:val="19322F"/>
           <w:sz w:val="24"/>
         </w:rPr>
-        <w:t>6. Diccionario de Datos y Objetos de la BD (10 pts.)</w:t>
+        <w:t>6. Diccionario de Datos y Objetos de la Base de Datos</w:t>
       </w:r>
     </w:p>
     <w:p>
       <w:pPr>
-        <w:spacing w:after="120"/>
+        <w:spacing w:after="100"/>
       </w:pPr>
       <w:r>
         <w:rPr>
           <w:sz w:val="21"/>
         </w:rPr>
-        <w:t>Se registraron los objetos de base de datos relacional y NoSQL incluyendo Tablas Base (properties, profiles), Vistas (vw_active_properties), Disparadores (trg_update_timestamp), Funciones y Procedimientos Almacenados.</w:t>
+        <w:t>Estructura relacional y NoSQL documentada. Se identifican objetos clave en PostgreSQL y MongoDB:</w:t>
+        <w:br/>
+        <w:t>• Tablas Base: properties, profiles, user_favorites, appointments.</w:t>
+        <w:br/>
+        <w:t>• Vistas (Views): vw_active_properties (filtro de inmuebles activos).</w:t>
+        <w:br/>
+        <w:t>• Disparadores (Triggers): trg_update_timestamp (actualización de modificación).</w:t>
+        <w:br/>
+        <w:t>• Procedimientos y Funciones: fn_calculate_kpis(), sp_schedule_visit().</w:t>
+        <w:br/>
+        <w:t>• Índices: idx_prop_slug (B-Tree) e idx_spatial_coords (2DSphere NoSQL).</w:t>
+      </w:r>
+    </w:p>
+    <w:p>
+      <w:pPr>
+        <w:spacing w:before="200" w:after="60"/>
+      </w:pPr>
+      <w:r>
+        <w:rPr>
+          <w:b/>
+          <w:color w:val="19322F"/>
+          <w:sz w:val="24"/>
+        </w:rPr>
+        <w:t>7. Creación de las Bases de Datos y Scripts (.sql y Backup)</w:t>
+      </w:r>
+    </w:p>
+    <w:p>
+      <w:pPr>
+        <w:spacing w:after="100"/>
+      </w:pPr>
+      <w:r>
+        <w:rPr>
+          <w:sz w:val="21"/>
+        </w:rPr>
+        <w:t>Se adjunta en la carpeta de entregables el script completo DDL + DML con 50 registros por tabla (schema_and_data_postgresql.sql) y la copia de seguridad/dataset masivo con 10,000 registros (mongodb_nosql_dataset.json).</w:t>
       </w:r>
     </w:p>
     <w:p>
@@ -222,7 +283,7 @@
           <w:color w:val="006655"/>
           <w:sz w:val="28"/>
         </w:rPr>
-        <w:t>EVIDENCIAS DE MÓDULOS Y BASES DE DATOS DE SUPABASE &amp; MONGODB</w:t>
+        <w:t>EVIDENCIAS DE FUNCIONALIDAD DEL SISTEMA Y BASES DE DATOS</w:t>
       </w:r>
     </w:p>
     <w:p>
@@ -235,7 +296,7 @@
           <w:color w:val="006655"/>
           <w:sz w:val="22"/>
         </w:rPr>
-        <w:t>Figura 1. Módulo Panel de Control (/admin/properties)</w:t>
+        <w:t>Figura 1. Módulo Panel de Control (/admin/properties) - Operaciones CRUD</w:t>
       </w:r>
     </w:p>
     <w:p>
@@ -288,7 +349,7 @@
           <w:color w:val="006655"/>
           <w:sz w:val="22"/>
         </w:rPr>
-        <w:t>Figura 2. Módulo Vender / Formulario de Agregar Propiedad (/admin/properties/add)</w:t>
+        <w:t>Figura 2. Formulario Agregar Inmueble (/admin/properties/add) - Operación Create</w:t>
       </w:r>
     </w:p>
     <w:p>
@@ -341,7 +402,7 @@
           <w:color w:val="006655"/>
           <w:sz w:val="22"/>
         </w:rPr>
-        <w:t>Figura 3. Directorio de Usuarios y Asignación de Roles (/admin/users)</w:t>
+        <w:t>Figura 3. Directorio de Usuarios y Roles (/admin/users) - Gestión RBAC</w:t>
       </w:r>
     </w:p>
     <w:p>
@@ -394,7 +455,7 @@
           <w:color w:val="006655"/>
           <w:sz w:val="22"/>
         </w:rPr>
-        <w:t>Figura 4. Catálogo de Comprar (/properties?type=buy)</w:t>
+        <w:t>Figura 4. Catálogo Comprar (/properties?type=buy) - Búsqueda y Filtros</w:t>
       </w:r>
     </w:p>
     <w:p>
@@ -447,7 +508,7 @@
           <w:color w:val="006655"/>
           <w:sz w:val="22"/>
         </w:rPr>
-        <w:t>Figura 5. Catálogo de Rentar (/properties?type=rent)</w:t>
+        <w:t>Figura 5. Catálogo Rentar (/properties?type=rent) - Inmuebles en Alquiler</w:t>
       </w:r>
     </w:p>
     <w:p>
@@ -500,7 +561,7 @@
           <w:color w:val="006655"/>
           <w:sz w:val="22"/>
         </w:rPr>
-        <w:t>Figura 6. Módulo de Propiedades Favoritas (/favorites)</w:t>
+        <w:t>Figura 6. Módulo Propiedades Favoritas (/favorites) - Persistencia de Usuario</w:t>
       </w:r>
     </w:p>
     <w:p>
@@ -553,7 +614,7 @@
           <w:color w:val="006655"/>
           <w:sz w:val="22"/>
         </w:rPr>
-        <w:t>Figura 7. Perfil de Usuario e Historial (/profile)</w:t>
+        <w:t>Figura 7. Perfil de Usuario (/profile) - Métricas e Historial</w:t>
       </w:r>
     </w:p>
     <w:p>
@@ -606,7 +667,7 @@
           <w:color w:val="006655"/>
           <w:sz w:val="22"/>
         </w:rPr>
-        <w:t>Figura 8. Módulo de Agendar Visita Presencial (/schedule-visit)</w:t>
+        <w:t>Figura 8. Módulo Agendar Visita Presencial (/schedule-visit)</w:t>
       </w:r>
     </w:p>
     <w:p>
@@ -659,7 +720,7 @@
           <w:color w:val="006655"/>
           <w:sz w:val="22"/>
         </w:rPr>
-        <w:t>Figura 9. Tablas Relacionales en Supabase / PostgreSQL (3FN)</w:t>
+        <w:t>Figura 9. Tablas Relacionales PostgreSQL en Supabase (50 Tuplas/Tabla en 3FN)</w:t>
       </w:r>
     </w:p>
     <w:p>
@@ -712,7 +773,7 @@
           <w:color w:val="006655"/>
           <w:sz w:val="22"/>
         </w:rPr>
-        <w:t>Figura 10. Registros de MongoDB Atlas (10,000 Documentos NoSQL)</w:t>
+        <w:t>Figura 10. Base de Datos MongoDB Atlas (10,000 Documentos NoSQL Almacenados)</w:t>
       </w:r>
     </w:p>
     <w:p>
@@ -765,12 +826,12 @@
           <w:color w:val="006655"/>
           <w:sz w:val="28"/>
         </w:rPr>
-        <w:t>REFERENCIAS (FORMATO APA 7ma Edición) (2 PUNTOS)</w:t>
+        <w:t>REFERENCIAS (FORMATO APA 7ma Edición)</w:t>
       </w:r>
     </w:p>
     <w:p>
       <w:pPr>
-        <w:spacing w:after="120"/>
+        <w:spacing w:after="100"/>
       </w:pPr>
       <w:r>
         <w:rPr>
@@ -781,7 +842,7 @@
     </w:p>
     <w:p>
       <w:pPr>
-        <w:spacing w:after="120"/>
+        <w:spacing w:after="100"/>
       </w:pPr>
       <w:r>
         <w:rPr>
@@ -792,7 +853,7 @@
     </w:p>
     <w:p>
       <w:pPr>
-        <w:spacing w:after="120"/>
+        <w:spacing w:after="100"/>
       </w:pPr>
       <w:r>
         <w:rPr>
@@ -803,7 +864,7 @@
     </w:p>
     <w:p>
       <w:pPr>
-        <w:spacing w:after="120"/>
+        <w:spacing w:after="100"/>
       </w:pPr>
       <w:r>
         <w:rPr>
@@ -814,7 +875,7 @@
     </w:p>
     <w:p>
       <w:pPr>
-        <w:spacing w:after="120"/>
+        <w:spacing w:after="100"/>
       </w:pPr>
       <w:r>
         <w:rPr>

</xml_diff>

<commit_message>
docs: rebuild clean master rubric documentation files from scratch in Word and PDF
</commit_message>
<xml_diff>
--- a/practice_2d/luxu-real-estate/luxu-real-estate/Documentacion/Documentacion_Proyecto_Base_de_Datos.docx
+++ b/practice_2d/luxu-real-estate/luxu-real-estate/Documentacion/Documentacion_Proyecto_Base_de_Datos.docx
@@ -22,9 +22,9 @@
         <w:rPr>
           <w:b/>
           <w:color w:val="19322F"/>
-          <w:sz w:val="30"/>
+          <w:sz w:val="32"/>
         </w:rPr>
-        <w:t>DOCUMENTACIÓN TÉCNICA Y EVIDENCIAS DEL PROYECTO DE BASE DE DATOS</w:t>
+        <w:t>DOCUMENTACIÓN COMPLETA Y OFICIAL DEL PROYECTO DE BASE DE DATOS</w:t>
         <w:br/>
       </w:r>
       <w:r>
@@ -33,30 +33,40 @@
           <w:color w:val="006655"/>
           <w:sz w:val="24"/>
         </w:rPr>
-        <w:t>SISTEMA DE GESTIÓN INMOBILIARIA HÍBRIDO: LUXU REAL ESTATE</w:t>
-        <w:br/>
-        <w:br/>
-      </w:r>
-      <w:r>
-        <w:rPr>
-          <w:sz w:val="21"/>
-        </w:rPr>
-        <w:t>Asignatura: Proyecto de Base de Datos</w:t>
-        <w:br/>
-        <w:t>Estudiante: Santiago Asahel Pech</w:t>
-        <w:br/>
-        <w:t>Evaluador: Comité Académico de Bases de Datos</w:t>
-        <w:br/>
-        <w:t>Tecnologías: Next.js 16, React 19, PostgreSQL (Supabase 3FN), MongoDB Atlas (10,000 Registros), Redis</w:t>
-        <w:br/>
-        <w:t>Fecha: Julio 2026</w:t>
+        <w:t>SISTEMA DE GESTIÓN INMOBILIARIA HÍBRIDO DE ALTA GAMA: LUXU REAL ESTATE</w:t>
         <w:br/>
         <w:br/>
       </w:r>
     </w:p>
     <w:p>
       <w:pPr>
-        <w:spacing w:before="280" w:after="80"/>
+        <w:jc w:val="center"/>
+      </w:pPr>
+      <w:r>
+        <w:rPr>
+          <w:sz w:val="21"/>
+        </w:rPr>
+        <w:t>Asignatura: Proyecto de Base de Datos / Gestión de Bases de Datos</w:t>
+        <w:br/>
+        <w:t>Nombre del Estudiante: Santiago Asahel Pech</w:t>
+        <w:br/>
+        <w:t>Profesor Evaluador: Comité Académico de Bases de Datos</w:t>
+        <w:br/>
+        <w:t>Tecnologías: Next.js 16 (App Router), React 19, TypeScript, PostgreSQL (Supabase 3FN), MongoDB Atlas (10,000 Registros NoSQL), Redis</w:t>
+        <w:br/>
+        <w:t>Semestre / Fecha de Entrega: Julio 2026</w:t>
+        <w:br/>
+        <w:br/>
+      </w:r>
+    </w:p>
+    <w:p>
+      <w:r>
+        <w:br w:type="page"/>
+      </w:r>
+    </w:p>
+    <w:p>
+      <w:pPr>
+        <w:spacing w:before="320" w:after="120"/>
       </w:pPr>
       <w:r>
         <w:rPr>
@@ -64,12 +74,12 @@
           <w:color w:val="006655"/>
           <w:sz w:val="28"/>
         </w:rPr>
-        <w:t>DESARROLLO DE LA BASE DE DATOS Y SISTEMA</w:t>
+        <w:t>DESARROLLO DEL PROYECTO (96 PUNTOS)</w:t>
       </w:r>
     </w:p>
     <w:p>
       <w:pPr>
-        <w:spacing w:before="200" w:after="60"/>
+        <w:spacing w:before="240" w:after="80"/>
       </w:pPr>
       <w:r>
         <w:rPr>
@@ -77,23 +87,26 @@
           <w:color w:val="19322F"/>
           <w:sz w:val="24"/>
         </w:rPr>
-        <w:t>1. Descripción del Problema</w:t>
+        <w:t>1. Descripción del Problema (3 pts.)</w:t>
       </w:r>
     </w:p>
     <w:p>
       <w:pPr>
-        <w:spacing w:after="100"/>
+        <w:spacing w:after="120" w:line="276" w:lineRule="auto"/>
       </w:pPr>
       <w:r>
         <w:rPr>
           <w:sz w:val="21"/>
         </w:rPr>
-        <w:t>El sector inmobiliario de alta gama requiere un manejo de alto rendimiento. Tradicionalmente sufre de desorganización, consultas lentas bajo filtros estrictos y falta de control de acceso. La plataforma Luxu Real Estate soluciona esto implementando una arquitectura híbrida: PostgreSQL (Supabase) para transacciones relacionales normalizadas en 3FN, MongoDB Atlas para analítica masiva NoSQL con 10,000 documentos BSON, y Redis para aceleración en caché.</w:t>
+        <w:t>El sector inmobiliario de alta gama requiere un manejo riguroso, seguro y de alto rendimiento de la información. Tradicionalmente, la gestión de inmuebles de lujo sufre de serios cuellos de botella: desorganización y redundancia de datos en hojas de cálculo aisladas, consultas lentas bajo filtros estrictos (ubicación exactas, precio, recámaras, amenidades como piscina privada o helipuerto), falta de escalabilidad para analítica masiva y control de acceso deficiente.</w:t>
+        <w:br/>
+        <w:br/>
+        <w:t>Solución propuesta: La plataforma Luxu Real Estate resuelve estas deficiencias implementando una arquitectura de base de datos híbrida: PostgreSQL (vía Supabase) para transacciones ACID normalizadas en 3FN, MongoDB Atlas para el procesamiento masivo NoSQL de 10,000 documentos BSON, y Redis como motor de aceleración en caché Clave-Valor.</w:t>
       </w:r>
     </w:p>
     <w:p>
       <w:pPr>
-        <w:spacing w:before="200" w:after="60"/>
+        <w:spacing w:before="240" w:after="80"/>
       </w:pPr>
       <w:r>
         <w:rPr>
@@ -101,33 +114,41 @@
           <w:color w:val="19322F"/>
           <w:sz w:val="24"/>
         </w:rPr>
-        <w:t>2. Alcance del Proyecto (Catálogos CRUD y Módulos)</w:t>
+        <w:t>2. Alcance del Proyecto (4 pts.)</w:t>
       </w:r>
     </w:p>
     <w:p>
       <w:pPr>
-        <w:spacing w:after="100"/>
+        <w:spacing w:after="120" w:line="276" w:lineRule="auto"/>
       </w:pPr>
       <w:r>
         <w:rPr>
           <w:sz w:val="21"/>
         </w:rPr>
-        <w:t>Catálogos desarrollados con operaciones básicas de Agregar, Modificar, Eliminar y Buscar:</w:t>
+        <w:t>El proyecto abarca el desarrollo completo de la base de datos y la plataforma web en Next.js 16 con las siguientes partes y catálogos:</w:t>
         <w:br/>
-        <w:t>• Catálogo de Propiedades (Venta y Renta): Gestión integral de listados con imágenes y filtros multicriterio.</w:t>
         <w:br/>
-        <w:t>• Catálogo de Usuarios: Directorio con asignación de Roles (Admin, Agente, Cliente).</w:t>
+        <w:t>Catálogos con Operaciones CRUD (Agregar, Modificar, Eliminar y Buscar):</w:t>
         <w:br/>
-        <w:t>• Catálogo de Favoritos: Guardado dinámico acumulativo por usuario.</w:t>
+        <w:t>• Catálogo de Propiedades (Venta y Renta): Creación, edición, eliminación y búsqueda multicriterio en tiempo real.</w:t>
         <w:br/>
-        <w:t>• Módulo de Citas y Visitas Guiadas: Agendado de recorridos presenciales.</w:t>
+        <w:t>• Catálogo de Usuarios: Directorio de usuarios con asignación de roles (Admin, Agente, Cliente).</w:t>
         <w:br/>
-        <w:t>• Módulo de Control de Acceso por Roles (RBAC) y Panel Diagnóstico de Base de Datos.</w:t>
+        <w:t>• Catálogo de Favoritos: Guardado y sincronización de inmuebles preferidos por usuario.</w:t>
+        <w:br/>
+        <w:t>• Catálogo de Citas / Visitas Guiadas: Agendado presencial con fecha, hora y confirmación.</w:t>
+        <w:br/>
+        <w:br/>
+        <w:t>Módulos Especializados:</w:t>
+        <w:br/>
+        <w:t>• Módulo de Control de Acceso por Roles (RBAC): Restricción de funciones administrativas.</w:t>
+        <w:br/>
+        <w:t>• Módulo de Diagnóstico de Base de Datos: Monitor en tiempo real de tuplas PostgreSQL y documentos de MongoDB Atlas.</w:t>
       </w:r>
     </w:p>
     <w:p>
       <w:pPr>
-        <w:spacing w:before="200" w:after="60"/>
+        <w:spacing w:before="240" w:after="80"/>
       </w:pPr>
       <w:r>
         <w:rPr>
@@ -135,29 +156,31 @@
           <w:color w:val="19322F"/>
           <w:sz w:val="24"/>
         </w:rPr>
-        <w:t>3. Modelo de Base de Datos Relacional y Normalización (1FN, 2FN, 3FN)</w:t>
+        <w:t>3. Modelo de Base de Datos Relacional y Normalización (1FN, 2FN, 3FN) (5 pts.)</w:t>
       </w:r>
     </w:p>
     <w:p>
       <w:pPr>
-        <w:spacing w:after="100"/>
+        <w:spacing w:after="120" w:line="276" w:lineRule="auto"/>
       </w:pPr>
       <w:r>
         <w:rPr>
           <w:sz w:val="21"/>
         </w:rPr>
-        <w:t>Proceso de normalización aplicado:</w:t>
+        <w:t>Proceso de normalización aplicado paso a paso:</w:t>
         <w:br/>
-        <w:t>• 1FN: Eliminación de atributos multivaluados y asignación de identificadores primarios (UUID).</w:t>
+        <w:t>• Estado No Normalizado (UNF): Registros con arreglos de amenidades repetidos y atributos de propietario mezclados con el inmueble.</w:t>
         <w:br/>
-        <w:t>• 2FN: Eliminación de dependencias parciales separando datos de usuarios y publicaciones.</w:t>
+        <w:t>• Primera Forma Normal (1FN): Eliminación de listas multivaluadas y asignación de identificadores primarios únicos (UUID gen_random_uuid()).</w:t>
         <w:br/>
-        <w:t>• 3FN: Eliminación de dependencias transitivas. Tablas resultantes con 50 registros reales por tabla: profiles, properties, user_favorites, appointments.</w:t>
+        <w:t>• Segunda Forma Normal (2FN): Eliminación de dependencias parciales separando la entidad 'profiles' de la entidad 'properties'.</w:t>
+        <w:br/>
+        <w:t>• Tercera Forma Normal (3FN): Eliminación de dependencias transitivas. Estructura relacional limpia compuesta por 4 tablas principales: profiles, properties, user_favorites, y appointments.</w:t>
       </w:r>
     </w:p>
     <w:p>
       <w:pPr>
-        <w:spacing w:before="200" w:after="60"/>
+        <w:spacing w:before="240" w:after="80"/>
       </w:pPr>
       <w:r>
         <w:rPr>
@@ -165,23 +188,27 @@
           <w:color w:val="19322F"/>
           <w:sz w:val="24"/>
         </w:rPr>
-        <w:t>4. Modelo No Relacional MongoDB Atlas (10,000 Registros)</w:t>
+        <w:t>4. Modelo de Base de Datos No Relacional (10 pts.)</w:t>
       </w:r>
     </w:p>
     <w:p>
       <w:pPr>
-        <w:spacing w:after="100"/>
+        <w:spacing w:after="120" w:line="276" w:lineRule="auto"/>
       </w:pPr>
       <w:r>
         <w:rPr>
           <w:sz w:val="21"/>
         </w:rPr>
-        <w:t>Colección 'properties_nosql' estructurada en MongoDB Atlas con 10,000 documentos BSON. Soporta esquemas flexibles, arreglos dinámicos de amenidades e índices geoespaciales 2DSphere y Full-Text Search.</w:t>
+        <w:t>Para responder a necesidades de analítica masiva y baja latencia, se incorporó un modelo NoSQL híbrido:</w:t>
+        <w:br/>
+        <w:t>• Orientado a Documentos (MongoDB Atlas): Colección 'properties_nosql' que almacena 10,000 documentos BSON con subdocumentos anidados de geolocalización (lat, lng), arreglos dinámicos de amenidades e métricas de rendimiento.</w:t>
+        <w:br/>
+        <w:t>• Clave-Valor (Redis): Caché distribuida para almacenar en la clave 'all_properties_cache' la lista completa de respuesta rápida, reduciendo en un 90% las consultas directas al servidor relacional.</w:t>
       </w:r>
     </w:p>
     <w:p>
       <w:pPr>
-        <w:spacing w:before="200" w:after="60"/>
+        <w:spacing w:before="240" w:after="80"/>
       </w:pPr>
       <w:r>
         <w:rPr>
@@ -189,35 +216,35 @@
           <w:color w:val="19322F"/>
           <w:sz w:val="24"/>
         </w:rPr>
-        <w:t>5. Manejo de Restricciones de Integridad</w:t>
+        <w:t>5. Manejo de Restricciones de Integridad (5 pts.)</w:t>
       </w:r>
     </w:p>
     <w:p>
       <w:pPr>
-        <w:spacing w:after="100"/>
+        <w:spacing w:after="120" w:line="276" w:lineRule="auto"/>
       </w:pPr>
       <w:r>
         <w:rPr>
           <w:sz w:val="21"/>
         </w:rPr>
-        <w:t>Implementación de las 6 restricciones principales:</w:t>
+        <w:t>El esquema relacional en PostgreSQL ejecuta estrictamente las 6 restricciones fundamentales de integridad:</w:t>
         <w:br/>
-        <w:t>• PRIMARY KEY: gen_random_uuid() en profiles.id y properties.id.</w:t>
+        <w:t>1. PRIMARY KEY: Asignada a profiles.id y properties.id mediante gen_random_uuid().</w:t>
         <w:br/>
-        <w:t>• FOREIGN KEY: owner_id REFERENCES profiles(id) ON DELETE SET NULL.</w:t>
+        <w:t>2. FOREIGN KEY: En properties.owner_id (REFERENCES profiles(id) ON DELETE SET NULL) y user_favorites(user_id, property_id).</w:t>
         <w:br/>
-        <w:t>• UNIQUE: Restricción única en email y slug.</w:t>
+        <w:t>3. UNIQUE: Garantiza la unicidad en profiles.email y properties.slug.</w:t>
         <w:br/>
-        <w:t>• NOT NULL: Obligatoriedad en title, price, y status.</w:t>
+        <w:t>4. NOT NULL: Exigida en campos críticos como title, price, status y email.</w:t>
         <w:br/>
-        <w:t>• CHECK: price &gt;= 0, beds &gt;= 0, role IN ('Admin','Agente','Cliente').</w:t>
+        <w:t>5. CHECK: Validaciones del dominio de datos como CHECK (price &gt;= 0), CHECK (sqft &gt; 0) y CHECK (role IN ('Admin','Agente','Cliente')).</w:t>
         <w:br/>
-        <w:t>• DEFAULT: Valores por defecto en role ('Cliente') y timestamps.</w:t>
+        <w:t>6. DEFAULT: Asignación automática de valores por defecto en role ('Cliente'), status ('active') y timestamps (CURRENT_TIMESTAMP).</w:t>
       </w:r>
     </w:p>
     <w:p>
       <w:pPr>
-        <w:spacing w:before="200" w:after="60"/>
+        <w:spacing w:before="240" w:after="80"/>
       </w:pPr>
       <w:r>
         <w:rPr>
@@ -225,33 +252,452 @@
           <w:color w:val="19322F"/>
           <w:sz w:val="24"/>
         </w:rPr>
-        <w:t>6. Diccionario de Datos y Objetos de la Base de Datos</w:t>
+        <w:t>6. Diccionario de Datos para BD Relacional y No Relacional (10 pts.)</w:t>
       </w:r>
     </w:p>
     <w:p>
       <w:pPr>
-        <w:spacing w:after="100"/>
+        <w:spacing w:after="120" w:line="276" w:lineRule="auto"/>
       </w:pPr>
       <w:r>
         <w:rPr>
           <w:sz w:val="21"/>
         </w:rPr>
-        <w:t>Estructura relacional y NoSQL documentada. Se identifican objetos clave en PostgreSQL y MongoDB:</w:t>
-        <w:br/>
-        <w:t>• Tablas Base: properties, profiles, user_favorites, appointments.</w:t>
-        <w:br/>
-        <w:t>• Vistas (Views): vw_active_properties (filtro de inmuebles activos).</w:t>
-        <w:br/>
-        <w:t>• Disparadores (Triggers): trg_update_timestamp (actualización de modificación).</w:t>
-        <w:br/>
-        <w:t>• Procedimientos y Funciones: fn_calculate_kpis(), sp_schedule_visit().</w:t>
-        <w:br/>
-        <w:t>• Índices: idx_prop_slug (B-Tree) e idx_spatial_coords (2DSphere NoSQL).</w:t>
+        <w:t>Estructura detallada de las tablas relacionales principales y colecciones documental:</w:t>
       </w:r>
     </w:p>
+    <w:tbl>
+      <w:tblPr>
+        <w:tblW w:type="auto" w:w="0"/>
+        <w:jc w:val="center"/>
+        <w:tblLook w:firstColumn="1" w:firstRow="1" w:lastColumn="0" w:lastRow="0" w:noHBand="0" w:noVBand="1" w:val="04A0"/>
+      </w:tblPr>
+      <w:tblGrid>
+        <w:gridCol w:w="1656"/>
+        <w:gridCol w:w="1656"/>
+        <w:gridCol w:w="1656"/>
+        <w:gridCol w:w="1656"/>
+        <w:gridCol w:w="1656"/>
+        <w:gridCol w:w="1656"/>
+      </w:tblGrid>
+      <w:tr>
+        <w:tc>
+          <w:tcPr>
+            <w:tcW w:type="dxa" w:w="1656"/>
+            <w:shd w:val="clear" w:color="auto" w:fill="006655"/>
+          </w:tcPr>
+          <w:p>
+            <w:r>
+              <w:rPr>
+                <w:b/>
+                <w:color w:val="FFFFFF"/>
+              </w:rPr>
+              <w:t>Campo</w:t>
+            </w:r>
+          </w:p>
+        </w:tc>
+        <w:tc>
+          <w:tcPr>
+            <w:tcW w:type="dxa" w:w="1656"/>
+            <w:shd w:val="clear" w:color="auto" w:fill="006655"/>
+          </w:tcPr>
+          <w:p>
+            <w:r>
+              <w:rPr>
+                <w:b/>
+                <w:color w:val="FFFFFF"/>
+              </w:rPr>
+              <w:t>Tipo Dato</w:t>
+            </w:r>
+          </w:p>
+        </w:tc>
+        <w:tc>
+          <w:tcPr>
+            <w:tcW w:type="dxa" w:w="1656"/>
+            <w:shd w:val="clear" w:color="auto" w:fill="006655"/>
+          </w:tcPr>
+          <w:p>
+            <w:r>
+              <w:rPr>
+                <w:b/>
+                <w:color w:val="FFFFFF"/>
+              </w:rPr>
+              <w:t>PK/FK</w:t>
+            </w:r>
+          </w:p>
+        </w:tc>
+        <w:tc>
+          <w:tcPr>
+            <w:tcW w:type="dxa" w:w="1656"/>
+            <w:shd w:val="clear" w:color="auto" w:fill="006655"/>
+          </w:tcPr>
+          <w:p>
+            <w:r>
+              <w:rPr>
+                <w:b/>
+                <w:color w:val="FFFFFF"/>
+              </w:rPr>
+              <w:t>Nulo</w:t>
+            </w:r>
+          </w:p>
+        </w:tc>
+        <w:tc>
+          <w:tcPr>
+            <w:tcW w:type="dxa" w:w="1656"/>
+            <w:shd w:val="clear" w:color="auto" w:fill="006655"/>
+          </w:tcPr>
+          <w:p>
+            <w:r>
+              <w:rPr>
+                <w:b/>
+                <w:color w:val="FFFFFF"/>
+              </w:rPr>
+              <w:t>Restricción</w:t>
+            </w:r>
+          </w:p>
+        </w:tc>
+        <w:tc>
+          <w:tcPr>
+            <w:tcW w:type="dxa" w:w="1656"/>
+            <w:shd w:val="clear" w:color="auto" w:fill="006655"/>
+          </w:tcPr>
+          <w:p>
+            <w:r>
+              <w:rPr>
+                <w:b/>
+                <w:color w:val="FFFFFF"/>
+              </w:rPr>
+              <w:t>Descripción</w:t>
+            </w:r>
+          </w:p>
+        </w:tc>
+      </w:tr>
+      <w:tr>
+        <w:tc>
+          <w:tcPr>
+            <w:tcW w:type="dxa" w:w="1656"/>
+          </w:tcPr>
+          <w:p>
+            <w:r>
+              <w:t>id</w:t>
+            </w:r>
+          </w:p>
+        </w:tc>
+        <w:tc>
+          <w:tcPr>
+            <w:tcW w:type="dxa" w:w="1656"/>
+          </w:tcPr>
+          <w:p>
+            <w:r>
+              <w:t>UUID</w:t>
+            </w:r>
+          </w:p>
+        </w:tc>
+        <w:tc>
+          <w:tcPr>
+            <w:tcW w:type="dxa" w:w="1656"/>
+          </w:tcPr>
+          <w:p>
+            <w:r>
+              <w:t>PK</w:t>
+            </w:r>
+          </w:p>
+        </w:tc>
+        <w:tc>
+          <w:tcPr>
+            <w:tcW w:type="dxa" w:w="1656"/>
+          </w:tcPr>
+          <w:p>
+            <w:r>
+              <w:t>NO</w:t>
+            </w:r>
+          </w:p>
+        </w:tc>
+        <w:tc>
+          <w:tcPr>
+            <w:tcW w:type="dxa" w:w="1656"/>
+          </w:tcPr>
+          <w:p>
+            <w:r>
+              <w:t>gen_random_uuid()</w:t>
+            </w:r>
+          </w:p>
+        </w:tc>
+        <w:tc>
+          <w:tcPr>
+            <w:tcW w:type="dxa" w:w="1656"/>
+          </w:tcPr>
+          <w:p>
+            <w:r>
+              <w:t>Identificador único de la propiedad</w:t>
+            </w:r>
+          </w:p>
+        </w:tc>
+      </w:tr>
+      <w:tr>
+        <w:tc>
+          <w:tcPr>
+            <w:tcW w:type="dxa" w:w="1656"/>
+            <w:shd w:val="clear" w:color="auto" w:fill="F2F7F6"/>
+          </w:tcPr>
+          <w:p>
+            <w:r>
+              <w:t>slug</w:t>
+            </w:r>
+          </w:p>
+        </w:tc>
+        <w:tc>
+          <w:tcPr>
+            <w:tcW w:type="dxa" w:w="1656"/>
+            <w:shd w:val="clear" w:color="auto" w:fill="F2F7F6"/>
+          </w:tcPr>
+          <w:p>
+            <w:r>
+              <w:t>VARCHAR(200)</w:t>
+            </w:r>
+          </w:p>
+        </w:tc>
+        <w:tc>
+          <w:tcPr>
+            <w:tcW w:type="dxa" w:w="1656"/>
+            <w:shd w:val="clear" w:color="auto" w:fill="F2F7F6"/>
+          </w:tcPr>
+          <w:p>
+            <w:r>
+              <w:t>UQ</w:t>
+            </w:r>
+          </w:p>
+        </w:tc>
+        <w:tc>
+          <w:tcPr>
+            <w:tcW w:type="dxa" w:w="1656"/>
+            <w:shd w:val="clear" w:color="auto" w:fill="F2F7F6"/>
+          </w:tcPr>
+          <w:p>
+            <w:r>
+              <w:t>NO</w:t>
+            </w:r>
+          </w:p>
+        </w:tc>
+        <w:tc>
+          <w:tcPr>
+            <w:tcW w:type="dxa" w:w="1656"/>
+            <w:shd w:val="clear" w:color="auto" w:fill="F2F7F6"/>
+          </w:tcPr>
+          <w:p>
+            <w:r>
+              <w:t>UNIQUE</w:t>
+            </w:r>
+          </w:p>
+        </w:tc>
+        <w:tc>
+          <w:tcPr>
+            <w:tcW w:type="dxa" w:w="1656"/>
+            <w:shd w:val="clear" w:color="auto" w:fill="F2F7F6"/>
+          </w:tcPr>
+          <w:p>
+            <w:r>
+              <w:t>URL amigable de acceso rápido</w:t>
+            </w:r>
+          </w:p>
+        </w:tc>
+      </w:tr>
+      <w:tr>
+        <w:tc>
+          <w:tcPr>
+            <w:tcW w:type="dxa" w:w="1656"/>
+          </w:tcPr>
+          <w:p>
+            <w:r>
+              <w:t>title</w:t>
+            </w:r>
+          </w:p>
+        </w:tc>
+        <w:tc>
+          <w:tcPr>
+            <w:tcW w:type="dxa" w:w="1656"/>
+          </w:tcPr>
+          <w:p>
+            <w:r>
+              <w:t>VARCHAR(200)</w:t>
+            </w:r>
+          </w:p>
+        </w:tc>
+        <w:tc>
+          <w:tcPr>
+            <w:tcW w:type="dxa" w:w="1656"/>
+          </w:tcPr>
+          <w:p>
+            <w:r>
+              <w:t>-</w:t>
+            </w:r>
+          </w:p>
+        </w:tc>
+        <w:tc>
+          <w:tcPr>
+            <w:tcW w:type="dxa" w:w="1656"/>
+          </w:tcPr>
+          <w:p>
+            <w:r>
+              <w:t>NO</w:t>
+            </w:r>
+          </w:p>
+        </w:tc>
+        <w:tc>
+          <w:tcPr>
+            <w:tcW w:type="dxa" w:w="1656"/>
+          </w:tcPr>
+          <w:p>
+            <w:r>
+              <w:t>NOT NULL</w:t>
+            </w:r>
+          </w:p>
+        </w:tc>
+        <w:tc>
+          <w:tcPr>
+            <w:tcW w:type="dxa" w:w="1656"/>
+          </w:tcPr>
+          <w:p>
+            <w:r>
+              <w:t>Título o nombre de la residencia</w:t>
+            </w:r>
+          </w:p>
+        </w:tc>
+      </w:tr>
+      <w:tr>
+        <w:tc>
+          <w:tcPr>
+            <w:tcW w:type="dxa" w:w="1656"/>
+            <w:shd w:val="clear" w:color="auto" w:fill="F2F7F6"/>
+          </w:tcPr>
+          <w:p>
+            <w:r>
+              <w:t>price</w:t>
+            </w:r>
+          </w:p>
+        </w:tc>
+        <w:tc>
+          <w:tcPr>
+            <w:tcW w:type="dxa" w:w="1656"/>
+            <w:shd w:val="clear" w:color="auto" w:fill="F2F7F6"/>
+          </w:tcPr>
+          <w:p>
+            <w:r>
+              <w:t>NUMERIC(15,2)</w:t>
+            </w:r>
+          </w:p>
+        </w:tc>
+        <w:tc>
+          <w:tcPr>
+            <w:tcW w:type="dxa" w:w="1656"/>
+            <w:shd w:val="clear" w:color="auto" w:fill="F2F7F6"/>
+          </w:tcPr>
+          <w:p>
+            <w:r>
+              <w:t>-</w:t>
+            </w:r>
+          </w:p>
+        </w:tc>
+        <w:tc>
+          <w:tcPr>
+            <w:tcW w:type="dxa" w:w="1656"/>
+            <w:shd w:val="clear" w:color="auto" w:fill="F2F7F6"/>
+          </w:tcPr>
+          <w:p>
+            <w:r>
+              <w:t>NO</w:t>
+            </w:r>
+          </w:p>
+        </w:tc>
+        <w:tc>
+          <w:tcPr>
+            <w:tcW w:type="dxa" w:w="1656"/>
+            <w:shd w:val="clear" w:color="auto" w:fill="F2F7F6"/>
+          </w:tcPr>
+          <w:p>
+            <w:r>
+              <w:t>CHECK(price &gt;= 0)</w:t>
+            </w:r>
+          </w:p>
+        </w:tc>
+        <w:tc>
+          <w:tcPr>
+            <w:tcW w:type="dxa" w:w="1656"/>
+            <w:shd w:val="clear" w:color="auto" w:fill="F2F7F6"/>
+          </w:tcPr>
+          <w:p>
+            <w:r>
+              <w:t>Precio de lista en dólares (USD)</w:t>
+            </w:r>
+          </w:p>
+        </w:tc>
+      </w:tr>
+      <w:tr>
+        <w:tc>
+          <w:tcPr>
+            <w:tcW w:type="dxa" w:w="1656"/>
+          </w:tcPr>
+          <w:p>
+            <w:r>
+              <w:t>owner_id</w:t>
+            </w:r>
+          </w:p>
+        </w:tc>
+        <w:tc>
+          <w:tcPr>
+            <w:tcW w:type="dxa" w:w="1656"/>
+          </w:tcPr>
+          <w:p>
+            <w:r>
+              <w:t>UUID</w:t>
+            </w:r>
+          </w:p>
+        </w:tc>
+        <w:tc>
+          <w:tcPr>
+            <w:tcW w:type="dxa" w:w="1656"/>
+          </w:tcPr>
+          <w:p>
+            <w:r>
+              <w:t>FK</w:t>
+            </w:r>
+          </w:p>
+        </w:tc>
+        <w:tc>
+          <w:tcPr>
+            <w:tcW w:type="dxa" w:w="1656"/>
+          </w:tcPr>
+          <w:p>
+            <w:r>
+              <w:t>SI</w:t>
+            </w:r>
+          </w:p>
+        </w:tc>
+        <w:tc>
+          <w:tcPr>
+            <w:tcW w:type="dxa" w:w="1656"/>
+          </w:tcPr>
+          <w:p>
+            <w:r>
+              <w:t>REFERENCES profiles(id)</w:t>
+            </w:r>
+          </w:p>
+        </w:tc>
+        <w:tc>
+          <w:tcPr>
+            <w:tcW w:type="dxa" w:w="1656"/>
+          </w:tcPr>
+          <w:p>
+            <w:r>
+              <w:t>Identificador del propietario/agente</w:t>
+            </w:r>
+          </w:p>
+        </w:tc>
+      </w:tr>
+    </w:tbl>
     <w:p>
       <w:pPr>
-        <w:spacing w:before="200" w:after="60"/>
+        <w:spacing w:before="240" w:after="80"/>
       </w:pPr>
       <w:r>
         <w:rPr>
@@ -259,23 +705,545 @@
           <w:color w:val="19322F"/>
           <w:sz w:val="24"/>
         </w:rPr>
-        <w:t>7. Creación de las Bases de Datos y Scripts (.sql y Backup)</w:t>
+        <w:t>7. Creación de las Bases de Datos en SGBD Relacional y NoSQL (10 pts.)</w:t>
       </w:r>
     </w:p>
     <w:p>
       <w:pPr>
-        <w:spacing w:after="100"/>
+        <w:spacing w:after="120" w:line="276" w:lineRule="auto"/>
       </w:pPr>
       <w:r>
         <w:rPr>
           <w:sz w:val="21"/>
         </w:rPr>
-        <w:t>Se adjunta en la carpeta de entregables el script completo DDL + DML con 50 registros por tabla (schema_and_data_postgresql.sql) y la copia de seguridad/dataset masivo con 10,000 registros (mongodb_nosql_dataset.json).</w:t>
+        <w:t>• SGBD Relacional (PostgreSQL / Supabase): Esquema compilado y ejecutado exitosamente con soporte para extensiones uuid-ossp.</w:t>
+        <w:br/>
+        <w:t>• Gestor NoSQL (MongoDB Atlas): Colección 'properties_nosql' creada con validación de JSON Schema ($jsonSchema) e índices optimizados: Unique Slug, Status-Price Compuesto, Text Search y Geoespacial 2DSphere.</w:t>
       </w:r>
     </w:p>
     <w:p>
       <w:pPr>
-        <w:spacing w:before="280" w:after="80"/>
+        <w:spacing w:before="240" w:after="80"/>
+      </w:pPr>
+      <w:r>
+        <w:rPr>
+          <w:b/>
+          <w:color w:val="19322F"/>
+          <w:sz w:val="24"/>
+        </w:rPr>
+        <w:t>8. Inserción de Registros (15 pts.)</w:t>
+      </w:r>
+    </w:p>
+    <w:p>
+      <w:pPr>
+        <w:spacing w:after="120" w:line="276" w:lineRule="auto"/>
+      </w:pPr>
+      <w:r>
+        <w:rPr>
+          <w:sz w:val="21"/>
+        </w:rPr>
+        <w:t>• Base de Datos Relacional: 50 registros reales, estructurados y coherentes insertados en cada una de las 4 tablas (profiles, properties, user_favorites, appointments), sumando 200 tuplas transaccionales.</w:t>
+        <w:br/>
+        <w:t>• Base de Datos No Relacional: 10,000 documentos BSON reales cargados por lotes en MongoDB Atlas en la colección properties_nosql.</w:t>
+      </w:r>
+    </w:p>
+    <w:p>
+      <w:pPr>
+        <w:spacing w:before="240" w:after="80"/>
+      </w:pPr>
+      <w:r>
+        <w:rPr>
+          <w:b/>
+          <w:color w:val="19322F"/>
+          <w:sz w:val="24"/>
+        </w:rPr>
+        <w:t>9. Script Completo y Copia de Seguridad Backup (.sql / .json) (4 pts.)</w:t>
+      </w:r>
+    </w:p>
+    <w:p>
+      <w:pPr>
+        <w:spacing w:after="120" w:line="276" w:lineRule="auto"/>
+      </w:pPr>
+      <w:r>
+        <w:rPr>
+          <w:sz w:val="21"/>
+        </w:rPr>
+        <w:t>Se entregan adjuntos en el paquete de evidencias los archivos de respaldo ejecutable:</w:t>
+        <w:br/>
+        <w:t>• schema_and_data_postgresql.sql: Script SQL completo con DDL y 200 tuplas DML.</w:t>
+        <w:br/>
+        <w:t>• mongodb_nosql_dataset.json: Dataset oficial con los 10,000 registros NoSQL.</w:t>
+      </w:r>
+    </w:p>
+    <w:p>
+      <w:pPr>
+        <w:spacing w:before="240" w:after="80"/>
+      </w:pPr>
+      <w:r>
+        <w:rPr>
+          <w:b/>
+          <w:color w:val="19322F"/>
+          <w:sz w:val="24"/>
+        </w:rPr>
+        <w:t>10. Proyecto Web Desarrollado con Conexión a Base de Datos (20 pts.)</w:t>
+      </w:r>
+    </w:p>
+    <w:p>
+      <w:pPr>
+        <w:spacing w:after="120" w:line="276" w:lineRule="auto"/>
+      </w:pPr>
+      <w:r>
+        <w:rPr>
+          <w:sz w:val="21"/>
+        </w:rPr>
+        <w:t>Plataforma Web Luxu Real Estate desarrollada en Next.js 16 y React 19 con conexión nativa a PostgreSQL (Supabase) y MongoDB. Permite las operaciones completas de Agregar (Create), Modificar (Update), Eliminar (Delete) y Buscar (Read/Filters) con sincronización inmediata y persistencia garantizada.</w:t>
+      </w:r>
+    </w:p>
+    <w:p>
+      <w:pPr>
+        <w:spacing w:before="240" w:after="80"/>
+      </w:pPr>
+      <w:r>
+        <w:rPr>
+          <w:b/>
+          <w:color w:val="19322F"/>
+          <w:sz w:val="24"/>
+        </w:rPr>
+        <w:t>11. Identificación de Objetos en la Base de Datos (10 pts.)</w:t>
+      </w:r>
+    </w:p>
+    <w:p>
+      <w:pPr>
+        <w:spacing w:after="120" w:line="276" w:lineRule="auto"/>
+      </w:pPr>
+      <w:r>
+        <w:rPr>
+          <w:sz w:val="21"/>
+        </w:rPr>
+        <w:t>Resumen de objetos de base de datos creados, su ubicación y tablas afectadas:</w:t>
+      </w:r>
+    </w:p>
+    <w:tbl>
+      <w:tblPr>
+        <w:tblW w:type="auto" w:w="0"/>
+        <w:jc w:val="center"/>
+        <w:tblLook w:firstColumn="1" w:firstRow="1" w:lastColumn="0" w:lastRow="0" w:noHBand="0" w:noVBand="1" w:val="04A0"/>
+      </w:tblPr>
+      <w:tblGrid>
+        <w:gridCol w:w="1987"/>
+        <w:gridCol w:w="1987"/>
+        <w:gridCol w:w="1987"/>
+        <w:gridCol w:w="1987"/>
+        <w:gridCol w:w="1987"/>
+      </w:tblGrid>
+      <w:tr>
+        <w:tc>
+          <w:tcPr>
+            <w:tcW w:type="dxa" w:w="1987"/>
+            <w:shd w:val="clear" w:color="auto" w:fill="006655"/>
+          </w:tcPr>
+          <w:p>
+            <w:r>
+              <w:rPr>
+                <w:b/>
+                <w:color w:val="FFFFFF"/>
+              </w:rPr>
+              <w:t>Objeto</w:t>
+            </w:r>
+          </w:p>
+        </w:tc>
+        <w:tc>
+          <w:tcPr>
+            <w:tcW w:type="dxa" w:w="1987"/>
+            <w:shd w:val="clear" w:color="auto" w:fill="006655"/>
+          </w:tcPr>
+          <w:p>
+            <w:r>
+              <w:rPr>
+                <w:b/>
+                <w:color w:val="FFFFFF"/>
+              </w:rPr>
+              <w:t>Nombre BD</w:t>
+            </w:r>
+          </w:p>
+        </w:tc>
+        <w:tc>
+          <w:tcPr>
+            <w:tcW w:type="dxa" w:w="1987"/>
+            <w:shd w:val="clear" w:color="auto" w:fill="006655"/>
+          </w:tcPr>
+          <w:p>
+            <w:r>
+              <w:rPr>
+                <w:b/>
+                <w:color w:val="FFFFFF"/>
+              </w:rPr>
+              <w:t>Tipo</w:t>
+            </w:r>
+          </w:p>
+        </w:tc>
+        <w:tc>
+          <w:tcPr>
+            <w:tcW w:type="dxa" w:w="1987"/>
+            <w:shd w:val="clear" w:color="auto" w:fill="006655"/>
+          </w:tcPr>
+          <w:p>
+            <w:r>
+              <w:rPr>
+                <w:b/>
+                <w:color w:val="FFFFFF"/>
+              </w:rPr>
+              <w:t>Función</w:t>
+            </w:r>
+          </w:p>
+        </w:tc>
+        <w:tc>
+          <w:tcPr>
+            <w:tcW w:type="dxa" w:w="1987"/>
+            <w:shd w:val="clear" w:color="auto" w:fill="006655"/>
+          </w:tcPr>
+          <w:p>
+            <w:r>
+              <w:rPr>
+                <w:b/>
+                <w:color w:val="FFFFFF"/>
+              </w:rPr>
+              <w:t>Ubicación en Motor</w:t>
+            </w:r>
+          </w:p>
+        </w:tc>
+      </w:tr>
+      <w:tr>
+        <w:tc>
+          <w:tcPr>
+            <w:tcW w:type="dxa" w:w="1987"/>
+          </w:tcPr>
+          <w:p>
+            <w:r>
+              <w:t>Tabla Base</w:t>
+            </w:r>
+          </w:p>
+        </w:tc>
+        <w:tc>
+          <w:tcPr>
+            <w:tcW w:type="dxa" w:w="1987"/>
+          </w:tcPr>
+          <w:p>
+            <w:r>
+              <w:t>properties</w:t>
+            </w:r>
+          </w:p>
+        </w:tc>
+        <w:tc>
+          <w:tcPr>
+            <w:tcW w:type="dxa" w:w="1987"/>
+          </w:tcPr>
+          <w:p>
+            <w:r>
+              <w:t>Table</w:t>
+            </w:r>
+          </w:p>
+        </w:tc>
+        <w:tc>
+          <w:tcPr>
+            <w:tcW w:type="dxa" w:w="1987"/>
+          </w:tcPr>
+          <w:p>
+            <w:r>
+              <w:t>Catálogo principal de inmuebles</w:t>
+            </w:r>
+          </w:p>
+        </w:tc>
+        <w:tc>
+          <w:tcPr>
+            <w:tcW w:type="dxa" w:w="1987"/>
+          </w:tcPr>
+          <w:p>
+            <w:r>
+              <w:t>Schema public</w:t>
+            </w:r>
+          </w:p>
+        </w:tc>
+      </w:tr>
+      <w:tr>
+        <w:tc>
+          <w:tcPr>
+            <w:tcW w:type="dxa" w:w="1987"/>
+            <w:shd w:val="clear" w:color="auto" w:fill="F2F7F6"/>
+          </w:tcPr>
+          <w:p>
+            <w:r>
+              <w:t>Vista</w:t>
+            </w:r>
+          </w:p>
+        </w:tc>
+        <w:tc>
+          <w:tcPr>
+            <w:tcW w:type="dxa" w:w="1987"/>
+            <w:shd w:val="clear" w:color="auto" w:fill="F2F7F6"/>
+          </w:tcPr>
+          <w:p>
+            <w:r>
+              <w:t>vw_active_properties</w:t>
+            </w:r>
+          </w:p>
+        </w:tc>
+        <w:tc>
+          <w:tcPr>
+            <w:tcW w:type="dxa" w:w="1987"/>
+            <w:shd w:val="clear" w:color="auto" w:fill="F2F7F6"/>
+          </w:tcPr>
+          <w:p>
+            <w:r>
+              <w:t>View</w:t>
+            </w:r>
+          </w:p>
+        </w:tc>
+        <w:tc>
+          <w:tcPr>
+            <w:tcW w:type="dxa" w:w="1987"/>
+            <w:shd w:val="clear" w:color="auto" w:fill="F2F7F6"/>
+          </w:tcPr>
+          <w:p>
+            <w:r>
+              <w:t>Filtrado rápido de propiedades activas</w:t>
+            </w:r>
+          </w:p>
+        </w:tc>
+        <w:tc>
+          <w:tcPr>
+            <w:tcW w:type="dxa" w:w="1987"/>
+            <w:shd w:val="clear" w:color="auto" w:fill="F2F7F6"/>
+          </w:tcPr>
+          <w:p>
+            <w:r>
+              <w:t>pg_views</w:t>
+            </w:r>
+          </w:p>
+        </w:tc>
+      </w:tr>
+      <w:tr>
+        <w:tc>
+          <w:tcPr>
+            <w:tcW w:type="dxa" w:w="1987"/>
+          </w:tcPr>
+          <w:p>
+            <w:r>
+              <w:t>Disparador</w:t>
+            </w:r>
+          </w:p>
+        </w:tc>
+        <w:tc>
+          <w:tcPr>
+            <w:tcW w:type="dxa" w:w="1987"/>
+          </w:tcPr>
+          <w:p>
+            <w:r>
+              <w:t>trg_update_timestamp</w:t>
+            </w:r>
+          </w:p>
+        </w:tc>
+        <w:tc>
+          <w:tcPr>
+            <w:tcW w:type="dxa" w:w="1987"/>
+          </w:tcPr>
+          <w:p>
+            <w:r>
+              <w:t>Trigger</w:t>
+            </w:r>
+          </w:p>
+        </w:tc>
+        <w:tc>
+          <w:tcPr>
+            <w:tcW w:type="dxa" w:w="1987"/>
+          </w:tcPr>
+          <w:p>
+            <w:r>
+              <w:t>Actualiza timestamp de modificación</w:t>
+            </w:r>
+          </w:p>
+        </w:tc>
+        <w:tc>
+          <w:tcPr>
+            <w:tcW w:type="dxa" w:w="1987"/>
+          </w:tcPr>
+          <w:p>
+            <w:r>
+              <w:t>pg_trigger</w:t>
+            </w:r>
+          </w:p>
+        </w:tc>
+      </w:tr>
+      <w:tr>
+        <w:tc>
+          <w:tcPr>
+            <w:tcW w:type="dxa" w:w="1987"/>
+            <w:shd w:val="clear" w:color="auto" w:fill="F2F7F6"/>
+          </w:tcPr>
+          <w:p>
+            <w:r>
+              <w:t>Función</w:t>
+            </w:r>
+          </w:p>
+        </w:tc>
+        <w:tc>
+          <w:tcPr>
+            <w:tcW w:type="dxa" w:w="1987"/>
+            <w:shd w:val="clear" w:color="auto" w:fill="F2F7F6"/>
+          </w:tcPr>
+          <w:p>
+            <w:r>
+              <w:t>fn_calculate_kpis()</w:t>
+            </w:r>
+          </w:p>
+        </w:tc>
+        <w:tc>
+          <w:tcPr>
+            <w:tcW w:type="dxa" w:w="1987"/>
+            <w:shd w:val="clear" w:color="auto" w:fill="F2F7F6"/>
+          </w:tcPr>
+          <w:p>
+            <w:r>
+              <w:t>Function</w:t>
+            </w:r>
+          </w:p>
+        </w:tc>
+        <w:tc>
+          <w:tcPr>
+            <w:tcW w:type="dxa" w:w="1987"/>
+            <w:shd w:val="clear" w:color="auto" w:fill="F2F7F6"/>
+          </w:tcPr>
+          <w:p>
+            <w:r>
+              <w:t>Cálculo de métricas en tiempo real</w:t>
+            </w:r>
+          </w:p>
+        </w:tc>
+        <w:tc>
+          <w:tcPr>
+            <w:tcW w:type="dxa" w:w="1987"/>
+            <w:shd w:val="clear" w:color="auto" w:fill="F2F7F6"/>
+          </w:tcPr>
+          <w:p>
+            <w:r>
+              <w:t>pg_proc</w:t>
+            </w:r>
+          </w:p>
+        </w:tc>
+      </w:tr>
+      <w:tr>
+        <w:tc>
+          <w:tcPr>
+            <w:tcW w:type="dxa" w:w="1987"/>
+          </w:tcPr>
+          <w:p>
+            <w:r>
+              <w:t>Procedimiento</w:t>
+            </w:r>
+          </w:p>
+        </w:tc>
+        <w:tc>
+          <w:tcPr>
+            <w:tcW w:type="dxa" w:w="1987"/>
+          </w:tcPr>
+          <w:p>
+            <w:r>
+              <w:t>sp_schedule_visit()</w:t>
+            </w:r>
+          </w:p>
+        </w:tc>
+        <w:tc>
+          <w:tcPr>
+            <w:tcW w:type="dxa" w:w="1987"/>
+          </w:tcPr>
+          <w:p>
+            <w:r>
+              <w:t>Stored Proc</w:t>
+            </w:r>
+          </w:p>
+        </w:tc>
+        <w:tc>
+          <w:tcPr>
+            <w:tcW w:type="dxa" w:w="1987"/>
+          </w:tcPr>
+          <w:p>
+            <w:r>
+              <w:t>Reserva transaccional de visita guiada</w:t>
+            </w:r>
+          </w:p>
+        </w:tc>
+        <w:tc>
+          <w:tcPr>
+            <w:tcW w:type="dxa" w:w="1987"/>
+          </w:tcPr>
+          <w:p>
+            <w:r>
+              <w:t>pg_proc</w:t>
+            </w:r>
+          </w:p>
+        </w:tc>
+      </w:tr>
+      <w:tr>
+        <w:tc>
+          <w:tcPr>
+            <w:tcW w:type="dxa" w:w="1987"/>
+            <w:shd w:val="clear" w:color="auto" w:fill="F2F7F6"/>
+          </w:tcPr>
+          <w:p>
+            <w:r>
+              <w:t>Índice Geo</w:t>
+            </w:r>
+          </w:p>
+        </w:tc>
+        <w:tc>
+          <w:tcPr>
+            <w:tcW w:type="dxa" w:w="1987"/>
+            <w:shd w:val="clear" w:color="auto" w:fill="F2F7F6"/>
+          </w:tcPr>
+          <w:p>
+            <w:r>
+              <w:t>idx_spatial_coords</w:t>
+            </w:r>
+          </w:p>
+        </w:tc>
+        <w:tc>
+          <w:tcPr>
+            <w:tcW w:type="dxa" w:w="1987"/>
+            <w:shd w:val="clear" w:color="auto" w:fill="F2F7F6"/>
+          </w:tcPr>
+          <w:p>
+            <w:r>
+              <w:t>2DSphere</w:t>
+            </w:r>
+          </w:p>
+        </w:tc>
+        <w:tc>
+          <w:tcPr>
+            <w:tcW w:type="dxa" w:w="1987"/>
+            <w:shd w:val="clear" w:color="auto" w:fill="F2F7F6"/>
+          </w:tcPr>
+          <w:p>
+            <w:r>
+              <w:t>Búsqueda geoespacial por radio</w:t>
+            </w:r>
+          </w:p>
+        </w:tc>
+        <w:tc>
+          <w:tcPr>
+            <w:tcW w:type="dxa" w:w="1987"/>
+            <w:shd w:val="clear" w:color="auto" w:fill="F2F7F6"/>
+          </w:tcPr>
+          <w:p>
+            <w:r>
+              <w:t>system.indexes</w:t>
+            </w:r>
+          </w:p>
+        </w:tc>
+      </w:tr>
+    </w:tbl>
+    <w:p>
+      <w:pPr>
+        <w:spacing w:before="320" w:after="120"/>
       </w:pPr>
       <w:r>
         <w:rPr>
@@ -283,12 +1251,23 @@
           <w:color w:val="006655"/>
           <w:sz w:val="28"/>
         </w:rPr>
-        <w:t>EVIDENCIAS DE FUNCIONALIDAD DEL SISTEMA Y BASES DE DATOS</w:t>
+        <w:t>FUNCIONALIDAD DE LA APLICACIÓN Y EVIDENCIAS FOTOGRÁFICAS (10 PUNTOS)</w:t>
       </w:r>
     </w:p>
     <w:p>
       <w:pPr>
-        <w:spacing w:before="200" w:after="60"/>
+        <w:spacing w:after="120" w:line="276" w:lineRule="auto"/>
+      </w:pPr>
+      <w:r>
+        <w:rPr>
+          <w:sz w:val="21"/>
+        </w:rPr>
+        <w:t>A continuación se presentan las 10 capturas de pantalla de evidencias tomadas con sesión activa de Administrador:</w:t>
+      </w:r>
+    </w:p>
+    <w:p>
+      <w:pPr>
+        <w:spacing w:before="240" w:after="80"/>
       </w:pPr>
       <w:r>
         <w:rPr>
@@ -341,7 +1320,7 @@
     </w:p>
     <w:p>
       <w:pPr>
-        <w:spacing w:before="200" w:after="60"/>
+        <w:spacing w:before="240" w:after="80"/>
       </w:pPr>
       <w:r>
         <w:rPr>
@@ -349,7 +1328,7 @@
           <w:color w:val="006655"/>
           <w:sz w:val="22"/>
         </w:rPr>
-        <w:t>Figura 2. Formulario Agregar Inmueble (/admin/properties/add) - Operación Create</w:t>
+        <w:t>Figura 2. Módulo Vender / Agregar Propiedad (/admin/properties/add) - Operación Create</w:t>
       </w:r>
     </w:p>
     <w:p>
@@ -394,7 +1373,7 @@
     </w:p>
     <w:p>
       <w:pPr>
-        <w:spacing w:before="200" w:after="60"/>
+        <w:spacing w:before="240" w:after="80"/>
       </w:pPr>
       <w:r>
         <w:rPr>
@@ -447,7 +1426,7 @@
     </w:p>
     <w:p>
       <w:pPr>
-        <w:spacing w:before="200" w:after="60"/>
+        <w:spacing w:before="240" w:after="80"/>
       </w:pPr>
       <w:r>
         <w:rPr>
@@ -500,7 +1479,7 @@
     </w:p>
     <w:p>
       <w:pPr>
-        <w:spacing w:before="200" w:after="60"/>
+        <w:spacing w:before="240" w:after="80"/>
       </w:pPr>
       <w:r>
         <w:rPr>
@@ -553,7 +1532,7 @@
     </w:p>
     <w:p>
       <w:pPr>
-        <w:spacing w:before="200" w:after="60"/>
+        <w:spacing w:before="240" w:after="80"/>
       </w:pPr>
       <w:r>
         <w:rPr>
@@ -606,7 +1585,7 @@
     </w:p>
     <w:p>
       <w:pPr>
-        <w:spacing w:before="200" w:after="60"/>
+        <w:spacing w:before="240" w:after="80"/>
       </w:pPr>
       <w:r>
         <w:rPr>
@@ -659,7 +1638,7 @@
     </w:p>
     <w:p>
       <w:pPr>
-        <w:spacing w:before="200" w:after="60"/>
+        <w:spacing w:before="240" w:after="80"/>
       </w:pPr>
       <w:r>
         <w:rPr>
@@ -712,7 +1691,7 @@
     </w:p>
     <w:p>
       <w:pPr>
-        <w:spacing w:before="200" w:after="60"/>
+        <w:spacing w:before="240" w:after="80"/>
       </w:pPr>
       <w:r>
         <w:rPr>
@@ -765,7 +1744,7 @@
     </w:p>
     <w:p>
       <w:pPr>
-        <w:spacing w:before="200" w:after="60"/>
+        <w:spacing w:before="240" w:after="80"/>
       </w:pPr>
       <w:r>
         <w:rPr>
@@ -818,7 +1797,7 @@
     </w:p>
     <w:p>
       <w:pPr>
-        <w:spacing w:before="280" w:after="80"/>
+        <w:spacing w:before="320" w:after="120"/>
       </w:pPr>
       <w:r>
         <w:rPr>
@@ -826,12 +1805,12 @@
           <w:color w:val="006655"/>
           <w:sz w:val="28"/>
         </w:rPr>
-        <w:t>REFERENCIAS (FORMATO APA 7ma Edición)</w:t>
+        <w:t>REFERENCIAS (FORMATO APA 7ma Edición) (2 PUNTOS)</w:t>
       </w:r>
     </w:p>
     <w:p>
       <w:pPr>
-        <w:spacing w:after="100"/>
+        <w:spacing w:after="120" w:line="276" w:lineRule="auto"/>
       </w:pPr>
       <w:r>
         <w:rPr>
@@ -842,7 +1821,7 @@
     </w:p>
     <w:p>
       <w:pPr>
-        <w:spacing w:after="100"/>
+        <w:spacing w:after="120" w:line="276" w:lineRule="auto"/>
       </w:pPr>
       <w:r>
         <w:rPr>
@@ -853,7 +1832,7 @@
     </w:p>
     <w:p>
       <w:pPr>
-        <w:spacing w:after="100"/>
+        <w:spacing w:after="120" w:line="276" w:lineRule="auto"/>
       </w:pPr>
       <w:r>
         <w:rPr>
@@ -864,7 +1843,7 @@
     </w:p>
     <w:p>
       <w:pPr>
-        <w:spacing w:after="100"/>
+        <w:spacing w:after="120" w:line="276" w:lineRule="auto"/>
       </w:pPr>
       <w:r>
         <w:rPr>
@@ -875,7 +1854,7 @@
     </w:p>
     <w:p>
       <w:pPr>
-        <w:spacing w:after="100"/>
+        <w:spacing w:after="120" w:line="276" w:lineRule="auto"/>
       </w:pPr>
       <w:r>
         <w:rPr>
@@ -1257,6 +2236,11 @@
     <w:name w:val="Normal"/>
     <w:qFormat/>
     <w:rsid w:val="00FC693F"/>
+    <w:rPr>
+      <w:rFonts w:ascii="Calibri" w:hAnsi="Calibri"/>
+      <w:color w:val="19322F"/>
+      <w:sz w:val="22"/>
+    </w:rPr>
   </w:style>
   <w:style w:type="paragraph" w:styleId="Header">
     <w:name w:val="header"/>

</xml_diff>